<commit_message>
feat(images): turn the plan's image prompt into a still
The chain used to stop at text: the content plan produced an image prompt and
nothing ever drew it. A new ImagePort closes that gap with two adapters.

`drawn` is the default and needs nothing: it lays the prompt's headline onto the
same paper-and-sunset art the video uses, and the panel says plainly that this
is a designed backdrop rather than a product photograph.

`openai` speaks /images/generations and accepts either a b64_json or a url
response, because relays disagree. Bytes are always copied into local media —
a signed link that expires in an hour would break the page mid-demo.

Health now reports the image provider alongside the other two.

Co-Authored-By: Claude Opus 5 <noreply@anthropic.com>
</commit_message>
<xml_diff>
--- a/docs/AGENT_TECH_SPEC.docx
+++ b/docs/AGENT_TECH_SPEC.docx
@@ -25,38 +25,130 @@
         <w:rPr>
           <w:rFonts w:ascii="Microsoft YaHei" w:hAnsi="Microsoft YaHei" w:eastAsia="微软雅黑"/>
           <w:b w:val="0"/>
-          <w:color w:val="6B7268"/>
-          <w:sz w:val="19"/>
-        </w:rPr>
-        <w:br/>
-        <w:t>版本 2026-10-26　　仓库 github.com/MrNature001/liuliangchuhai</w:t>
-      </w:r>
-      <w:r>
-        <w:br/>
+          <w:color w:val="222222"/>
+          <w:sz w:val="21"/>
+        </w:rPr>
+        <w:t>本文件说明「流量出海」演示系统中三个 AI 能力的实现方式：</w:t>
+      </w:r>
+      <w:r>
+        <w:rPr>
+          <w:rFonts w:ascii="Microsoft YaHei" w:hAnsi="Microsoft YaHei" w:eastAsia="微软雅黑"/>
+          <w:b/>
+          <w:color w:val="222222"/>
+          <w:sz w:val="21"/>
+        </w:rPr>
+        <w:t>市场适配分析</w:t>
       </w:r>
       <w:r>
         <w:rPr>
           <w:rFonts w:ascii="Microsoft YaHei" w:hAnsi="Microsoft YaHei" w:eastAsia="微软雅黑"/>
           <w:b w:val="0"/>
-          <w:color w:val="6B7268"/>
-          <w:sz w:val="19"/>
-        </w:rPr>
-        <w:br/>
-        <w:t>本文件说明系统中三个 AI 能力的实现方式：市场适配分析、内容方案生成、数字人口播视频。</w:t>
-      </w:r>
-      <w:r>
-        <w:br/>
+          <w:color w:val="222222"/>
+          <w:sz w:val="21"/>
+        </w:rPr>
+        <w:t>、</w:t>
+      </w:r>
+      <w:r>
+        <w:rPr>
+          <w:rFonts w:ascii="Microsoft YaHei" w:hAnsi="Microsoft YaHei" w:eastAsia="微软雅黑"/>
+          <w:b/>
+          <w:color w:val="222222"/>
+          <w:sz w:val="21"/>
+        </w:rPr>
+        <w:t>内容方案生成</w:t>
       </w:r>
       <w:r>
         <w:rPr>
           <w:rFonts w:ascii="Microsoft YaHei" w:hAnsi="Microsoft YaHei" w:eastAsia="微软雅黑"/>
           <w:b w:val="0"/>
-          <w:color w:val="6B7268"/>
+          <w:color w:val="222222"/>
+          <w:sz w:val="21"/>
+        </w:rPr>
+        <w:t xml:space="preserve">、 </w:t>
+      </w:r>
+      <w:r>
+        <w:rPr>
+          <w:rFonts w:ascii="Microsoft YaHei" w:hAnsi="Microsoft YaHei" w:eastAsia="微软雅黑"/>
+          <w:b/>
+          <w:color w:val="222222"/>
+          <w:sz w:val="21"/>
+        </w:rPr>
+        <w:t>数字人口播视频</w:t>
+      </w:r>
+      <w:r>
+        <w:rPr>
+          <w:rFonts w:ascii="Microsoft YaHei" w:hAnsi="Microsoft YaHei" w:eastAsia="微软雅黑"/>
+          <w:b w:val="0"/>
+          <w:color w:val="222222"/>
+          <w:sz w:val="21"/>
+        </w:rPr>
+        <w:t>。读者是技术评审与参赛评委；不需要事先读过源码。</w:t>
+      </w:r>
+    </w:p>
+    <w:p>
+      <w:pPr>
+        <w:pStyle w:val="ListBullet"/>
+        <w:spacing w:after="40"/>
+        <w:ind w:left="482"/>
+      </w:pPr>
+      <w:r>
+        <w:rPr>
+          <w:rFonts w:ascii="Microsoft YaHei" w:hAnsi="Microsoft YaHei" w:eastAsia="微软雅黑"/>
+          <w:b w:val="0"/>
+          <w:color w:val="222222"/>
+          <w:sz w:val="21"/>
+        </w:rPr>
+        <w:t>版本：2026-10-26</w:t>
+      </w:r>
+    </w:p>
+    <w:p>
+      <w:pPr>
+        <w:pStyle w:val="ListBullet"/>
+        <w:spacing w:after="40"/>
+        <w:ind w:left="482"/>
+      </w:pPr>
+      <w:r>
+        <w:rPr>
+          <w:rFonts w:ascii="Microsoft YaHei" w:hAnsi="Microsoft YaHei" w:eastAsia="微软雅黑"/>
+          <w:b w:val="0"/>
+          <w:color w:val="222222"/>
+          <w:sz w:val="21"/>
+        </w:rPr>
+        <w:t>仓库：&lt;https://github.com/MrNature001/liuliangchuhai&gt;</w:t>
+      </w:r>
+    </w:p>
+    <w:p>
+      <w:pPr>
+        <w:pStyle w:val="ListBullet"/>
+        <w:spacing w:after="40"/>
+        <w:ind w:left="482"/>
+      </w:pPr>
+      <w:r>
+        <w:rPr>
+          <w:rFonts w:ascii="Microsoft YaHei" w:hAnsi="Microsoft YaHei" w:eastAsia="微软雅黑"/>
+          <w:b w:val="0"/>
+          <w:color w:val="222222"/>
+          <w:sz w:val="21"/>
+        </w:rPr>
+        <w:t xml:space="preserve">演示：本地 </w:t>
+      </w:r>
+      <w:r>
+        <w:rPr>
+          <w:rFonts w:ascii="Consolas" w:hAnsi="Consolas" w:eastAsia="微软雅黑"/>
+          <w:b w:val="0"/>
+          <w:color w:val="2D5C4A"/>
           <w:sz w:val="19"/>
         </w:rPr>
-        <w:br/>
-        <w:t>读者为技术评审与参赛评委，不需要事先读过源码。</w:t>
-        <w:br/>
+        <w:t>make dev</w:t>
+      </w:r>
+      <w:r>
+        <w:rPr>
+          <w:rFonts w:ascii="Microsoft YaHei" w:hAnsi="Microsoft YaHei" w:eastAsia="微软雅黑"/>
+          <w:b w:val="0"/>
+          <w:color w:val="222222"/>
+          <w:sz w:val="21"/>
+        </w:rPr>
+        <w:t>，前端 &lt;http://localhost:3000&gt;，后端 &lt;http://localhost:8000/docs&gt;</w:t>
       </w:r>
     </w:p>
     <w:p>
@@ -67,14 +159,10 @@
         <w:rPr>
           <w:rFonts w:ascii="Microsoft YaHei" w:hAnsi="Microsoft YaHei" w:eastAsia="微软雅黑"/>
           <w:b w:val="0"/>
-          <w:color w:val="2D5C4A"/>
-          <w:sz w:val="22"/>
-        </w:rPr>
-        <w:br/>
-        <w:t>本文件不描述"我们用了大模型所以很智能"。它描述三件事：模型收到什么、模型吐出的东西如何被验证、</w:t>
-        <w:br/>
-        <w:t>以及失败时系统怎么表现。这三件事才是判断一个 AI 系统是否可交付的依据。</w:t>
-        <w:br/>
+          <w:color w:val="222222"/>
+          <w:sz w:val="21"/>
+        </w:rPr>
+        <w:t>---</w:t>
       </w:r>
     </w:p>
     <w:p>
@@ -118,7 +206,7 @@
           <w:color w:val="222222"/>
           <w:sz w:val="21"/>
         </w:rPr>
-        <w:t>输入一件广西特色商品和一个目标东盟国家，系统输出三样东西：</w:t>
+        <w:t>输入一件广西特色商品和一个目标东盟国家，系统输出：</w:t>
       </w:r>
     </w:p>
     <w:p>
@@ -142,7 +230,7 @@
           <w:color w:val="222222"/>
           <w:sz w:val="21"/>
         </w:rPr>
-        <w:t>一份可解读的市场适配判断——推荐等级、启发式评分、人群、优势、风险、文化优势、营销建议、内容方向；</w:t>
+        <w:t>一份可解读的市场适配判断（推荐等级、启发式评分、人群、优势、风险、文化优势、营销建议、内容方向）；</w:t>
       </w:r>
     </w:p>
     <w:p>
@@ -166,7 +254,7 @@
           <w:color w:val="222222"/>
           <w:sz w:val="21"/>
         </w:rPr>
-        <w:t>一份可直接投产的内容方案——卖点、图片提示词、短视频创意与脚本、直播话术、社媒文案；</w:t>
+        <w:t>一份可直接投产的内容方案（卖点、图片提示词、短视频创意与脚本、直播话术、社媒文案）；</w:t>
       </w:r>
     </w:p>
     <w:p>
@@ -190,7 +278,7 @@
           <w:color w:val="222222"/>
           <w:sz w:val="21"/>
         </w:rPr>
-        <w:t>一段 1080×1920 竖屏口播视频——配音、字幕、三镜头、虚拟主播。</w:t>
+        <w:t>一段 1080×1920 竖屏口播视频（配音、字幕、三镜头、虚拟主播）。</w:t>
       </w:r>
     </w:p>
     <w:p>
@@ -204,11 +292,7 @@
           <w:color w:val="222222"/>
           <w:sz w:val="21"/>
         </w:rPr>
-        <w:br/>
-        <w:t>三个能力串成一条链，但彼此解耦：第二部分复用第一部分的结果，第三部分复用第二部分的话术；</w:t>
-        <w:br/>
-        <w:t>任何一环失败都不会污染上游。</w:t>
-        <w:br/>
+        <w:t>三个能力串成一条链，但彼此解耦：第二部分复用第一部分的结果，第三部分复用第二部分的话术； 任何一环失败都不会污染上游。</w:t>
       </w:r>
     </w:p>
     <w:p>
@@ -394,7 +478,25 @@
                 <w:color w:val="222222"/>
                 <w:sz w:val="19"/>
               </w:rPr>
-              <w:t>DeepSeek（deepseek-v4-flash），兼容 OpenAI Chat Completions 协议</w:t>
+              <w:t>DeepSeek（</w:t>
+            </w:r>
+            <w:r>
+              <w:rPr>
+                <w:rFonts w:ascii="Consolas" w:hAnsi="Consolas" w:eastAsia="微软雅黑"/>
+                <w:b w:val="0"/>
+                <w:color w:val="2D5C4A"/>
+                <w:sz w:val="17"/>
+              </w:rPr>
+              <w:t>deepseek-v4-flash</w:t>
+            </w:r>
+            <w:r>
+              <w:rPr>
+                <w:rFonts w:ascii="Microsoft YaHei" w:hAnsi="Microsoft YaHei" w:eastAsia="微软雅黑"/>
+                <w:b w:val="0"/>
+                <w:color w:val="222222"/>
+                <w:sz w:val="19"/>
+              </w:rPr>
+              <w:t>），兼容 OpenAI Chat Completions 协议</w:t>
             </w:r>
           </w:p>
         </w:tc>
@@ -434,7 +536,7 @@
                 <w:color w:val="222222"/>
                 <w:sz w:val="19"/>
               </w:rPr>
-              <w:t>Edge TTS 神经语音（无需密钥，中国大陆可达）</w:t>
+              <w:t>Edge TTS 神经语音（微软朗读服务，无需密钥，中国大陆可达）</w:t>
             </w:r>
           </w:p>
         </w:tc>
@@ -474,7 +576,25 @@
                 <w:color w:val="222222"/>
                 <w:sz w:val="19"/>
               </w:rPr>
-              <w:t>ffmpeg（imageio-ffmpeg 自带二进制）+ Pillow 11</w:t>
+              <w:t>ffmpeg（</w:t>
+            </w:r>
+            <w:r>
+              <w:rPr>
+                <w:rFonts w:ascii="Consolas" w:hAnsi="Consolas" w:eastAsia="微软雅黑"/>
+                <w:b w:val="0"/>
+                <w:color w:val="2D5C4A"/>
+                <w:sz w:val="17"/>
+              </w:rPr>
+              <w:t>imageio-ffmpeg</w:t>
+            </w:r>
+            <w:r>
+              <w:rPr>
+                <w:rFonts w:ascii="Microsoft YaHei" w:hAnsi="Microsoft YaHei" w:eastAsia="微软雅黑"/>
+                <w:b w:val="0"/>
+                <w:color w:val="222222"/>
+                <w:sz w:val="19"/>
+              </w:rPr>
+              <w:t xml:space="preserve"> 自带二进制）+ Pillow 11</w:t>
             </w:r>
           </w:p>
         </w:tc>
@@ -514,7 +634,25 @@
                 <w:color w:val="222222"/>
                 <w:sz w:val="19"/>
               </w:rPr>
-              <w:t>文件系统（apps/api/media），FastAPI StaticFiles 托管</w:t>
+              <w:t>文件系统（</w:t>
+            </w:r>
+            <w:r>
+              <w:rPr>
+                <w:rFonts w:ascii="Consolas" w:hAnsi="Consolas" w:eastAsia="微软雅黑"/>
+                <w:b w:val="0"/>
+                <w:color w:val="2D5C4A"/>
+                <w:sz w:val="17"/>
+              </w:rPr>
+              <w:t>apps/api/media</w:t>
+            </w:r>
+            <w:r>
+              <w:rPr>
+                <w:rFonts w:ascii="Microsoft YaHei" w:hAnsi="Microsoft YaHei" w:eastAsia="微软雅黑"/>
+                <w:b w:val="0"/>
+                <w:color w:val="222222"/>
+                <w:sz w:val="19"/>
+              </w:rPr>
+              <w:t>），FastAPI StaticFiles 托管</w:t>
             </w:r>
           </w:p>
         </w:tc>
@@ -584,7 +722,6 @@
           <w:color w:val="222222"/>
           <w:sz w:val="21"/>
         </w:rPr>
-        <w:br/>
         <w:t xml:space="preserve">依赖方向由 </w:t>
       </w:r>
       <w:r>
@@ -621,18 +758,16 @@
           <w:color w:val="222222"/>
           <w:sz w:val="21"/>
         </w:rPr>
-        <w:t xml:space="preserve"> 在 CI 中强制检查，</w:t>
-        <w:br/>
-        <w:t xml:space="preserve">违反即构建失败。具体实现的选择只发生在 </w:t>
-      </w:r>
-      <w:r>
-        <w:rPr>
-          <w:rFonts w:ascii="Consolas" w:hAnsi="Consolas" w:eastAsia="微软雅黑"/>
-          <w:b w:val="0"/>
-          <w:color w:val="2D5C4A"/>
-          <w:sz w:val="19"/>
-        </w:rPr>
-        <w:t>bootstrap/container.py</w:t>
+        <w:t xml:space="preserve"> 在 CI 中强制检查，违反即构建失败。 </w:t>
+      </w:r>
+      <w:r>
+        <w:rPr>
+          <w:rFonts w:ascii="Microsoft YaHei" w:hAnsi="Microsoft YaHei" w:eastAsia="微软雅黑"/>
+          <w:b/>
+          <w:color w:val="222222"/>
+          <w:sz w:val="21"/>
+        </w:rPr>
+        <w:t>具体实现的选择只发生在 bootstrap/container.py</w:t>
       </w:r>
       <w:r>
         <w:rPr>
@@ -642,7 +777,6 @@
           <w:sz w:val="21"/>
         </w:rPr>
         <w:t>：换模型厂商、换渲染器都不触碰业务代码。</w:t>
-        <w:br/>
       </w:r>
     </w:p>
     <w:p>
@@ -783,12 +917,30 @@
             </w:pPr>
             <w:r>
               <w:rPr>
+                <w:rFonts w:ascii="Consolas" w:hAnsi="Consolas" w:eastAsia="微软雅黑"/>
+                <w:b w:val="0"/>
+                <w:color w:val="2D5C4A"/>
+                <w:sz w:val="17"/>
+              </w:rPr>
+              <w:t>deepseek</w:t>
+            </w:r>
+            <w:r>
+              <w:rPr>
                 <w:rFonts w:ascii="Microsoft YaHei" w:hAnsi="Microsoft YaHei" w:eastAsia="微软雅黑"/>
                 <w:b w:val="0"/>
                 <w:color w:val="222222"/>
                 <w:sz w:val="19"/>
               </w:rPr>
-              <w:t>deepseek、mock</w:t>
+              <w:t>、</w:t>
+            </w:r>
+            <w:r>
+              <w:rPr>
+                <w:rFonts w:ascii="Consolas" w:hAnsi="Consolas" w:eastAsia="微软雅黑"/>
+                <w:b w:val="0"/>
+                <w:color w:val="2D5C4A"/>
+                <w:sz w:val="17"/>
+              </w:rPr>
+              <w:t>mock</w:t>
             </w:r>
           </w:p>
         </w:tc>
@@ -842,12 +994,30 @@
             </w:pPr>
             <w:r>
               <w:rPr>
+                <w:rFonts w:ascii="Consolas" w:hAnsi="Consolas" w:eastAsia="微软雅黑"/>
+                <w:b w:val="0"/>
+                <w:color w:val="2D5C4A"/>
+                <w:sz w:val="17"/>
+              </w:rPr>
+              <w:t>deepseek</w:t>
+            </w:r>
+            <w:r>
+              <w:rPr>
                 <w:rFonts w:ascii="Microsoft YaHei" w:hAnsi="Microsoft YaHei" w:eastAsia="微软雅黑"/>
                 <w:b w:val="0"/>
                 <w:color w:val="222222"/>
                 <w:sz w:val="19"/>
               </w:rPr>
-              <w:t>deepseek、mock</w:t>
+              <w:t>、</w:t>
+            </w:r>
+            <w:r>
+              <w:rPr>
+                <w:rFonts w:ascii="Consolas" w:hAnsi="Consolas" w:eastAsia="微软雅黑"/>
+                <w:b w:val="0"/>
+                <w:color w:val="2D5C4A"/>
+                <w:sz w:val="17"/>
+              </w:rPr>
+              <w:t>mock</w:t>
             </w:r>
           </w:p>
         </w:tc>
@@ -901,12 +1071,66 @@
             </w:pPr>
             <w:r>
               <w:rPr>
+                <w:rFonts w:ascii="Consolas" w:hAnsi="Consolas" w:eastAsia="微软雅黑"/>
+                <w:b w:val="0"/>
+                <w:color w:val="2D5C4A"/>
+                <w:sz w:val="17"/>
+              </w:rPr>
+              <w:t>local</w:t>
+            </w:r>
+            <w:r>
+              <w:rPr>
                 <w:rFonts w:ascii="Microsoft YaHei" w:hAnsi="Microsoft YaHei" w:eastAsia="微软雅黑"/>
                 <w:b w:val="0"/>
                 <w:color w:val="222222"/>
                 <w:sz w:val="19"/>
               </w:rPr>
-              <w:t>local、dashscope、heygen、mock</w:t>
+              <w:t>、</w:t>
+            </w:r>
+            <w:r>
+              <w:rPr>
+                <w:rFonts w:ascii="Consolas" w:hAnsi="Consolas" w:eastAsia="微软雅黑"/>
+                <w:b w:val="0"/>
+                <w:color w:val="2D5C4A"/>
+                <w:sz w:val="17"/>
+              </w:rPr>
+              <w:t>dashscope</w:t>
+            </w:r>
+            <w:r>
+              <w:rPr>
+                <w:rFonts w:ascii="Microsoft YaHei" w:hAnsi="Microsoft YaHei" w:eastAsia="微软雅黑"/>
+                <w:b w:val="0"/>
+                <w:color w:val="222222"/>
+                <w:sz w:val="19"/>
+              </w:rPr>
+              <w:t>、</w:t>
+            </w:r>
+            <w:r>
+              <w:rPr>
+                <w:rFonts w:ascii="Consolas" w:hAnsi="Consolas" w:eastAsia="微软雅黑"/>
+                <w:b w:val="0"/>
+                <w:color w:val="2D5C4A"/>
+                <w:sz w:val="17"/>
+              </w:rPr>
+              <w:t>heygen</w:t>
+            </w:r>
+            <w:r>
+              <w:rPr>
+                <w:rFonts w:ascii="Microsoft YaHei" w:hAnsi="Microsoft YaHei" w:eastAsia="微软雅黑"/>
+                <w:b w:val="0"/>
+                <w:color w:val="222222"/>
+                <w:sz w:val="19"/>
+              </w:rPr>
+              <w:t>、</w:t>
+            </w:r>
+            <w:r>
+              <w:rPr>
+                <w:rFonts w:ascii="Consolas" w:hAnsi="Consolas" w:eastAsia="微软雅黑"/>
+                <w:b w:val="0"/>
+                <w:color w:val="2D5C4A"/>
+                <w:sz w:val="17"/>
+              </w:rPr>
+              <w:t>mock</w:t>
             </w:r>
           </w:p>
         </w:tc>
@@ -960,12 +1184,30 @@
             </w:pPr>
             <w:r>
               <w:rPr>
+                <w:rFonts w:ascii="Consolas" w:hAnsi="Consolas" w:eastAsia="微软雅黑"/>
+                <w:b w:val="0"/>
+                <w:color w:val="2D5C4A"/>
+                <w:sz w:val="17"/>
+              </w:rPr>
+              <w:t>deepseek</w:t>
+            </w:r>
+            <w:r>
+              <w:rPr>
                 <w:rFonts w:ascii="Microsoft YaHei" w:hAnsi="Microsoft YaHei" w:eastAsia="微软雅黑"/>
                 <w:b w:val="0"/>
                 <w:color w:val="222222"/>
                 <w:sz w:val="19"/>
               </w:rPr>
-              <w:t>deepseek、mock</w:t>
+              <w:t>、</w:t>
+            </w:r>
+            <w:r>
+              <w:rPr>
+                <w:rFonts w:ascii="Consolas" w:hAnsi="Consolas" w:eastAsia="微软雅黑"/>
+                <w:b w:val="0"/>
+                <w:color w:val="2D5C4A"/>
+                <w:sz w:val="17"/>
+              </w:rPr>
+              <w:t>mock</w:t>
             </w:r>
           </w:p>
         </w:tc>
@@ -1019,12 +1261,39 @@
             </w:pPr>
             <w:r>
               <w:rPr>
+                <w:rFonts w:ascii="Consolas" w:hAnsi="Consolas" w:eastAsia="微软雅黑"/>
+                <w:b w:val="0"/>
+                <w:color w:val="2D5C4A"/>
+                <w:sz w:val="17"/>
+              </w:rPr>
+              <w:t>json</w:t>
+            </w:r>
+            <w:r>
+              <w:rPr>
                 <w:rFonts w:ascii="Microsoft YaHei" w:hAnsi="Microsoft YaHei" w:eastAsia="微软雅黑"/>
                 <w:b w:val="0"/>
                 <w:color w:val="222222"/>
                 <w:sz w:val="19"/>
               </w:rPr>
-              <w:t>json（可选 openfoodfacts 补图）</w:t>
+              <w:t xml:space="preserve">（+ 可选 </w:t>
+            </w:r>
+            <w:r>
+              <w:rPr>
+                <w:rFonts w:ascii="Consolas" w:hAnsi="Consolas" w:eastAsia="微软雅黑"/>
+                <w:b w:val="0"/>
+                <w:color w:val="2D5C4A"/>
+                <w:sz w:val="17"/>
+              </w:rPr>
+              <w:t>openfoodfacts</w:t>
+            </w:r>
+            <w:r>
+              <w:rPr>
+                <w:rFonts w:ascii="Microsoft YaHei" w:hAnsi="Microsoft YaHei" w:eastAsia="微软雅黑"/>
+                <w:b w:val="0"/>
+                <w:color w:val="222222"/>
+                <w:sz w:val="19"/>
+              </w:rPr>
+              <w:t xml:space="preserve"> 补图）</w:t>
             </w:r>
           </w:p>
         </w:tc>
@@ -1037,6 +1306,38 @@
     </w:p>
     <w:p>
       <w:pPr>
+        <w:spacing w:after="120"/>
+      </w:pPr>
+      <w:r>
+        <w:rPr>
+          <w:rFonts w:ascii="Microsoft YaHei" w:hAnsi="Microsoft YaHei" w:eastAsia="微软雅黑"/>
+          <w:b w:val="0"/>
+          <w:color w:val="222222"/>
+          <w:sz w:val="21"/>
+        </w:rPr>
+        <w:t>每个端口至少有一个</w:t>
+      </w:r>
+      <w:r>
+        <w:rPr>
+          <w:rFonts w:ascii="Microsoft YaHei" w:hAnsi="Microsoft YaHei" w:eastAsia="微软雅黑"/>
+          <w:b/>
+          <w:color w:val="222222"/>
+          <w:sz w:val="21"/>
+        </w:rPr>
+        <w:t>确定性假实现</w:t>
+      </w:r>
+      <w:r>
+        <w:rPr>
+          <w:rFonts w:ascii="Microsoft YaHei" w:hAnsi="Microsoft YaHei" w:eastAsia="微软雅黑"/>
+          <w:b w:val="0"/>
+          <w:color w:val="222222"/>
+          <w:sz w:val="21"/>
+        </w:rPr>
+        <w:t>。这是硬性工程约定：无密钥、无网络、无 GPU 时， 整套演示与全部测试仍然可跑。评审在现场断网也能启动。</w:t>
+      </w:r>
+    </w:p>
+    <w:p>
+      <w:pPr>
         <w:pStyle w:val="Heading2"/>
         <w:spacing w:before="240" w:after="80"/>
       </w:pPr>
@@ -1079,6 +1380,20 @@
     </w:p>
     <w:p>
       <w:pPr>
+        <w:spacing w:after="120"/>
+      </w:pPr>
+      <w:r>
+        <w:rPr>
+          <w:rFonts w:ascii="Microsoft YaHei" w:hAnsi="Microsoft YaHei" w:eastAsia="微软雅黑"/>
+          <w:b w:val="0"/>
+          <w:color w:val="222222"/>
+          <w:sz w:val="21"/>
+        </w:rPr>
+        <w:t>---</w:t>
+      </w:r>
+    </w:p>
+    <w:p>
+      <w:pPr>
         <w:pStyle w:val="Heading1"/>
         <w:spacing w:before="360" w:after="120"/>
       </w:pPr>
@@ -1118,7 +1433,7 @@
           <w:color w:val="222222"/>
           <w:sz w:val="21"/>
         </w:rPr>
-        <w:t>输入：</w:t>
+        <w:t>输入</w:t>
       </w:r>
       <w:r>
         <w:rPr>
@@ -1127,7 +1442,7 @@
           <w:color w:val="222222"/>
           <w:sz w:val="21"/>
         </w:rPr>
-        <w:t>商品 id、目标国家（必填）、目标人群与市场备注（可选）。</w:t>
+        <w:t>：商品 id、目标国家（必填）、目标人群与市场备注（可选）。</w:t>
       </w:r>
     </w:p>
     <w:p>
@@ -1141,7 +1456,16 @@
           <w:color w:val="222222"/>
           <w:sz w:val="21"/>
         </w:rPr>
-        <w:t>输出：</w:t>
+        <w:t>输出</w:t>
+      </w:r>
+      <w:r>
+        <w:rPr>
+          <w:rFonts w:ascii="Microsoft YaHei" w:hAnsi="Microsoft YaHei" w:eastAsia="微软雅黑"/>
+          <w:b w:val="0"/>
+          <w:color w:val="222222"/>
+          <w:sz w:val="21"/>
+        </w:rPr>
+        <w:t>（</w:t>
       </w:r>
       <w:r>
         <w:rPr>
@@ -1159,7 +1483,7 @@
           <w:color w:val="222222"/>
           <w:sz w:val="21"/>
         </w:rPr>
-        <w:t>，九个字段，全部必填。</w:t>
+        <w:t>，九个字段，全部必填）：</w:t>
       </w:r>
     </w:p>
     <w:tbl>
@@ -1285,12 +1609,66 @@
             </w:pPr>
             <w:r>
               <w:rPr>
+                <w:rFonts w:ascii="Consolas" w:hAnsi="Consolas" w:eastAsia="微软雅黑"/>
+                <w:b w:val="0"/>
+                <w:color w:val="2D5C4A"/>
+                <w:sz w:val="17"/>
+              </w:rPr>
+              <w:t>strong_fit</w:t>
+            </w:r>
+            <w:r>
+              <w:rPr>
                 <w:rFonts w:ascii="Microsoft YaHei" w:hAnsi="Microsoft YaHei" w:eastAsia="微软雅黑"/>
                 <w:b w:val="0"/>
                 <w:color w:val="222222"/>
                 <w:sz w:val="19"/>
               </w:rPr>
-              <w:t>strong_fit / fit / caution / not_recommended</w:t>
+              <w:t xml:space="preserve"> / </w:t>
+            </w:r>
+            <w:r>
+              <w:rPr>
+                <w:rFonts w:ascii="Consolas" w:hAnsi="Consolas" w:eastAsia="微软雅黑"/>
+                <w:b w:val="0"/>
+                <w:color w:val="2D5C4A"/>
+                <w:sz w:val="17"/>
+              </w:rPr>
+              <w:t>fit</w:t>
+            </w:r>
+            <w:r>
+              <w:rPr>
+                <w:rFonts w:ascii="Microsoft YaHei" w:hAnsi="Microsoft YaHei" w:eastAsia="微软雅黑"/>
+                <w:b w:val="0"/>
+                <w:color w:val="222222"/>
+                <w:sz w:val="19"/>
+              </w:rPr>
+              <w:t xml:space="preserve"> / </w:t>
+            </w:r>
+            <w:r>
+              <w:rPr>
+                <w:rFonts w:ascii="Consolas" w:hAnsi="Consolas" w:eastAsia="微软雅黑"/>
+                <w:b w:val="0"/>
+                <w:color w:val="2D5C4A"/>
+                <w:sz w:val="17"/>
+              </w:rPr>
+              <w:t>caution</w:t>
+            </w:r>
+            <w:r>
+              <w:rPr>
+                <w:rFonts w:ascii="Microsoft YaHei" w:hAnsi="Microsoft YaHei" w:eastAsia="微软雅黑"/>
+                <w:b w:val="0"/>
+                <w:color w:val="222222"/>
+                <w:sz w:val="19"/>
+              </w:rPr>
+              <w:t xml:space="preserve"> / </w:t>
+            </w:r>
+            <w:r>
+              <w:rPr>
+                <w:rFonts w:ascii="Consolas" w:hAnsi="Consolas" w:eastAsia="微软雅黑"/>
+                <w:b w:val="0"/>
+                <w:color w:val="2D5C4A"/>
+                <w:sz w:val="17"/>
+              </w:rPr>
+              <w:t>not_recommended</w:t>
             </w:r>
           </w:p>
         </w:tc>
@@ -1349,7 +1727,16 @@
                 <w:color w:val="222222"/>
                 <w:sz w:val="19"/>
               </w:rPr>
-              <w:t>0–100，启发式打分，不是概率也不是销量预测</w:t>
+              <w:t>0–100，</w:t>
+            </w:r>
+            <w:r>
+              <w:rPr>
+                <w:rFonts w:ascii="Microsoft YaHei" w:hAnsi="Microsoft YaHei" w:eastAsia="微软雅黑"/>
+                <w:b/>
+                <w:color w:val="222222"/>
+                <w:sz w:val="19"/>
+              </w:rPr>
+              <w:t>启发式打分，不是概率也不是销量预测</w:t>
             </w:r>
           </w:p>
         </w:tc>
@@ -1865,7 +2252,21 @@
           <w:color w:val="222222"/>
           <w:sz w:val="21"/>
         </w:rPr>
-        <w:t>——"score 是 0 到 100 的启发式，不是预测、概率或销量预估"，防止模型输出看似精确的商业承诺；</w:t>
+        <w:t>——"score 是 0 到 100 的启发式，不是预测、概率或销量预估"，</w:t>
+      </w:r>
+    </w:p>
+    <w:p>
+      <w:pPr>
+        <w:spacing w:after="120"/>
+      </w:pPr>
+      <w:r>
+        <w:rPr>
+          <w:rFonts w:ascii="Microsoft YaHei" w:hAnsi="Microsoft YaHei" w:eastAsia="微软雅黑"/>
+          <w:b w:val="0"/>
+          <w:color w:val="222222"/>
+          <w:sz w:val="21"/>
+        </w:rPr>
+        <w:t>防止模型输出看似精确的商业承诺；</w:t>
       </w:r>
     </w:p>
     <w:p>
@@ -1880,7 +2281,7 @@
           <w:color w:val="222222"/>
           <w:sz w:val="21"/>
         </w:rPr>
-        <w:t xml:space="preserve">3.  </w:t>
+        <w:t xml:space="preserve">1.  </w:t>
       </w:r>
       <w:r>
         <w:rPr>
@@ -1912,7 +2313,6 @@
           <w:color w:val="222222"/>
           <w:sz w:val="21"/>
         </w:rPr>
-        <w:br/>
         <w:t xml:space="preserve">用户消息不是自然语言段落，而是 </w:t>
       </w:r>
       <w:r>
@@ -1931,9 +2331,7 @@
           <w:color w:val="222222"/>
           <w:sz w:val="21"/>
         </w:rPr>
-        <w:t xml:space="preserve"> 的 JSON 序列化，</w:t>
-        <w:br/>
-        <w:t xml:space="preserve">字段来自领域对象 </w:t>
+        <w:t xml:space="preserve"> 的 JSON 序列化， 字段来自领域对象 </w:t>
       </w:r>
       <w:r>
         <w:rPr>
@@ -1951,10 +2349,7 @@
           <w:color w:val="222222"/>
           <w:sz w:val="21"/>
         </w:rPr>
-        <w:t>。这样商品事实只有一个来源，</w:t>
-        <w:br/>
-        <w:t>不会因为措辞差异导致同一商品两次分析不一致。</w:t>
-        <w:br/>
+        <w:t>。这样商品事实只有一个来源， 不会因为措辞差异导致同一商品两次分析不一致。</w:t>
       </w:r>
     </w:p>
     <w:p>
@@ -2072,7 +2467,25 @@
           <w:color w:val="222222"/>
           <w:sz w:val="21"/>
         </w:rPr>
-        <w:t xml:space="preserve">模型返回的 JSON 只是待验证的输入。解析器 </w:t>
+        <w:t>模型返回的 JSON 只是</w:t>
+      </w:r>
+      <w:r>
+        <w:rPr>
+          <w:rFonts w:ascii="Microsoft YaHei" w:hAnsi="Microsoft YaHei" w:eastAsia="微软雅黑"/>
+          <w:b/>
+          <w:color w:val="222222"/>
+          <w:sz w:val="21"/>
+        </w:rPr>
+        <w:t>待验证的输入</w:t>
+      </w:r>
+      <w:r>
+        <w:rPr>
+          <w:rFonts w:ascii="Microsoft YaHei" w:hAnsi="Microsoft YaHei" w:eastAsia="微软雅黑"/>
+          <w:b w:val="0"/>
+          <w:color w:val="222222"/>
+          <w:sz w:val="21"/>
+        </w:rPr>
+        <w:t xml:space="preserve">。解析器 </w:t>
       </w:r>
       <w:r>
         <w:rPr>
@@ -2090,7 +2503,7 @@
           <w:color w:val="222222"/>
           <w:sz w:val="21"/>
         </w:rPr>
-        <w:t xml:space="preserve"> 依次检查五层：</w:t>
+        <w:t xml:space="preserve"> 依次检查：</w:t>
       </w:r>
     </w:p>
     <w:p>
@@ -2159,7 +2572,7 @@
           <w:color w:val="222222"/>
           <w:sz w:val="21"/>
         </w:rPr>
-        <w:t>，否则判定输出被截断；</w:t>
+        <w:t>；不是则判定输出被截断；</w:t>
       </w:r>
     </w:p>
     <w:p>
@@ -2262,249 +2675,6 @@
           <w:sz w:val="21"/>
         </w:rPr>
         <w:t xml:space="preserve"> 挂两个钩子——</w:t>
-      </w:r>
-      <w:r>
-        <w:rPr>
-          <w:rFonts w:ascii="Consolas" w:hAnsi="Consolas" w:eastAsia="微软雅黑"/>
-          <w:b w:val="0"/>
-          <w:color w:val="2D5C4A"/>
-          <w:sz w:val="19"/>
-        </w:rPr>
-        <w:t>parse_constant</w:t>
-      </w:r>
-      <w:r>
-        <w:rPr>
-          <w:rFonts w:ascii="Microsoft YaHei" w:hAnsi="Microsoft YaHei" w:eastAsia="微软雅黑"/>
-          <w:b w:val="0"/>
-          <w:color w:val="222222"/>
-          <w:sz w:val="21"/>
-        </w:rPr>
-        <w:t xml:space="preserve"> 拒绝 NaN / Infinity（Python 默认接受，会污染后续数值计算）；</w:t>
-      </w:r>
-      <w:r>
-        <w:rPr>
-          <w:rFonts w:ascii="Consolas" w:hAnsi="Consolas" w:eastAsia="微软雅黑"/>
-          <w:b w:val="0"/>
-          <w:color w:val="2D5C4A"/>
-          <w:sz w:val="19"/>
-        </w:rPr>
-        <w:t>object_pairs_hook</w:t>
-      </w:r>
-      <w:r>
-        <w:rPr>
-          <w:rFonts w:ascii="Microsoft YaHei" w:hAnsi="Microsoft YaHei" w:eastAsia="微软雅黑"/>
-          <w:b w:val="0"/>
-          <w:color w:val="222222"/>
-          <w:sz w:val="21"/>
-        </w:rPr>
-        <w:t xml:space="preserve"> 拒绝重复键（重复键会让"看起来有值"的字段实际被后者覆盖）；</w:t>
-      </w:r>
-    </w:p>
-    <w:p>
-      <w:pPr>
-        <w:spacing w:after="40"/>
-        <w:ind w:hanging="312" w:left="482"/>
-      </w:pPr>
-      <w:r>
-        <w:rPr>
-          <w:rFonts w:ascii="Microsoft YaHei" w:hAnsi="Microsoft YaHei" w:eastAsia="微软雅黑"/>
-          <w:b w:val="0"/>
-          <w:color w:val="222222"/>
-          <w:sz w:val="21"/>
-        </w:rPr>
-        <w:t xml:space="preserve">4.  </w:t>
-      </w:r>
-      <w:r>
-        <w:rPr>
-          <w:rFonts w:ascii="Microsoft YaHei" w:hAnsi="Microsoft YaHei" w:eastAsia="微软雅黑"/>
-          <w:b/>
-          <w:color w:val="222222"/>
-          <w:sz w:val="21"/>
-        </w:rPr>
-        <w:t>字段集合完全相等</w:t>
-      </w:r>
-      <w:r>
-        <w:rPr>
-          <w:rFonts w:ascii="Microsoft YaHei" w:hAnsi="Microsoft YaHei" w:eastAsia="微软雅黑"/>
-          <w:b w:val="0"/>
-          <w:color w:val="222222"/>
-          <w:sz w:val="21"/>
-        </w:rPr>
-        <w:t>：多一个字段、少一个字段都不接受，防止模型自行发明字段后被静默丢弃；</w:t>
-      </w:r>
-    </w:p>
-    <w:p>
-      <w:pPr>
-        <w:spacing w:after="40"/>
-        <w:ind w:hanging="312" w:left="482"/>
-      </w:pPr>
-      <w:r>
-        <w:rPr>
-          <w:rFonts w:ascii="Microsoft YaHei" w:hAnsi="Microsoft YaHei" w:eastAsia="微软雅黑"/>
-          <w:b w:val="0"/>
-          <w:color w:val="222222"/>
-          <w:sz w:val="21"/>
-        </w:rPr>
-        <w:t xml:space="preserve">5.  </w:t>
-      </w:r>
-      <w:r>
-        <w:rPr>
-          <w:rFonts w:ascii="Microsoft YaHei" w:hAnsi="Microsoft YaHei" w:eastAsia="微软雅黑"/>
-          <w:b/>
-          <w:color w:val="222222"/>
-          <w:sz w:val="21"/>
-        </w:rPr>
-        <w:t>类型逐步校验</w:t>
-      </w:r>
-      <w:r>
-        <w:rPr>
-          <w:rFonts w:ascii="Microsoft YaHei" w:hAnsi="Microsoft YaHei" w:eastAsia="微软雅黑"/>
-          <w:b w:val="0"/>
-          <w:color w:val="222222"/>
-          <w:sz w:val="21"/>
-        </w:rPr>
-        <w:t>：</w:t>
-      </w:r>
-      <w:r>
-        <w:rPr>
-          <w:rFonts w:ascii="Consolas" w:hAnsi="Consolas" w:eastAsia="微软雅黑"/>
-          <w:b w:val="0"/>
-          <w:color w:val="2D5C4A"/>
-          <w:sz w:val="19"/>
-        </w:rPr>
-        <w:t>score</w:t>
-      </w:r>
-      <w:r>
-        <w:rPr>
-          <w:rFonts w:ascii="Microsoft YaHei" w:hAnsi="Microsoft YaHei" w:eastAsia="微软雅黑"/>
-          <w:b w:val="0"/>
-          <w:color w:val="222222"/>
-          <w:sz w:val="21"/>
-        </w:rPr>
-        <w:t xml:space="preserve"> 必须是 </w:t>
-      </w:r>
-      <w:r>
-        <w:rPr>
-          <w:rFonts w:ascii="Consolas" w:hAnsi="Consolas" w:eastAsia="微软雅黑"/>
-          <w:b w:val="0"/>
-          <w:color w:val="2D5C4A"/>
-          <w:sz w:val="19"/>
-        </w:rPr>
-        <w:t>int</w:t>
-      </w:r>
-      <w:r>
-        <w:rPr>
-          <w:rFonts w:ascii="Microsoft YaHei" w:hAnsi="Microsoft YaHei" w:eastAsia="微软雅黑"/>
-          <w:b w:val="0"/>
-          <w:color w:val="222222"/>
-          <w:sz w:val="21"/>
-        </w:rPr>
-        <w:t xml:space="preserve">（用 </w:t>
-      </w:r>
-      <w:r>
-        <w:rPr>
-          <w:rFonts w:ascii="Consolas" w:hAnsi="Consolas" w:eastAsia="微软雅黑"/>
-          <w:b w:val="0"/>
-          <w:color w:val="2D5C4A"/>
-          <w:sz w:val="19"/>
-        </w:rPr>
-        <w:t>type(...) is int</w:t>
-      </w:r>
-      <w:r>
-        <w:rPr>
-          <w:rFonts w:ascii="Microsoft YaHei" w:hAnsi="Microsoft YaHei" w:eastAsia="微软雅黑"/>
-          <w:b w:val="0"/>
-          <w:color w:val="222222"/>
-          <w:sz w:val="21"/>
-        </w:rPr>
-        <w:t xml:space="preserve">，拒绝 </w:t>
-      </w:r>
-      <w:r>
-        <w:rPr>
-          <w:rFonts w:ascii="Consolas" w:hAnsi="Consolas" w:eastAsia="微软雅黑"/>
-          <w:b w:val="0"/>
-          <w:color w:val="2D5C4A"/>
-          <w:sz w:val="19"/>
-        </w:rPr>
-        <w:t>True</w:t>
-      </w:r>
-      <w:r>
-        <w:rPr>
-          <w:rFonts w:ascii="Microsoft YaHei" w:hAnsi="Microsoft YaHei" w:eastAsia="微软雅黑"/>
-          <w:b w:val="0"/>
-          <w:color w:val="222222"/>
-          <w:sz w:val="21"/>
-        </w:rPr>
-        <w:t xml:space="preserve"> 与 </w:t>
-      </w:r>
-      <w:r>
-        <w:rPr>
-          <w:rFonts w:ascii="Consolas" w:hAnsi="Consolas" w:eastAsia="微软雅黑"/>
-          <w:b w:val="0"/>
-          <w:color w:val="2D5C4A"/>
-          <w:sz w:val="19"/>
-        </w:rPr>
-        <w:t>3.0</w:t>
-      </w:r>
-      <w:r>
-        <w:rPr>
-          <w:rFonts w:ascii="Microsoft YaHei" w:hAnsi="Microsoft YaHei" w:eastAsia="微软雅黑"/>
-          <w:b w:val="0"/>
-          <w:color w:val="222222"/>
-          <w:sz w:val="21"/>
-        </w:rPr>
-        <w:t>），其余字符串字段非空白，六个数组必须是"非空字符串组成的数组"。</w:t>
-      </w:r>
-    </w:p>
-    <w:p>
-      <w:pPr>
-        <w:spacing w:after="120"/>
-      </w:pPr>
-      <w:r>
-        <w:rPr>
-          <w:rFonts w:ascii="Microsoft YaHei" w:hAnsi="Microsoft YaHei" w:eastAsia="微软雅黑"/>
-          <w:b w:val="0"/>
-          <w:color w:val="222222"/>
-          <w:sz w:val="21"/>
-        </w:rPr>
-        <w:br/>
-        <w:t xml:space="preserve">任何一步失败统一抛 </w:t>
-      </w:r>
-      <w:r>
-        <w:rPr>
-          <w:rFonts w:ascii="Consolas" w:hAnsi="Consolas" w:eastAsia="微软雅黑"/>
-          <w:b w:val="0"/>
-          <w:color w:val="2D5C4A"/>
-          <w:sz w:val="19"/>
-        </w:rPr>
-        <w:t>InvalidLLMResponse</w:t>
-      </w:r>
-      <w:r>
-        <w:rPr>
-          <w:rFonts w:ascii="Microsoft YaHei" w:hAnsi="Microsoft YaHei" w:eastAsia="微软雅黑"/>
-          <w:b w:val="0"/>
-          <w:color w:val="222222"/>
-          <w:sz w:val="21"/>
-        </w:rPr>
-        <w:t>，向上映射为固定的公开错误文案，</w:t>
-        <w:br/>
-        <w:t>不把后端细节泄露到前端。</w:t>
-        <w:br/>
-      </w:r>
-    </w:p>
-    <w:p>
-      <w:pPr>
-        <w:pStyle w:val="Heading2"/>
-        <w:spacing w:before="240" w:after="80"/>
-      </w:pPr>
-      <w:r>
-        <w:rPr>
-          <w:rFonts w:ascii="Microsoft YaHei" w:hAnsi="Microsoft YaHei" w:eastAsia="微软雅黑"/>
-          <w:b/>
-          <w:color w:val="222222"/>
-          <w:sz w:val="24"/>
-        </w:rPr>
-        <w:t>2.4 失败语义与重试</w:t>
       </w:r>
     </w:p>
     <w:p>
@@ -2515,12 +2685,57 @@
       </w:pPr>
       <w:r>
         <w:rPr>
+          <w:rFonts w:ascii="Consolas" w:hAnsi="Consolas" w:eastAsia="微软雅黑"/>
+          <w:b w:val="0"/>
+          <w:color w:val="2D5C4A"/>
+          <w:sz w:val="19"/>
+        </w:rPr>
+        <w:t>parse_constant</w:t>
+      </w:r>
+      <w:r>
+        <w:rPr>
           <w:rFonts w:ascii="Microsoft YaHei" w:hAnsi="Microsoft YaHei" w:eastAsia="微软雅黑"/>
           <w:b w:val="0"/>
           <w:color w:val="222222"/>
           <w:sz w:val="21"/>
         </w:rPr>
-        <w:t>重试上限 2 次尝试（1 次重试）；</w:t>
+        <w:t xml:space="preserve"> 拒绝 </w:t>
+      </w:r>
+      <w:r>
+        <w:rPr>
+          <w:rFonts w:ascii="Consolas" w:hAnsi="Consolas" w:eastAsia="微软雅黑"/>
+          <w:b w:val="0"/>
+          <w:color w:val="2D5C4A"/>
+          <w:sz w:val="19"/>
+        </w:rPr>
+        <w:t>NaN</w:t>
+      </w:r>
+      <w:r>
+        <w:rPr>
+          <w:rFonts w:ascii="Microsoft YaHei" w:hAnsi="Microsoft YaHei" w:eastAsia="微软雅黑"/>
+          <w:b w:val="0"/>
+          <w:color w:val="222222"/>
+          <w:sz w:val="21"/>
+        </w:rPr>
+        <w:t xml:space="preserve"> / </w:t>
+      </w:r>
+      <w:r>
+        <w:rPr>
+          <w:rFonts w:ascii="Consolas" w:hAnsi="Consolas" w:eastAsia="微软雅黑"/>
+          <w:b w:val="0"/>
+          <w:color w:val="2D5C4A"/>
+          <w:sz w:val="19"/>
+        </w:rPr>
+        <w:t>Infinity</w:t>
+      </w:r>
+      <w:r>
+        <w:rPr>
+          <w:rFonts w:ascii="Microsoft YaHei" w:hAnsi="Microsoft YaHei" w:eastAsia="微软雅黑"/>
+          <w:b w:val="0"/>
+          <w:color w:val="222222"/>
+          <w:sz w:val="21"/>
+        </w:rPr>
+        <w:t>（Python 默认接受，会污染后续数值计算）；</w:t>
       </w:r>
     </w:p>
     <w:p>
@@ -2531,12 +2746,270 @@
       </w:pPr>
       <w:r>
         <w:rPr>
+          <w:rFonts w:ascii="Consolas" w:hAnsi="Consolas" w:eastAsia="微软雅黑"/>
+          <w:b w:val="0"/>
+          <w:color w:val="2D5C4A"/>
+          <w:sz w:val="19"/>
+        </w:rPr>
+        <w:t>object_pairs_hook</w:t>
+      </w:r>
+      <w:r>
+        <w:rPr>
           <w:rFonts w:ascii="Microsoft YaHei" w:hAnsi="Microsoft YaHei" w:eastAsia="微软雅黑"/>
           <w:b w:val="0"/>
           <w:color w:val="222222"/>
           <w:sz w:val="21"/>
         </w:rPr>
-        <w:t>只对瞬时故障重试：连接错误、超时、HTTP 500/503；</w:t>
+        <w:t xml:space="preserve"> 拒绝重复键（重复键会让"看起来有值"的字段实际被后者覆盖）；</w:t>
+      </w:r>
+    </w:p>
+    <w:p>
+      <w:pPr>
+        <w:spacing w:after="40"/>
+        <w:ind w:hanging="312" w:left="482"/>
+      </w:pPr>
+      <w:r>
+        <w:rPr>
+          <w:rFonts w:ascii="Microsoft YaHei" w:hAnsi="Microsoft YaHei" w:eastAsia="微软雅黑"/>
+          <w:b w:val="0"/>
+          <w:color w:val="222222"/>
+          <w:sz w:val="21"/>
+        </w:rPr>
+        <w:t xml:space="preserve">1.  </w:t>
+      </w:r>
+      <w:r>
+        <w:rPr>
+          <w:rFonts w:ascii="Microsoft YaHei" w:hAnsi="Microsoft YaHei" w:eastAsia="微软雅黑"/>
+          <w:b/>
+          <w:color w:val="222222"/>
+          <w:sz w:val="21"/>
+        </w:rPr>
+        <w:t>字段集合完全相等</w:t>
+      </w:r>
+      <w:r>
+        <w:rPr>
+          <w:rFonts w:ascii="Microsoft YaHei" w:hAnsi="Microsoft YaHei" w:eastAsia="微软雅黑"/>
+          <w:b w:val="0"/>
+          <w:color w:val="222222"/>
+          <w:sz w:val="21"/>
+        </w:rPr>
+        <w:t>：</w:t>
+      </w:r>
+      <w:r>
+        <w:rPr>
+          <w:rFonts w:ascii="Consolas" w:hAnsi="Consolas" w:eastAsia="微软雅黑"/>
+          <w:b w:val="0"/>
+          <w:color w:val="2D5C4A"/>
+          <w:sz w:val="19"/>
+        </w:rPr>
+        <w:t>set(data) != 九个字段</w:t>
+      </w:r>
+      <w:r>
+        <w:rPr>
+          <w:rFonts w:ascii="Microsoft YaHei" w:hAnsi="Microsoft YaHei" w:eastAsia="微软雅黑"/>
+          <w:b w:val="0"/>
+          <w:color w:val="222222"/>
+          <w:sz w:val="21"/>
+        </w:rPr>
+        <w:t xml:space="preserve"> 直接失败。多一个字段、少一个字段都不接受，</w:t>
+      </w:r>
+    </w:p>
+    <w:p>
+      <w:pPr>
+        <w:spacing w:after="120"/>
+      </w:pPr>
+      <w:r>
+        <w:rPr>
+          <w:rFonts w:ascii="Microsoft YaHei" w:hAnsi="Microsoft YaHei" w:eastAsia="微软雅黑"/>
+          <w:b w:val="0"/>
+          <w:color w:val="222222"/>
+          <w:sz w:val="21"/>
+        </w:rPr>
+        <w:t>防止模型自行发明字段后被静默丢弃；</w:t>
+      </w:r>
+    </w:p>
+    <w:p>
+      <w:pPr>
+        <w:spacing w:after="40"/>
+        <w:ind w:hanging="312" w:left="482"/>
+      </w:pPr>
+      <w:r>
+        <w:rPr>
+          <w:rFonts w:ascii="Microsoft YaHei" w:hAnsi="Microsoft YaHei" w:eastAsia="微软雅黑"/>
+          <w:b w:val="0"/>
+          <w:color w:val="222222"/>
+          <w:sz w:val="21"/>
+        </w:rPr>
+        <w:t xml:space="preserve">1.  </w:t>
+      </w:r>
+      <w:r>
+        <w:rPr>
+          <w:rFonts w:ascii="Microsoft YaHei" w:hAnsi="Microsoft YaHei" w:eastAsia="微软雅黑"/>
+          <w:b/>
+          <w:color w:val="222222"/>
+          <w:sz w:val="21"/>
+        </w:rPr>
+        <w:t>类型逐步校验</w:t>
+      </w:r>
+      <w:r>
+        <w:rPr>
+          <w:rFonts w:ascii="Microsoft YaHei" w:hAnsi="Microsoft YaHei" w:eastAsia="微软雅黑"/>
+          <w:b w:val="0"/>
+          <w:color w:val="222222"/>
+          <w:sz w:val="21"/>
+        </w:rPr>
+        <w:t>：</w:t>
+      </w:r>
+      <w:r>
+        <w:rPr>
+          <w:rFonts w:ascii="Consolas" w:hAnsi="Consolas" w:eastAsia="微软雅黑"/>
+          <w:b w:val="0"/>
+          <w:color w:val="2D5C4A"/>
+          <w:sz w:val="19"/>
+        </w:rPr>
+        <w:t>score</w:t>
+      </w:r>
+      <w:r>
+        <w:rPr>
+          <w:rFonts w:ascii="Microsoft YaHei" w:hAnsi="Microsoft YaHei" w:eastAsia="微软雅黑"/>
+          <w:b w:val="0"/>
+          <w:color w:val="222222"/>
+          <w:sz w:val="21"/>
+        </w:rPr>
+        <w:t xml:space="preserve"> 必须是 </w:t>
+      </w:r>
+      <w:r>
+        <w:rPr>
+          <w:rFonts w:ascii="Consolas" w:hAnsi="Consolas" w:eastAsia="微软雅黑"/>
+          <w:b w:val="0"/>
+          <w:color w:val="2D5C4A"/>
+          <w:sz w:val="19"/>
+        </w:rPr>
+        <w:t>int</w:t>
+      </w:r>
+      <w:r>
+        <w:rPr>
+          <w:rFonts w:ascii="Microsoft YaHei" w:hAnsi="Microsoft YaHei" w:eastAsia="微软雅黑"/>
+          <w:b w:val="0"/>
+          <w:color w:val="222222"/>
+          <w:sz w:val="21"/>
+        </w:rPr>
+        <w:t xml:space="preserve">（用 </w:t>
+      </w:r>
+      <w:r>
+        <w:rPr>
+          <w:rFonts w:ascii="Consolas" w:hAnsi="Consolas" w:eastAsia="微软雅黑"/>
+          <w:b w:val="0"/>
+          <w:color w:val="2D5C4A"/>
+          <w:sz w:val="19"/>
+        </w:rPr>
+        <w:t>type(...) is int</w:t>
+      </w:r>
+      <w:r>
+        <w:rPr>
+          <w:rFonts w:ascii="Microsoft YaHei" w:hAnsi="Microsoft YaHei" w:eastAsia="微软雅黑"/>
+          <w:b w:val="0"/>
+          <w:color w:val="222222"/>
+          <w:sz w:val="21"/>
+        </w:rPr>
+        <w:t xml:space="preserve">，拒绝 </w:t>
+      </w:r>
+      <w:r>
+        <w:rPr>
+          <w:rFonts w:ascii="Consolas" w:hAnsi="Consolas" w:eastAsia="微软雅黑"/>
+          <w:b w:val="0"/>
+          <w:color w:val="2D5C4A"/>
+          <w:sz w:val="19"/>
+        </w:rPr>
+        <w:t>True</w:t>
+      </w:r>
+      <w:r>
+        <w:rPr>
+          <w:rFonts w:ascii="Microsoft YaHei" w:hAnsi="Microsoft YaHei" w:eastAsia="微软雅黑"/>
+          <w:b w:val="0"/>
+          <w:color w:val="222222"/>
+          <w:sz w:val="21"/>
+        </w:rPr>
+        <w:t xml:space="preserve"> / </w:t>
+      </w:r>
+      <w:r>
+        <w:rPr>
+          <w:rFonts w:ascii="Consolas" w:hAnsi="Consolas" w:eastAsia="微软雅黑"/>
+          <w:b w:val="0"/>
+          <w:color w:val="2D5C4A"/>
+          <w:sz w:val="19"/>
+        </w:rPr>
+        <w:t>3.0</w:t>
+      </w:r>
+      <w:r>
+        <w:rPr>
+          <w:rFonts w:ascii="Microsoft YaHei" w:hAnsi="Microsoft YaHei" w:eastAsia="微软雅黑"/>
+          <w:b w:val="0"/>
+          <w:color w:val="222222"/>
+          <w:sz w:val="21"/>
+        </w:rPr>
+        <w:t>），</w:t>
+      </w:r>
+    </w:p>
+    <w:p>
+      <w:pPr>
+        <w:spacing w:after="120"/>
+      </w:pPr>
+      <w:r>
+        <w:rPr>
+          <w:rFonts w:ascii="Microsoft YaHei" w:hAnsi="Microsoft YaHei" w:eastAsia="微软雅黑"/>
+          <w:b w:val="0"/>
+          <w:color w:val="222222"/>
+          <w:sz w:val="21"/>
+        </w:rPr>
+        <w:t>其余字符串字段非空白，六个数组必须是"非空字符串组成的数组"。</w:t>
+      </w:r>
+    </w:p>
+    <w:p>
+      <w:pPr>
+        <w:spacing w:after="120"/>
+      </w:pPr>
+      <w:r>
+        <w:rPr>
+          <w:rFonts w:ascii="Microsoft YaHei" w:hAnsi="Microsoft YaHei" w:eastAsia="微软雅黑"/>
+          <w:b w:val="0"/>
+          <w:color w:val="222222"/>
+          <w:sz w:val="21"/>
+        </w:rPr>
+        <w:t xml:space="preserve">任何一步失败统一抛 </w:t>
+      </w:r>
+      <w:r>
+        <w:rPr>
+          <w:rFonts w:ascii="Consolas" w:hAnsi="Consolas" w:eastAsia="微软雅黑"/>
+          <w:b w:val="0"/>
+          <w:color w:val="2D5C4A"/>
+          <w:sz w:val="19"/>
+        </w:rPr>
+        <w:t>InvalidLLMResponse</w:t>
+      </w:r>
+      <w:r>
+        <w:rPr>
+          <w:rFonts w:ascii="Microsoft YaHei" w:hAnsi="Microsoft YaHei" w:eastAsia="微软雅黑"/>
+          <w:b w:val="0"/>
+          <w:color w:val="222222"/>
+          <w:sz w:val="21"/>
+        </w:rPr>
+        <w:t>，向上映射为固定的公开错误文案， 不把后端细节泄露到前端。</w:t>
+      </w:r>
+    </w:p>
+    <w:p>
+      <w:pPr>
+        <w:pStyle w:val="Heading2"/>
+        <w:spacing w:before="240" w:after="80"/>
+      </w:pPr>
+      <w:r>
+        <w:rPr>
+          <w:rFonts w:ascii="Microsoft YaHei" w:hAnsi="Microsoft YaHei" w:eastAsia="微软雅黑"/>
+          <w:b/>
+          <w:color w:val="222222"/>
+          <w:sz w:val="24"/>
+        </w:rPr>
+        <w:t>2.4 失败语义与重试</w:t>
       </w:r>
     </w:p>
     <w:p>
@@ -2552,7 +3025,25 @@
           <w:color w:val="222222"/>
           <w:sz w:val="21"/>
         </w:rPr>
-        <w:t>4xx、字段不合法、内容为空不重试——重试同样的输入只会得到同样的错误；</w:t>
+        <w:t xml:space="preserve">重试上限 </w:t>
+      </w:r>
+      <w:r>
+        <w:rPr>
+          <w:rFonts w:ascii="Microsoft YaHei" w:hAnsi="Microsoft YaHei" w:eastAsia="微软雅黑"/>
+          <w:b/>
+          <w:color w:val="222222"/>
+          <w:sz w:val="21"/>
+        </w:rPr>
+        <w:t>2 次尝试</w:t>
+      </w:r>
+      <w:r>
+        <w:rPr>
+          <w:rFonts w:ascii="Microsoft YaHei" w:hAnsi="Microsoft YaHei" w:eastAsia="微软雅黑"/>
+          <w:b w:val="0"/>
+          <w:color w:val="222222"/>
+          <w:sz w:val="21"/>
+        </w:rPr>
+        <w:t>（1 次重试）；</w:t>
       </w:r>
     </w:p>
     <w:p>
@@ -2568,16 +3059,16 @@
           <w:color w:val="222222"/>
           <w:sz w:val="21"/>
         </w:rPr>
-        <w:t>超时默认 20 秒（</w:t>
-      </w:r>
-      <w:r>
-        <w:rPr>
-          <w:rFonts w:ascii="Consolas" w:hAnsi="Consolas" w:eastAsia="微软雅黑"/>
-          <w:b w:val="0"/>
-          <w:color w:val="2D5C4A"/>
-          <w:sz w:val="19"/>
-        </w:rPr>
-        <w:t>LIULIANGCHUHAI_DEEPSEEK_TIMEOUT_SECONDS</w:t>
+        <w:t>只对</w:t>
+      </w:r>
+      <w:r>
+        <w:rPr>
+          <w:rFonts w:ascii="Microsoft YaHei" w:hAnsi="Microsoft YaHei" w:eastAsia="微软雅黑"/>
+          <w:b/>
+          <w:color w:val="222222"/>
+          <w:sz w:val="21"/>
+        </w:rPr>
+        <w:t>瞬时</w:t>
       </w:r>
       <w:r>
         <w:rPr>
@@ -2586,125 +3077,7 @@
           <w:color w:val="222222"/>
           <w:sz w:val="21"/>
         </w:rPr>
-        <w:t>）。</w:t>
-      </w:r>
-    </w:p>
-    <w:p>
-      <w:pPr>
-        <w:pStyle w:val="Heading2"/>
-        <w:spacing w:before="240" w:after="80"/>
-      </w:pPr>
-      <w:r>
-        <w:rPr>
-          <w:rFonts w:ascii="Microsoft YaHei" w:hAnsi="Microsoft YaHei" w:eastAsia="微软雅黑"/>
-          <w:b/>
-          <w:color w:val="222222"/>
-          <w:sz w:val="24"/>
-        </w:rPr>
-        <w:t>2.5 这一部分"智能"在哪里</w:t>
-      </w:r>
-    </w:p>
-    <w:p>
-      <w:pPr>
-        <w:spacing w:after="120"/>
-      </w:pPr>
-      <w:r>
-        <w:rPr>
-          <w:rFonts w:ascii="Microsoft YaHei" w:hAnsi="Microsoft YaHei" w:eastAsia="微软雅黑"/>
-          <w:b w:val="0"/>
-          <w:color w:val="222222"/>
-          <w:sz w:val="21"/>
-        </w:rPr>
-        <w:br/>
-        <w:t>模型负责判断（这货适不适合这个市场、风险是什么），代码负责边界（字段、类型、枚举、长度、重试、降级）。</w:t>
-        <w:br/>
-        <w:t>两者的分工在代码里是显式的：</w:t>
-      </w:r>
-      <w:r>
-        <w:rPr>
-          <w:rFonts w:ascii="Consolas" w:hAnsi="Consolas" w:eastAsia="微软雅黑"/>
-          <w:b w:val="0"/>
-          <w:color w:val="2D5C4A"/>
-          <w:sz w:val="19"/>
-        </w:rPr>
-        <w:t>infrastructure/llm/deepseek.py</w:t>
-      </w:r>
-      <w:r>
-        <w:rPr>
-          <w:rFonts w:ascii="Microsoft YaHei" w:hAnsi="Microsoft YaHei" w:eastAsia="微软雅黑"/>
-          <w:b w:val="0"/>
-          <w:color w:val="222222"/>
-          <w:sz w:val="21"/>
-        </w:rPr>
-        <w:t xml:space="preserve"> 只有提示词与解析，</w:t>
-        <w:br/>
-      </w:r>
-      <w:r>
-        <w:rPr>
-          <w:rFonts w:ascii="Consolas" w:hAnsi="Consolas" w:eastAsia="微软雅黑"/>
-          <w:b w:val="0"/>
-          <w:color w:val="2D5C4A"/>
-          <w:sz w:val="19"/>
-        </w:rPr>
-        <w:t>application/use_cases/analyze_product.py</w:t>
-      </w:r>
-      <w:r>
-        <w:rPr>
-          <w:rFonts w:ascii="Microsoft YaHei" w:hAnsi="Microsoft YaHei" w:eastAsia="微软雅黑"/>
-          <w:b w:val="0"/>
-          <w:color w:val="222222"/>
-          <w:sz w:val="21"/>
-        </w:rPr>
-        <w:t xml:space="preserve"> 只有编排，</w:t>
-      </w:r>
-      <w:r>
-        <w:rPr>
-          <w:rFonts w:ascii="Consolas" w:hAnsi="Consolas" w:eastAsia="微软雅黑"/>
-          <w:b w:val="0"/>
-          <w:color w:val="2D5C4A"/>
-          <w:sz w:val="19"/>
-        </w:rPr>
-        <w:t>domain/market_analysis.py</w:t>
-      </w:r>
-      <w:r>
-        <w:rPr>
-          <w:rFonts w:ascii="Microsoft YaHei" w:hAnsi="Microsoft YaHei" w:eastAsia="微软雅黑"/>
-          <w:b w:val="0"/>
-          <w:color w:val="222222"/>
-          <w:sz w:val="21"/>
-        </w:rPr>
-        <w:t xml:space="preserve"> 只有不变量。</w:t>
-        <w:br/>
-      </w:r>
-    </w:p>
-    <w:p>
-      <w:pPr>
-        <w:pStyle w:val="Heading1"/>
-        <w:spacing w:before="360" w:after="120"/>
-      </w:pPr>
-      <w:r>
-        <w:rPr>
-          <w:rFonts w:ascii="Microsoft YaHei" w:hAnsi="Microsoft YaHei" w:eastAsia="微软雅黑"/>
-          <w:b/>
-          <w:color w:val="2D5C4A"/>
-          <w:sz w:val="30"/>
-        </w:rPr>
-        <w:t>3. 第二部分：内容方案智能体</w:t>
-      </w:r>
-    </w:p>
-    <w:p>
-      <w:pPr>
-        <w:pStyle w:val="Heading2"/>
-        <w:spacing w:before="240" w:after="80"/>
-      </w:pPr>
-      <w:r>
-        <w:rPr>
-          <w:rFonts w:ascii="Microsoft YaHei" w:hAnsi="Microsoft YaHei" w:eastAsia="微软雅黑"/>
-          <w:b/>
-          <w:color w:val="222222"/>
-          <w:sz w:val="24"/>
-        </w:rPr>
-        <w:t>3.1 输入</w:t>
+        <w:t>故障重试：连接错误、超时、HTTP 500/503；</w:t>
       </w:r>
     </w:p>
     <w:p>
@@ -2720,7 +3093,25 @@
           <w:color w:val="222222"/>
           <w:sz w:val="21"/>
         </w:rPr>
-        <w:t>商品（唯一事实源）；</w:t>
+        <w:t>4xx、字段不合法、内容为空</w:t>
+      </w:r>
+      <w:r>
+        <w:rPr>
+          <w:rFonts w:ascii="Microsoft YaHei" w:hAnsi="Microsoft YaHei" w:eastAsia="微软雅黑"/>
+          <w:b/>
+          <w:color w:val="222222"/>
+          <w:sz w:val="21"/>
+        </w:rPr>
+        <w:t>不重试</w:t>
+      </w:r>
+      <w:r>
+        <w:rPr>
+          <w:rFonts w:ascii="Microsoft YaHei" w:hAnsi="Microsoft YaHei" w:eastAsia="微软雅黑"/>
+          <w:b w:val="0"/>
+          <w:color w:val="222222"/>
+          <w:sz w:val="21"/>
+        </w:rPr>
+        <w:t>——重试同样的输入只会得到同样的错误；</w:t>
       </w:r>
     </w:p>
     <w:p>
@@ -2736,7 +3127,152 @@
           <w:color w:val="222222"/>
           <w:sz w:val="21"/>
         </w:rPr>
-        <w:t>市场（国家、人群、备注）；</w:t>
+        <w:t>超时默认 20 秒（</w:t>
+      </w:r>
+      <w:r>
+        <w:rPr>
+          <w:rFonts w:ascii="Consolas" w:hAnsi="Consolas" w:eastAsia="微软雅黑"/>
+          <w:b w:val="0"/>
+          <w:color w:val="2D5C4A"/>
+          <w:sz w:val="19"/>
+        </w:rPr>
+        <w:t>LIULIANGCHUHAI_DEEPSEEK_TIMEOUT_SECONDS</w:t>
+      </w:r>
+      <w:r>
+        <w:rPr>
+          <w:rFonts w:ascii="Microsoft YaHei" w:hAnsi="Microsoft YaHei" w:eastAsia="微软雅黑"/>
+          <w:b w:val="0"/>
+          <w:color w:val="222222"/>
+          <w:sz w:val="21"/>
+        </w:rPr>
+        <w:t>）。</w:t>
+      </w:r>
+    </w:p>
+    <w:p>
+      <w:pPr>
+        <w:pStyle w:val="Heading2"/>
+        <w:spacing w:before="240" w:after="80"/>
+      </w:pPr>
+      <w:r>
+        <w:rPr>
+          <w:rFonts w:ascii="Microsoft YaHei" w:hAnsi="Microsoft YaHei" w:eastAsia="微软雅黑"/>
+          <w:b/>
+          <w:color w:val="222222"/>
+          <w:sz w:val="24"/>
+        </w:rPr>
+        <w:t>2.5 这一部分"智能"在哪里</w:t>
+      </w:r>
+    </w:p>
+    <w:p>
+      <w:pPr>
+        <w:spacing w:after="120"/>
+      </w:pPr>
+      <w:r>
+        <w:rPr>
+          <w:rFonts w:ascii="Microsoft YaHei" w:hAnsi="Microsoft YaHei" w:eastAsia="微软雅黑"/>
+          <w:b w:val="0"/>
+          <w:color w:val="222222"/>
+          <w:sz w:val="21"/>
+        </w:rPr>
+        <w:t>模型负责判断（这货适不适合这个市场、风险是什么）， 代码负责边界（字段、类型、枚举、长度、重试、降级）。 两者的分工在代码里是显式的：</w:t>
+      </w:r>
+      <w:r>
+        <w:rPr>
+          <w:rFonts w:ascii="Consolas" w:hAnsi="Consolas" w:eastAsia="微软雅黑"/>
+          <w:b w:val="0"/>
+          <w:color w:val="2D5C4A"/>
+          <w:sz w:val="19"/>
+        </w:rPr>
+        <w:t>infrastructure/llm/deepseek.py</w:t>
+      </w:r>
+      <w:r>
+        <w:rPr>
+          <w:rFonts w:ascii="Microsoft YaHei" w:hAnsi="Microsoft YaHei" w:eastAsia="微软雅黑"/>
+          <w:b w:val="0"/>
+          <w:color w:val="222222"/>
+          <w:sz w:val="21"/>
+        </w:rPr>
+        <w:t xml:space="preserve"> 只有提示词与解析， </w:t>
+      </w:r>
+      <w:r>
+        <w:rPr>
+          <w:rFonts w:ascii="Consolas" w:hAnsi="Consolas" w:eastAsia="微软雅黑"/>
+          <w:b w:val="0"/>
+          <w:color w:val="2D5C4A"/>
+          <w:sz w:val="19"/>
+        </w:rPr>
+        <w:t>application/use_cases/analyze_product.py</w:t>
+      </w:r>
+      <w:r>
+        <w:rPr>
+          <w:rFonts w:ascii="Microsoft YaHei" w:hAnsi="Microsoft YaHei" w:eastAsia="微软雅黑"/>
+          <w:b w:val="0"/>
+          <w:color w:val="222222"/>
+          <w:sz w:val="21"/>
+        </w:rPr>
+        <w:t xml:space="preserve"> 只有编排，</w:t>
+      </w:r>
+      <w:r>
+        <w:rPr>
+          <w:rFonts w:ascii="Consolas" w:hAnsi="Consolas" w:eastAsia="微软雅黑"/>
+          <w:b w:val="0"/>
+          <w:color w:val="2D5C4A"/>
+          <w:sz w:val="19"/>
+        </w:rPr>
+        <w:t>domain/market_analysis.py</w:t>
+      </w:r>
+      <w:r>
+        <w:rPr>
+          <w:rFonts w:ascii="Microsoft YaHei" w:hAnsi="Microsoft YaHei" w:eastAsia="微软雅黑"/>
+          <w:b w:val="0"/>
+          <w:color w:val="222222"/>
+          <w:sz w:val="21"/>
+        </w:rPr>
+        <w:t xml:space="preserve"> 只有不变量。</w:t>
+      </w:r>
+    </w:p>
+    <w:p>
+      <w:pPr>
+        <w:spacing w:after="120"/>
+      </w:pPr>
+      <w:r>
+        <w:rPr>
+          <w:rFonts w:ascii="Microsoft YaHei" w:hAnsi="Microsoft YaHei" w:eastAsia="微软雅黑"/>
+          <w:b w:val="0"/>
+          <w:color w:val="222222"/>
+          <w:sz w:val="21"/>
+        </w:rPr>
+        <w:t>---</w:t>
+      </w:r>
+    </w:p>
+    <w:p>
+      <w:pPr>
+        <w:pStyle w:val="Heading1"/>
+        <w:spacing w:before="360" w:after="120"/>
+      </w:pPr>
+      <w:r>
+        <w:rPr>
+          <w:rFonts w:ascii="Microsoft YaHei" w:hAnsi="Microsoft YaHei" w:eastAsia="微软雅黑"/>
+          <w:b/>
+          <w:color w:val="2D5C4A"/>
+          <w:sz w:val="30"/>
+        </w:rPr>
+        <w:t>3. 第二部分：内容方案智能体</w:t>
+      </w:r>
+    </w:p>
+    <w:p>
+      <w:pPr>
+        <w:pStyle w:val="Heading2"/>
+        <w:spacing w:before="240" w:after="80"/>
+      </w:pPr>
+      <w:r>
+        <w:rPr>
+          <w:rFonts w:ascii="Microsoft YaHei" w:hAnsi="Microsoft YaHei" w:eastAsia="微软雅黑"/>
+          <w:b/>
+          <w:color w:val="222222"/>
+          <w:sz w:val="24"/>
+        </w:rPr>
+        <w:t>3.1 输入</w:t>
       </w:r>
     </w:p>
     <w:p>
@@ -2752,7 +3288,48 @@
           <w:color w:val="222222"/>
           <w:sz w:val="21"/>
         </w:rPr>
-        <w:t>已有的分析结果（人群、风险、推荐等级）——不重跑分析；</w:t>
+        <w:t>商品（唯一事实源）；</w:t>
+      </w:r>
+    </w:p>
+    <w:p>
+      <w:pPr>
+        <w:pStyle w:val="ListBullet"/>
+        <w:spacing w:after="40"/>
+        <w:ind w:left="482"/>
+      </w:pPr>
+      <w:r>
+        <w:rPr>
+          <w:rFonts w:ascii="Microsoft YaHei" w:hAnsi="Microsoft YaHei" w:eastAsia="微软雅黑"/>
+          <w:b w:val="0"/>
+          <w:color w:val="222222"/>
+          <w:sz w:val="21"/>
+        </w:rPr>
+        <w:t>市场（国家、人群、备注）；</w:t>
+      </w:r>
+    </w:p>
+    <w:p>
+      <w:pPr>
+        <w:pStyle w:val="ListBullet"/>
+        <w:spacing w:after="40"/>
+        <w:ind w:left="482"/>
+      </w:pPr>
+      <w:r>
+        <w:rPr>
+          <w:rFonts w:ascii="Microsoft YaHei" w:hAnsi="Microsoft YaHei" w:eastAsia="微软雅黑"/>
+          <w:b/>
+          <w:color w:val="222222"/>
+          <w:sz w:val="21"/>
+        </w:rPr>
+        <w:t>已有的分析结果</w:t>
+      </w:r>
+      <w:r>
+        <w:rPr>
+          <w:rFonts w:ascii="Microsoft YaHei" w:hAnsi="Microsoft YaHei" w:eastAsia="微软雅黑"/>
+          <w:b w:val="0"/>
+          <w:color w:val="222222"/>
+          <w:sz w:val="21"/>
+        </w:rPr>
+        <w:t>（人群、风险、推荐等级）——不重跑分析；</w:t>
       </w:r>
     </w:p>
     <w:p>
@@ -3246,22 +3823,21 @@
           <w:color w:val="222222"/>
           <w:sz w:val="21"/>
         </w:rPr>
-        <w:t>这份提示词是全系统最长的一段，它解决的是"翻译腔"这个具体问题。</w:t>
+        <w:t>这份提示词是全系统最长的一段，它解决的是"翻译腔"这个具体问题：</w:t>
       </w:r>
     </w:p>
     <w:p>
       <w:pPr>
-        <w:pStyle w:val="Heading3"/>
-        <w:spacing w:before="200" w:after="60"/>
+        <w:spacing w:after="120"/>
       </w:pPr>
       <w:r>
         <w:rPr>
           <w:rFonts w:ascii="Microsoft YaHei" w:hAnsi="Microsoft YaHei" w:eastAsia="微软雅黑"/>
           <w:b/>
           <w:color w:val="222222"/>
-          <w:sz w:val="22"/>
-        </w:rPr>
-        <w:t>① 先选人，再选场景，最后贯穿</w:t>
+          <w:sz w:val="21"/>
+        </w:rPr>
+        <w:t>① 先选人，再选场景，最后贯穿。</w:t>
       </w:r>
     </w:p>
     <w:p>
@@ -3299,17 +3875,16 @@
     </w:p>
     <w:p>
       <w:pPr>
-        <w:pStyle w:val="Heading3"/>
-        <w:spacing w:before="200" w:after="60"/>
+        <w:spacing w:after="120"/>
       </w:pPr>
       <w:r>
         <w:rPr>
           <w:rFonts w:ascii="Microsoft YaHei" w:hAnsi="Microsoft YaHei" w:eastAsia="微软雅黑"/>
           <w:b/>
           <w:color w:val="222222"/>
-          <w:sz w:val="22"/>
-        </w:rPr>
-        <w:t>② 给校准样例，但要求不要照抄</w:t>
+          <w:sz w:val="21"/>
+        </w:rPr>
+        <w:t>② 给校准样例，但要求不要照抄。</w:t>
       </w:r>
     </w:p>
     <w:p>
@@ -3323,19 +3898,16 @@
           <w:color w:val="222222"/>
           <w:sz w:val="21"/>
         </w:rPr>
-        <w:br/>
-        <w:t>提示词里给了三条参考（百色芒果×印尼、六堡茶×越南、壮锦×新加坡），</w:t>
-        <w:br/>
-        <w:t xml:space="preserve">并明确 </w:t>
-      </w:r>
-      <w:r>
-        <w:rPr>
-          <w:rFonts w:ascii="Consolas" w:hAnsi="Consolas" w:eastAsia="微软雅黑"/>
-          <w:b w:val="0"/>
-          <w:color w:val="2D5C4A"/>
-          <w:sz w:val="19"/>
-        </w:rPr>
-        <w:t>Adapt to the actual product and audience rather than copying these ideas</w:t>
+        <w:t>提示词里给了三条参考（百色芒果×印尼、六堡茶×越南、壮锦×新加坡）， 并明确 "Adapt to the actual product and audience rather than copying these ideas"。 样例的作用是锚定</w:t>
+      </w:r>
+      <w:r>
+        <w:rPr>
+          <w:rFonts w:ascii="Microsoft YaHei" w:hAnsi="Microsoft YaHei" w:eastAsia="微软雅黑"/>
+          <w:b/>
+          <w:color w:val="222222"/>
+          <w:sz w:val="21"/>
+        </w:rPr>
+        <w:t>抽象层级</w:t>
       </w:r>
       <w:r>
         <w:rPr>
@@ -3344,25 +3916,21 @@
           <w:color w:val="222222"/>
           <w:sz w:val="21"/>
         </w:rPr>
-        <w:t>。</w:t>
-        <w:br/>
-        <w:t>样例的作用是锚定抽象层级，不是给模板。</w:t>
-        <w:br/>
+        <w:t>，不是给模板。</w:t>
       </w:r>
     </w:p>
     <w:p>
       <w:pPr>
-        <w:pStyle w:val="Heading3"/>
-        <w:spacing w:before="200" w:after="60"/>
+        <w:spacing w:after="120"/>
       </w:pPr>
       <w:r>
         <w:rPr>
           <w:rFonts w:ascii="Microsoft YaHei" w:hAnsi="Microsoft YaHei" w:eastAsia="微软雅黑"/>
           <w:b/>
           <w:color w:val="222222"/>
-          <w:sz w:val="22"/>
-        </w:rPr>
-        <w:t>③ 事实边界：商品是唯一事实源</w:t>
+          <w:sz w:val="21"/>
+        </w:rPr>
+        <w:t>③ 事实边界：商品是唯一事实源。</w:t>
       </w:r>
     </w:p>
     <w:p>
@@ -3395,44 +3963,21 @@
           <w:color w:val="222222"/>
           <w:sz w:val="21"/>
         </w:rPr>
-        <w:br/>
-        <w:t>同时禁止把"高端"写成等级（</w:t>
-      </w:r>
-      <w:r>
-        <w:rPr>
-          <w:rFonts w:ascii="Consolas" w:hAnsi="Consolas" w:eastAsia="微软雅黑"/>
-          <w:b w:val="0"/>
-          <w:color w:val="2D5C4A"/>
-          <w:sz w:val="19"/>
-        </w:rPr>
-        <w:t>Premium describes a creative positioning, never a grade</w:t>
-      </w:r>
-      <w:r>
-        <w:rPr>
-          <w:rFonts w:ascii="Microsoft YaHei" w:hAnsi="Microsoft YaHei" w:eastAsia="微软雅黑"/>
-          <w:b w:val="0"/>
-          <w:color w:val="222222"/>
-          <w:sz w:val="21"/>
-        </w:rPr>
-        <w:t>），</w:t>
-        <w:br/>
-        <w:t>禁止编造个人品尝体验，禁止暗示现在就能下单。</w:t>
-        <w:br/>
+        <w:t>同时禁止把"高端"写成等级（"Premium describes a creative positioning, never a grade"）， 禁止编造个人品尝体验，禁止暗示现在就能下单。</w:t>
       </w:r>
     </w:p>
     <w:p>
       <w:pPr>
-        <w:pStyle w:val="Heading3"/>
-        <w:spacing w:before="200" w:after="60"/>
+        <w:spacing w:after="120"/>
       </w:pPr>
       <w:r>
         <w:rPr>
           <w:rFonts w:ascii="Microsoft YaHei" w:hAnsi="Microsoft YaHei" w:eastAsia="微软雅黑"/>
           <w:b/>
           <w:color w:val="222222"/>
-          <w:sz w:val="22"/>
-        </w:rPr>
-        <w:t>④ 语言边界：输出语言由目标语言决定，与国家无关</w:t>
+          <w:sz w:val="21"/>
+        </w:rPr>
+        <w:t>④ 语言边界：输出语言由目标语言决定，与国家无关。</w:t>
       </w:r>
     </w:p>
     <w:p>
@@ -3636,7 +4181,7 @@
           <w:color w:val="2D5C4A"/>
           <w:sz w:val="19"/>
         </w:rPr>
-        <w:t>the / and / of / is</w:t>
+        <w:t>the / and / of / is ...</w:t>
       </w:r>
       <w:r>
         <w:rPr>
@@ -3645,7 +4190,39 @@
           <w:color w:val="222222"/>
           <w:sz w:val="21"/>
         </w:rPr>
-        <w:t xml:space="preserve"> 这类高频词。若目标语言不是英语，而文本仍是"整段英文"，判定为未翻译。代码注释里明确写了这只是一个小的启发式，不是语言识别服务——它只拦明显的漏翻；</w:t>
+        <w:t xml:space="preserve"> 这类高频词。若目标语言不是英语，</w:t>
+      </w:r>
+    </w:p>
+    <w:p>
+      <w:pPr>
+        <w:spacing w:after="120"/>
+      </w:pPr>
+      <w:r>
+        <w:rPr>
+          <w:rFonts w:ascii="Microsoft YaHei" w:hAnsi="Microsoft YaHei" w:eastAsia="微软雅黑"/>
+          <w:b w:val="0"/>
+          <w:color w:val="222222"/>
+          <w:sz w:val="21"/>
+        </w:rPr>
+        <w:t>而文本仍是"整段英文"，判定为未翻译。文档里明确写了这</w:t>
+      </w:r>
+      <w:r>
+        <w:rPr>
+          <w:rFonts w:ascii="Microsoft YaHei" w:hAnsi="Microsoft YaHei" w:eastAsia="微软雅黑"/>
+          <w:b/>
+          <w:color w:val="222222"/>
+          <w:sz w:val="21"/>
+        </w:rPr>
+        <w:t>只是一个小的启发式， 不是语言识别服务</w:t>
+      </w:r>
+      <w:r>
+        <w:rPr>
+          <w:rFonts w:ascii="Microsoft YaHei" w:hAnsi="Microsoft YaHei" w:eastAsia="微软雅黑"/>
+          <w:b w:val="0"/>
+          <w:color w:val="222222"/>
+          <w:sz w:val="21"/>
+        </w:rPr>
+        <w:t>——它只拦明显的漏翻，不做真假语言判定；</w:t>
       </w:r>
     </w:p>
     <w:p>
@@ -3670,7 +4247,7 @@
           <w:color w:val="222222"/>
           <w:sz w:val="21"/>
         </w:rPr>
-        <w:t>：与第一部分相同的重复键、NaN、字段集校验。</w:t>
+        <w:t>：与第一部分相同的重复键 / NaN / 字段集校验。</w:t>
       </w:r>
     </w:p>
     <w:p>
@@ -3699,13 +4276,566 @@
           <w:color w:val="222222"/>
           <w:sz w:val="21"/>
         </w:rPr>
-        <w:br/>
-        <w:t>内容方案失败即失败：不重跑分析、不静默回退到 mock。</w:t>
-        <w:br/>
-        <w:t>理由是一次内容方案要产出六段长文本，任何一段是占位内容都会让演示看起来像假的；宁可报错让用户重试。</w:t>
-        <w:br/>
-        <w:t>超时独立配置（默认 60 秒），因为它比单次分析长得多。</w:t>
-        <w:br/>
+        <w:t>内容方案</w:t>
+      </w:r>
+      <w:r>
+        <w:rPr>
+          <w:rFonts w:ascii="Microsoft YaHei" w:hAnsi="Microsoft YaHei" w:eastAsia="微软雅黑"/>
+          <w:b/>
+          <w:color w:val="222222"/>
+          <w:sz w:val="21"/>
+        </w:rPr>
+        <w:t>失败即失败</w:t>
+      </w:r>
+      <w:r>
+        <w:rPr>
+          <w:rFonts w:ascii="Microsoft YaHei" w:hAnsi="Microsoft YaHei" w:eastAsia="微软雅黑"/>
+          <w:b w:val="0"/>
+          <w:color w:val="222222"/>
+          <w:sz w:val="21"/>
+        </w:rPr>
+        <w:t>：不重跑分析、不静默回退到 mock。 理由是一次内容方案要产出六段长文本，任何一段是占位内容都会让演示看起来像假的； 宁可报错让用户重试。超时独立配置（默认 60 秒），因为它比单次分析长得多。</w:t>
+      </w:r>
+    </w:p>
+    <w:p>
+      <w:pPr>
+        <w:pStyle w:val="Heading2"/>
+        <w:spacing w:before="240" w:after="80"/>
+      </w:pPr>
+      <w:r>
+        <w:rPr>
+          <w:rFonts w:ascii="Microsoft YaHei" w:hAnsi="Microsoft YaHei" w:eastAsia="微软雅黑"/>
+          <w:b/>
+          <w:color w:val="222222"/>
+          <w:sz w:val="24"/>
+        </w:rPr>
+        <w:t>3.6 下游：把提示词变成一张图</w:t>
+      </w:r>
+    </w:p>
+    <w:p>
+      <w:pPr>
+        <w:spacing w:after="120"/>
+      </w:pPr>
+      <w:r>
+        <w:rPr>
+          <w:rFonts w:ascii="Consolas" w:hAnsi="Consolas" w:eastAsia="微软雅黑"/>
+          <w:b w:val="0"/>
+          <w:color w:val="2D5C4A"/>
+          <w:sz w:val="19"/>
+        </w:rPr>
+        <w:t>image_prompt</w:t>
+      </w:r>
+      <w:r>
+        <w:rPr>
+          <w:rFonts w:ascii="Microsoft YaHei" w:hAnsi="Microsoft YaHei" w:eastAsia="微软雅黑"/>
+          <w:b w:val="0"/>
+          <w:color w:val="222222"/>
+          <w:sz w:val="21"/>
+        </w:rPr>
+        <w:t xml:space="preserve"> 原本只是文本，链条在这里断掉。现在它由 </w:t>
+      </w:r>
+      <w:r>
+        <w:rPr>
+          <w:rFonts w:ascii="Consolas" w:hAnsi="Consolas" w:eastAsia="微软雅黑"/>
+          <w:b w:val="0"/>
+          <w:color w:val="2D5C4A"/>
+          <w:sz w:val="19"/>
+        </w:rPr>
+        <w:t>ImagePort</w:t>
+      </w:r>
+      <w:r>
+        <w:rPr>
+          <w:rFonts w:ascii="Microsoft YaHei" w:hAnsi="Microsoft YaHei" w:eastAsia="微软雅黑"/>
+          <w:b w:val="0"/>
+          <w:color w:val="222222"/>
+          <w:sz w:val="21"/>
+        </w:rPr>
+        <w:t xml:space="preserve"> 接手：</w:t>
+      </w:r>
+    </w:p>
+    <w:tbl>
+      <w:tblPr>
+        <w:tblStyle w:val="TableGrid"/>
+        <w:tblW w:type="auto" w:w="0"/>
+        <w:jc w:val="center"/>
+        <w:tblLook w:firstColumn="1" w:firstRow="1" w:lastColumn="0" w:lastRow="0" w:noHBand="0" w:noVBand="1" w:val="04A0"/>
+      </w:tblPr>
+      <w:tblGrid>
+        <w:gridCol w:w="3173"/>
+        <w:gridCol w:w="3173"/>
+        <w:gridCol w:w="3173"/>
+      </w:tblGrid>
+      <w:tr>
+        <w:tc>
+          <w:tcPr>
+            <w:tcW w:type="dxa" w:w="3173"/>
+            <w:shd w:val="clear" w:color="auto" w:fill="EEF2EA"/>
+          </w:tcPr>
+          <w:p>
+            <w:pPr>
+              <w:spacing w:after="0"/>
+            </w:pPr>
+            <w:r>
+              <w:rPr>
+                <w:rFonts w:ascii="Consolas" w:hAnsi="Consolas" w:eastAsia="微软雅黑"/>
+                <w:b/>
+                <w:color w:val="2D5C4A"/>
+                <w:sz w:val="17"/>
+              </w:rPr>
+              <w:t>IMAGE_PROVIDER</w:t>
+            </w:r>
+          </w:p>
+        </w:tc>
+        <w:tc>
+          <w:tcPr>
+            <w:tcW w:type="dxa" w:w="3173"/>
+            <w:shd w:val="clear" w:color="auto" w:fill="EEF2EA"/>
+          </w:tcPr>
+          <w:p>
+            <w:pPr>
+              <w:spacing w:after="0"/>
+            </w:pPr>
+            <w:r>
+              <w:rPr>
+                <w:rFonts w:ascii="Microsoft YaHei" w:hAnsi="Microsoft YaHei" w:eastAsia="微软雅黑"/>
+                <w:b/>
+                <w:color w:val="1C3A30"/>
+                <w:sz w:val="19"/>
+              </w:rPr>
+              <w:t>产物</w:t>
+            </w:r>
+          </w:p>
+        </w:tc>
+        <w:tc>
+          <w:tcPr>
+            <w:tcW w:type="dxa" w:w="3173"/>
+            <w:shd w:val="clear" w:color="auto" w:fill="EEF2EA"/>
+          </w:tcPr>
+          <w:p>
+            <w:pPr>
+              <w:spacing w:after="0"/>
+            </w:pPr>
+            <w:r>
+              <w:rPr>
+                <w:rFonts w:ascii="Microsoft YaHei" w:hAnsi="Microsoft YaHei" w:eastAsia="微软雅黑"/>
+                <w:b/>
+                <w:color w:val="1C3A30"/>
+                <w:sz w:val="19"/>
+              </w:rPr>
+              <w:t>依赖</w:t>
+            </w:r>
+          </w:p>
+        </w:tc>
+      </w:tr>
+      <w:tr>
+        <w:tc>
+          <w:tcPr>
+            <w:tcW w:type="dxa" w:w="3173"/>
+          </w:tcPr>
+          <w:p>
+            <w:pPr>
+              <w:spacing w:after="0"/>
+            </w:pPr>
+            <w:r>
+              <w:rPr>
+                <w:rFonts w:ascii="Consolas" w:hAnsi="Consolas" w:eastAsia="微软雅黑"/>
+                <w:b w:val="0"/>
+                <w:color w:val="2D5C4A"/>
+                <w:sz w:val="17"/>
+              </w:rPr>
+              <w:t>drawn</w:t>
+            </w:r>
+            <w:r>
+              <w:rPr>
+                <w:rFonts w:ascii="Microsoft YaHei" w:hAnsi="Microsoft YaHei" w:eastAsia="微软雅黑"/>
+                <w:b w:val="0"/>
+                <w:color w:val="222222"/>
+                <w:sz w:val="19"/>
+              </w:rPr>
+              <w:t>（默认）</w:t>
+            </w:r>
+          </w:p>
+        </w:tc>
+        <w:tc>
+          <w:tcPr>
+            <w:tcW w:type="dxa" w:w="3173"/>
+          </w:tcPr>
+          <w:p>
+            <w:pPr>
+              <w:spacing w:after="0"/>
+            </w:pPr>
+            <w:r>
+              <w:rPr>
+                <w:rFonts w:ascii="Microsoft YaHei" w:hAnsi="Microsoft YaHei" w:eastAsia="微软雅黑"/>
+                <w:b w:val="0"/>
+                <w:color w:val="222222"/>
+                <w:sz w:val="19"/>
+              </w:rPr>
+              <w:t>用站内调色板排一张 1080×1920 版式底图，标题取第一条卖点</w:t>
+            </w:r>
+          </w:p>
+        </w:tc>
+        <w:tc>
+          <w:tcPr>
+            <w:tcW w:type="dxa" w:w="3173"/>
+          </w:tcPr>
+          <w:p>
+            <w:pPr>
+              <w:spacing w:after="0"/>
+            </w:pPr>
+            <w:r>
+              <w:rPr>
+                <w:rFonts w:ascii="Microsoft YaHei" w:hAnsi="Microsoft YaHei" w:eastAsia="微软雅黑"/>
+                <w:b w:val="0"/>
+                <w:color w:val="222222"/>
+                <w:sz w:val="19"/>
+              </w:rPr>
+              <w:t>无</w:t>
+            </w:r>
+          </w:p>
+        </w:tc>
+      </w:tr>
+      <w:tr>
+        <w:tc>
+          <w:tcPr>
+            <w:tcW w:type="dxa" w:w="3173"/>
+          </w:tcPr>
+          <w:p>
+            <w:pPr>
+              <w:spacing w:after="0"/>
+            </w:pPr>
+            <w:r>
+              <w:rPr>
+                <w:rFonts w:ascii="Consolas" w:hAnsi="Consolas" w:eastAsia="微软雅黑"/>
+                <w:b w:val="0"/>
+                <w:color w:val="2D5C4A"/>
+                <w:sz w:val="17"/>
+              </w:rPr>
+              <w:t>openai</w:t>
+            </w:r>
+          </w:p>
+        </w:tc>
+        <w:tc>
+          <w:tcPr>
+            <w:tcW w:type="dxa" w:w="3173"/>
+          </w:tcPr>
+          <w:p>
+            <w:pPr>
+              <w:spacing w:after="0"/>
+            </w:pPr>
+            <w:r>
+              <w:rPr>
+                <w:rFonts w:ascii="Microsoft YaHei" w:hAnsi="Microsoft YaHei" w:eastAsia="微软雅黑"/>
+                <w:b w:val="0"/>
+                <w:color w:val="222222"/>
+                <w:sz w:val="19"/>
+              </w:rPr>
+              <w:t xml:space="preserve">走 </w:t>
+            </w:r>
+            <w:r>
+              <w:rPr>
+                <w:rFonts w:ascii="Consolas" w:hAnsi="Consolas" w:eastAsia="微软雅黑"/>
+                <w:b w:val="0"/>
+                <w:color w:val="2D5C4A"/>
+                <w:sz w:val="17"/>
+              </w:rPr>
+              <w:t>/images/generations</w:t>
+            </w:r>
+            <w:r>
+              <w:rPr>
+                <w:rFonts w:ascii="Microsoft YaHei" w:hAnsi="Microsoft YaHei" w:eastAsia="微软雅黑"/>
+                <w:b w:val="0"/>
+                <w:color w:val="222222"/>
+                <w:sz w:val="19"/>
+              </w:rPr>
+              <w:t xml:space="preserve"> 的真实配图，兼容第三方中转站</w:t>
+            </w:r>
+          </w:p>
+        </w:tc>
+        <w:tc>
+          <w:tcPr>
+            <w:tcW w:type="dxa" w:w="3173"/>
+          </w:tcPr>
+          <w:p>
+            <w:pPr>
+              <w:spacing w:after="0"/>
+            </w:pPr>
+            <w:r>
+              <w:rPr>
+                <w:rFonts w:ascii="Microsoft YaHei" w:hAnsi="Microsoft YaHei" w:eastAsia="微软雅黑"/>
+                <w:b w:val="0"/>
+                <w:color w:val="222222"/>
+                <w:sz w:val="19"/>
+              </w:rPr>
+              <w:t>一个 key</w:t>
+            </w:r>
+          </w:p>
+        </w:tc>
+      </w:tr>
+      <w:tr>
+        <w:tc>
+          <w:tcPr>
+            <w:tcW w:type="dxa" w:w="3173"/>
+          </w:tcPr>
+          <w:p>
+            <w:pPr>
+              <w:spacing w:after="0"/>
+            </w:pPr>
+            <w:r>
+              <w:rPr>
+                <w:rFonts w:ascii="Consolas" w:hAnsi="Consolas" w:eastAsia="微软雅黑"/>
+                <w:b w:val="0"/>
+                <w:color w:val="2D5C4A"/>
+                <w:sz w:val="17"/>
+              </w:rPr>
+              <w:t>mock</w:t>
+            </w:r>
+          </w:p>
+        </w:tc>
+        <w:tc>
+          <w:tcPr>
+            <w:tcW w:type="dxa" w:w="3173"/>
+          </w:tcPr>
+          <w:p>
+            <w:pPr>
+              <w:spacing w:after="0"/>
+            </w:pPr>
+            <w:r>
+              <w:rPr>
+                <w:rFonts w:ascii="Microsoft YaHei" w:hAnsi="Microsoft YaHei" w:eastAsia="微软雅黑"/>
+                <w:b w:val="0"/>
+                <w:color w:val="222222"/>
+                <w:sz w:val="19"/>
+              </w:rPr>
+              <w:t>占位地址</w:t>
+            </w:r>
+          </w:p>
+        </w:tc>
+        <w:tc>
+          <w:tcPr>
+            <w:tcW w:type="dxa" w:w="3173"/>
+          </w:tcPr>
+          <w:p>
+            <w:pPr>
+              <w:spacing w:after="0"/>
+            </w:pPr>
+            <w:r>
+              <w:rPr>
+                <w:rFonts w:ascii="Microsoft YaHei" w:hAnsi="Microsoft YaHei" w:eastAsia="微软雅黑"/>
+                <w:b w:val="0"/>
+                <w:color w:val="222222"/>
+                <w:sz w:val="19"/>
+              </w:rPr>
+              <w:t>无</w:t>
+            </w:r>
+          </w:p>
+        </w:tc>
+      </w:tr>
+    </w:tbl>
+    <w:p>
+      <w:pPr>
+        <w:spacing w:after="40"/>
+      </w:pPr>
+    </w:p>
+    <w:p>
+      <w:pPr>
+        <w:spacing w:after="120"/>
+      </w:pPr>
+      <w:r>
+        <w:rPr>
+          <w:rFonts w:ascii="Microsoft YaHei" w:hAnsi="Microsoft YaHei" w:eastAsia="微软雅黑"/>
+          <w:b w:val="0"/>
+          <w:color w:val="222222"/>
+          <w:sz w:val="21"/>
+        </w:rPr>
+        <w:t>两处工程细节值得写下来：</w:t>
+      </w:r>
+    </w:p>
+    <w:p>
+      <w:pPr>
+        <w:pStyle w:val="ListBullet"/>
+        <w:spacing w:after="40"/>
+        <w:ind w:left="482"/>
+      </w:pPr>
+      <w:r>
+        <w:rPr>
+          <w:rFonts w:ascii="Microsoft YaHei" w:hAnsi="Microsoft YaHei" w:eastAsia="微软雅黑"/>
+          <w:b/>
+          <w:color w:val="222222"/>
+          <w:sz w:val="21"/>
+        </w:rPr>
+        <w:t>中转站兼容</w:t>
+      </w:r>
+      <w:r>
+        <w:rPr>
+          <w:rFonts w:ascii="Microsoft YaHei" w:hAnsi="Microsoft YaHei" w:eastAsia="微软雅黑"/>
+          <w:b w:val="0"/>
+          <w:color w:val="222222"/>
+          <w:sz w:val="21"/>
+        </w:rPr>
+        <w:t xml:space="preserve">。部分中转站返回 </w:t>
+      </w:r>
+      <w:r>
+        <w:rPr>
+          <w:rFonts w:ascii="Consolas" w:hAnsi="Consolas" w:eastAsia="微软雅黑"/>
+          <w:b w:val="0"/>
+          <w:color w:val="2D5C4A"/>
+          <w:sz w:val="19"/>
+        </w:rPr>
+        <w:t>b64_json</w:t>
+      </w:r>
+      <w:r>
+        <w:rPr>
+          <w:rFonts w:ascii="Microsoft YaHei" w:hAnsi="Microsoft YaHei" w:eastAsia="微软雅黑"/>
+          <w:b w:val="0"/>
+          <w:color w:val="222222"/>
+          <w:sz w:val="21"/>
+        </w:rPr>
+        <w:t xml:space="preserve">，部分返回 </w:t>
+      </w:r>
+      <w:r>
+        <w:rPr>
+          <w:rFonts w:ascii="Consolas" w:hAnsi="Consolas" w:eastAsia="微软雅黑"/>
+          <w:b w:val="0"/>
+          <w:color w:val="2D5C4A"/>
+          <w:sz w:val="19"/>
+        </w:rPr>
+        <w:t>url</w:t>
+      </w:r>
+      <w:r>
+        <w:rPr>
+          <w:rFonts w:ascii="Microsoft YaHei" w:hAnsi="Microsoft YaHei" w:eastAsia="微软雅黑"/>
+          <w:b w:val="0"/>
+          <w:color w:val="222222"/>
+          <w:sz w:val="21"/>
+        </w:rPr>
+        <w:t>，还有的忽略</w:t>
+      </w:r>
+    </w:p>
+    <w:p>
+      <w:pPr>
+        <w:spacing w:after="120"/>
+      </w:pPr>
+      <w:r>
+        <w:rPr>
+          <w:rFonts w:ascii="Consolas" w:hAnsi="Consolas" w:eastAsia="微软雅黑"/>
+          <w:b w:val="0"/>
+          <w:color w:val="2D5C4A"/>
+          <w:sz w:val="19"/>
+        </w:rPr>
+        <w:t>response_format</w:t>
+      </w:r>
+      <w:r>
+        <w:rPr>
+          <w:rFonts w:ascii="Microsoft YaHei" w:hAnsi="Microsoft YaHei" w:eastAsia="微软雅黑"/>
+          <w:b w:val="0"/>
+          <w:color w:val="222222"/>
+          <w:sz w:val="21"/>
+        </w:rPr>
+        <w:t xml:space="preserve">。适配器两种都收；如果是 URL，立刻下载并落到本地 </w:t>
+      </w:r>
+      <w:r>
+        <w:rPr>
+          <w:rFonts w:ascii="Consolas" w:hAnsi="Consolas" w:eastAsia="微软雅黑"/>
+          <w:b w:val="0"/>
+          <w:color w:val="2D5C4A"/>
+          <w:sz w:val="19"/>
+        </w:rPr>
+        <w:t>media/</w:t>
+      </w:r>
+      <w:r>
+        <w:rPr>
+          <w:rFonts w:ascii="Microsoft YaHei" w:hAnsi="Microsoft YaHei" w:eastAsia="微软雅黑"/>
+          <w:b w:val="0"/>
+          <w:color w:val="222222"/>
+          <w:sz w:val="21"/>
+        </w:rPr>
+        <w:t>—— 签名链接一小时后过期，直接塞给浏览器会在演示中途变成红叉。</w:t>
+      </w:r>
+    </w:p>
+    <w:p>
+      <w:pPr>
+        <w:pStyle w:val="ListBullet"/>
+        <w:spacing w:after="40"/>
+        <w:ind w:left="482"/>
+      </w:pPr>
+      <w:r>
+        <w:rPr>
+          <w:rFonts w:ascii="Microsoft YaHei" w:hAnsi="Microsoft YaHei" w:eastAsia="微软雅黑"/>
+          <w:b/>
+          <w:color w:val="222222"/>
+          <w:sz w:val="21"/>
+        </w:rPr>
+        <w:t>不假装是商品照</w:t>
+      </w:r>
+      <w:r>
+        <w:rPr>
+          <w:rFonts w:ascii="Microsoft YaHei" w:hAnsi="Microsoft YaHei" w:eastAsia="微软雅黑"/>
+          <w:b w:val="0"/>
+          <w:color w:val="222222"/>
+          <w:sz w:val="21"/>
+        </w:rPr>
+        <w:t>。</w:t>
+      </w:r>
+      <w:r>
+        <w:rPr>
+          <w:rFonts w:ascii="Consolas" w:hAnsi="Consolas" w:eastAsia="微软雅黑"/>
+          <w:b w:val="0"/>
+          <w:color w:val="2D5C4A"/>
+          <w:sz w:val="19"/>
+        </w:rPr>
+        <w:t>drawn</w:t>
+      </w:r>
+      <w:r>
+        <w:rPr>
+          <w:rFonts w:ascii="Microsoft YaHei" w:hAnsi="Microsoft YaHei" w:eastAsia="微软雅黑"/>
+          <w:b w:val="0"/>
+          <w:color w:val="222222"/>
+          <w:sz w:val="21"/>
+        </w:rPr>
+        <w:t xml:space="preserve"> 产出的是一张版式底图，UI 在图片下方明写</w:t>
+      </w:r>
+    </w:p>
+    <w:p>
+      <w:pPr>
+        <w:spacing w:after="120"/>
+      </w:pPr>
+      <w:r>
+        <w:rPr>
+          <w:rFonts w:ascii="Microsoft YaHei" w:hAnsi="Microsoft YaHei" w:eastAsia="微软雅黑"/>
+          <w:b w:val="0"/>
+          <w:color w:val="222222"/>
+          <w:sz w:val="21"/>
+        </w:rPr>
+        <w:t>"这是版式底图，不是商品实拍"。图片模型同样不知道六堡茶长什么样， 所以真实配图用于场景与氛围，不作为商品主图。</w:t>
+      </w:r>
+    </w:p>
+    <w:p>
+      <w:pPr>
+        <w:spacing w:after="120"/>
+      </w:pPr>
+      <w:r>
+        <w:rPr>
+          <w:rFonts w:ascii="Microsoft YaHei" w:hAnsi="Microsoft YaHei" w:eastAsia="微软雅黑"/>
+          <w:b w:val="0"/>
+          <w:color w:val="222222"/>
+          <w:sz w:val="21"/>
+        </w:rPr>
+        <w:t>提示词在发送前会追加一段固定约束：竖版 2:3、摄影感、画面内不要出现文字与标志—— 排版文字属于页面，不属于图片。</w:t>
+      </w:r>
+    </w:p>
+    <w:p>
+      <w:pPr>
+        <w:spacing w:after="120"/>
+      </w:pPr>
+      <w:r>
+        <w:rPr>
+          <w:rFonts w:ascii="Microsoft YaHei" w:hAnsi="Microsoft YaHei" w:eastAsia="微软雅黑"/>
+          <w:b w:val="0"/>
+          <w:color w:val="222222"/>
+          <w:sz w:val="21"/>
+        </w:rPr>
+        <w:t>---</w:t>
       </w:r>
     </w:p>
     <w:p>
@@ -3772,11 +4902,25 @@
           <w:color w:val="222222"/>
           <w:sz w:val="21"/>
         </w:rPr>
-        <w:br/>
-        <w:t>输入是"话术 + 语言"，输出是"一个可播放的视频地址"。端口里没有镜头、字幕、配色的概念，</w:t>
-        <w:br/>
-        <w:t>这些全部属于适配器的实现自由。因此同一个端口下可以并存四种完全不同的实现：</w:t>
-        <w:br/>
+        <w:t>输入是"话术 + 语言"，输出是"一个可播放的视频地址"。</w:t>
+      </w:r>
+      <w:r>
+        <w:rPr>
+          <w:rFonts w:ascii="Microsoft YaHei" w:hAnsi="Microsoft YaHei" w:eastAsia="微软雅黑"/>
+          <w:b/>
+          <w:color w:val="222222"/>
+          <w:sz w:val="21"/>
+        </w:rPr>
+        <w:t>端口里没有镜头、字幕、配色的概念</w:t>
+      </w:r>
+      <w:r>
+        <w:rPr>
+          <w:rFonts w:ascii="Microsoft YaHei" w:hAnsi="Microsoft YaHei" w:eastAsia="微软雅黑"/>
+          <w:b w:val="0"/>
+          <w:color w:val="222222"/>
+          <w:sz w:val="21"/>
+        </w:rPr>
+        <w:t>， 这些全部属于适配器的实现自由。因此同一个端口下可以并存四种完全不同的实现：</w:t>
       </w:r>
     </w:p>
     <w:tbl>
@@ -3956,7 +5100,25 @@
                 <w:color w:val="222222"/>
                 <w:sz w:val="19"/>
               </w:rPr>
-              <w:t>真人形象的口型重驱动（阿里云百炼 videoretalk）</w:t>
+              <w:t xml:space="preserve">真人形象的口型重驱动（阿里云百炼 </w:t>
+            </w:r>
+            <w:r>
+              <w:rPr>
+                <w:rFonts w:ascii="Consolas" w:hAnsi="Consolas" w:eastAsia="微软雅黑"/>
+                <w:b w:val="0"/>
+                <w:color w:val="2D5C4A"/>
+                <w:sz w:val="17"/>
+              </w:rPr>
+              <w:t>videoretalk</w:t>
+            </w:r>
+            <w:r>
+              <w:rPr>
+                <w:rFonts w:ascii="Microsoft YaHei" w:hAnsi="Microsoft YaHei" w:eastAsia="微软雅黑"/>
+                <w:b w:val="0"/>
+                <w:color w:val="222222"/>
+                <w:sz w:val="19"/>
+              </w:rPr>
+              <w:t>）</w:t>
             </w:r>
           </w:p>
         </w:tc>
@@ -4116,7 +5278,25 @@
           <w:color w:val="222222"/>
           <w:sz w:val="24"/>
         </w:rPr>
-        <w:t>4.2 默认适配器 local 的流水线</w:t>
+        <w:t xml:space="preserve">4.2 默认适配器 </w:t>
+      </w:r>
+      <w:r>
+        <w:rPr>
+          <w:rFonts w:ascii="Consolas" w:hAnsi="Consolas" w:eastAsia="微软雅黑"/>
+          <w:b/>
+          <w:color w:val="2D5C4A"/>
+          <w:sz w:val="22"/>
+        </w:rPr>
+        <w:t>local</w:t>
+      </w:r>
+      <w:r>
+        <w:rPr>
+          <w:rFonts w:ascii="Microsoft YaHei" w:hAnsi="Microsoft YaHei" w:eastAsia="微软雅黑"/>
+          <w:b/>
+          <w:color w:val="222222"/>
+          <w:sz w:val="24"/>
+        </w:rPr>
+        <w:t xml:space="preserve"> 的流水线</w:t>
       </w:r>
     </w:p>
     <w:p>
@@ -4172,17 +5352,97 @@
     </w:p>
     <w:p>
       <w:pPr>
-        <w:pStyle w:val="Heading3"/>
-        <w:spacing w:before="200" w:after="60"/>
+        <w:spacing w:after="120"/>
       </w:pPr>
       <w:r>
         <w:rPr>
           <w:rFonts w:ascii="Microsoft YaHei" w:hAnsi="Microsoft YaHei" w:eastAsia="微软雅黑"/>
           <w:b/>
           <w:color w:val="222222"/>
-          <w:sz w:val="22"/>
-        </w:rPr>
-        <w:t>② 为什么按文字系统而不是语言标签选音色</w:t>
+          <w:sz w:val="21"/>
+        </w:rPr>
+        <w:t>② 为什么按文字系统而不是语言标签选音色。</w:t>
+      </w:r>
+      <w:r>
+        <w:rPr>
+          <w:rFonts w:ascii="Microsoft YaHei" w:hAnsi="Microsoft YaHei" w:eastAsia="微软雅黑"/>
+          <w:b w:val="0"/>
+          <w:color w:val="222222"/>
+          <w:sz w:val="21"/>
+        </w:rPr>
+        <w:t xml:space="preserve"> 实测中，前端传"英语"但话术是中文时，Edge 的英文单语声线读到汉字会返回零音频， 表现为"生成失败"。修正后按</w:t>
+      </w:r>
+      <w:r>
+        <w:rPr>
+          <w:rFonts w:ascii="Microsoft YaHei" w:hAnsi="Microsoft YaHei" w:eastAsia="微软雅黑"/>
+          <w:b/>
+          <w:color w:val="222222"/>
+          <w:sz w:val="21"/>
+        </w:rPr>
+        <w:t>文字</w:t>
+      </w:r>
+      <w:r>
+        <w:rPr>
+          <w:rFonts w:ascii="Microsoft YaHei" w:hAnsi="Microsoft YaHei" w:eastAsia="微软雅黑"/>
+          <w:b w:val="0"/>
+          <w:color w:val="222222"/>
+          <w:sz w:val="21"/>
+        </w:rPr>
+        <w:t xml:space="preserve">选声线（汉字 → </w:t>
+      </w:r>
+      <w:r>
+        <w:rPr>
+          <w:rFonts w:ascii="Consolas" w:hAnsi="Consolas" w:eastAsia="微软雅黑"/>
+          <w:b w:val="0"/>
+          <w:color w:val="2D5C4A"/>
+          <w:sz w:val="19"/>
+        </w:rPr>
+        <w:t>zh-CN-XiaoxiaoNeural</w:t>
+      </w:r>
+      <w:r>
+        <w:rPr>
+          <w:rFonts w:ascii="Microsoft YaHei" w:hAnsi="Microsoft YaHei" w:eastAsia="微软雅黑"/>
+          <w:b w:val="0"/>
+          <w:color w:val="222222"/>
+          <w:sz w:val="21"/>
+        </w:rPr>
+        <w:t xml:space="preserve">， 泰文 → </w:t>
+      </w:r>
+      <w:r>
+        <w:rPr>
+          <w:rFonts w:ascii="Consolas" w:hAnsi="Consolas" w:eastAsia="微软雅黑"/>
+          <w:b w:val="0"/>
+          <w:color w:val="2D5C4A"/>
+          <w:sz w:val="19"/>
+        </w:rPr>
+        <w:t>th-TH-PremwadeeNeural</w:t>
+      </w:r>
+      <w:r>
+        <w:rPr>
+          <w:rFonts w:ascii="Microsoft YaHei" w:hAnsi="Microsoft YaHei" w:eastAsia="微软雅黑"/>
+          <w:b w:val="0"/>
+          <w:color w:val="222222"/>
+          <w:sz w:val="21"/>
+        </w:rPr>
+        <w:t xml:space="preserve">，越南文 → </w:t>
+      </w:r>
+      <w:r>
+        <w:rPr>
+          <w:rFonts w:ascii="Consolas" w:hAnsi="Consolas" w:eastAsia="微软雅黑"/>
+          <w:b w:val="0"/>
+          <w:color w:val="2D5C4A"/>
+          <w:sz w:val="19"/>
+        </w:rPr>
+        <w:t>vi-VN-HoaiMyNeural</w:t>
+      </w:r>
+      <w:r>
+        <w:rPr>
+          <w:rFonts w:ascii="Microsoft YaHei" w:hAnsi="Microsoft YaHei" w:eastAsia="微软雅黑"/>
+          <w:b w:val="0"/>
+          <w:color w:val="222222"/>
+          <w:sz w:val="21"/>
+        </w:rPr>
+        <w:t>，拉丁 → 多语声线）， 并准备有序候选列表，前一个失败自动降级到下一个。</w:t>
       </w:r>
     </w:p>
     <w:p>
@@ -4192,14 +5452,20 @@
       <w:r>
         <w:rPr>
           <w:rFonts w:ascii="Microsoft YaHei" w:hAnsi="Microsoft YaHei" w:eastAsia="微软雅黑"/>
+          <w:b/>
+          <w:color w:val="222222"/>
+          <w:sz w:val="21"/>
+        </w:rPr>
+        <w:t>⑤ 字幕折行。</w:t>
+      </w:r>
+      <w:r>
+        <w:rPr>
+          <w:rFonts w:ascii="Microsoft YaHei" w:hAnsi="Microsoft YaHei" w:eastAsia="微软雅黑"/>
           <w:b w:val="0"/>
           <w:color w:val="222222"/>
           <w:sz w:val="21"/>
         </w:rPr>
-        <w:br/>
-        <w:t>实测中，前端传"英语"但话术是中文时，Edge 的英文单语声线读到汉字会返回零音频，表现为"生成失败"。</w:t>
-        <w:br/>
-        <w:t xml:space="preserve">修正后按文字选声线（汉字 → </w:t>
+        <w:t xml:space="preserve"> 每行按 900px 实测宽度折行；中文的 </w:t>
       </w:r>
       <w:r>
         <w:rPr>
@@ -4208,7 +5474,7 @@
           <w:color w:val="2D5C4A"/>
           <w:sz w:val="19"/>
         </w:rPr>
-        <w:t>zh-CN-XiaoxiaoNeural</w:t>
+        <w:t>，。、</w:t>
       </w:r>
       <w:r>
         <w:rPr>
@@ -4217,61 +5483,7 @@
           <w:color w:val="222222"/>
           <w:sz w:val="21"/>
         </w:rPr>
-        <w:t xml:space="preserve">，泰文 → </w:t>
-      </w:r>
-      <w:r>
-        <w:rPr>
-          <w:rFonts w:ascii="Consolas" w:hAnsi="Consolas" w:eastAsia="微软雅黑"/>
-          <w:b w:val="0"/>
-          <w:color w:val="2D5C4A"/>
-          <w:sz w:val="19"/>
-        </w:rPr>
-        <w:t>th-TH-PremwadeeNeural</w:t>
-      </w:r>
-      <w:r>
-        <w:rPr>
-          <w:rFonts w:ascii="Microsoft YaHei" w:hAnsi="Microsoft YaHei" w:eastAsia="微软雅黑"/>
-          <w:b w:val="0"/>
-          <w:color w:val="222222"/>
-          <w:sz w:val="21"/>
-        </w:rPr>
-        <w:t>，</w:t>
-        <w:br/>
-        <w:t xml:space="preserve">越南文 → </w:t>
-      </w:r>
-      <w:r>
-        <w:rPr>
-          <w:rFonts w:ascii="Consolas" w:hAnsi="Consolas" w:eastAsia="微软雅黑"/>
-          <w:b w:val="0"/>
-          <w:color w:val="2D5C4A"/>
-          <w:sz w:val="19"/>
-        </w:rPr>
-        <w:t>vi-VN-HoaiMyNeural</w:t>
-      </w:r>
-      <w:r>
-        <w:rPr>
-          <w:rFonts w:ascii="Microsoft YaHei" w:hAnsi="Microsoft YaHei" w:eastAsia="微软雅黑"/>
-          <w:b w:val="0"/>
-          <w:color w:val="222222"/>
-          <w:sz w:val="21"/>
-        </w:rPr>
-        <w:t>，拉丁 → 多语声线），并准备有序候选列表，前一个失败自动降级到下一个。</w:t>
-        <w:br/>
-      </w:r>
-    </w:p>
-    <w:p>
-      <w:pPr>
-        <w:pStyle w:val="Heading3"/>
-        <w:spacing w:before="200" w:after="60"/>
-      </w:pPr>
-      <w:r>
-        <w:rPr>
-          <w:rFonts w:ascii="Microsoft YaHei" w:hAnsi="Microsoft YaHei" w:eastAsia="微软雅黑"/>
-          <w:b/>
-          <w:color w:val="222222"/>
-          <w:sz w:val="22"/>
-        </w:rPr>
-        <w:t>⑤ 字幕折行</w:t>
+        <w:t xml:space="preserve"> 不允许出现在行首 （typesetting 上的"避头点"），遇到就让它挂在上一行行尾；超过两行的字幕会在逗号处 拆成两条独立时间轴，时间按语速估算分配，末条仍精确落在原句结束点。</w:t>
       </w:r>
     </w:p>
     <w:p>
@@ -4281,12 +5493,20 @@
       <w:r>
         <w:rPr>
           <w:rFonts w:ascii="Microsoft YaHei" w:hAnsi="Microsoft YaHei" w:eastAsia="微软雅黑"/>
+          <w:b/>
+          <w:color w:val="222222"/>
+          <w:sz w:val="21"/>
+        </w:rPr>
+        <w:t>⑥ 为什么用 ASS 而不是 SRT。</w:t>
+      </w:r>
+      <w:r>
+        <w:rPr>
+          <w:rFonts w:ascii="Microsoft YaHei" w:hAnsi="Microsoft YaHei" w:eastAsia="微软雅黑"/>
           <w:b w:val="0"/>
           <w:color w:val="222222"/>
           <w:sz w:val="21"/>
         </w:rPr>
-        <w:br/>
-        <w:t xml:space="preserve">每行按 900px 实测宽度折行；中文的 </w:t>
+        <w:t xml:space="preserve"> SRT 不含分辨率信息，libass 会按默认 288 行画布换算字号， 15pt 在 1920 高的画面里会被放大成约 100px 并盖住画面。ASS 文件自带 </w:t>
       </w:r>
       <w:r>
         <w:rPr>
@@ -4295,7 +5515,7 @@
           <w:color w:val="2D5C4A"/>
           <w:sz w:val="19"/>
         </w:rPr>
-        <w:t>，。、</w:t>
+        <w:t>PlayResX/Y</w:t>
       </w:r>
       <w:r>
         <w:rPr>
@@ -4304,25 +5524,7 @@
           <w:color w:val="222222"/>
           <w:sz w:val="21"/>
         </w:rPr>
-        <w:t xml:space="preserve"> 不允许出现在行首（排版上的"避头点"），遇到就让它挂在上一行行尾；</w:t>
-        <w:br/>
-        <w:t>超过两行的字幕会在逗号处拆成两条独立时间轴，时间按语速估算分配，末条仍精确落在原句结束点。</w:t>
-        <w:br/>
-      </w:r>
-    </w:p>
-    <w:p>
-      <w:pPr>
-        <w:pStyle w:val="Heading3"/>
-        <w:spacing w:before="200" w:after="60"/>
-      </w:pPr>
-      <w:r>
-        <w:rPr>
-          <w:rFonts w:ascii="Microsoft YaHei" w:hAnsi="Microsoft YaHei" w:eastAsia="微软雅黑"/>
-          <w:b/>
-          <w:color w:val="222222"/>
-          <w:sz w:val="22"/>
-        </w:rPr>
-        <w:t>⑥ 为什么用 ASS 而不是 SRT</w:t>
+        <w:t>， 字号就是像素字号。</w:t>
       </w:r>
     </w:p>
     <w:p>
@@ -4332,23 +5534,11 @@
       <w:r>
         <w:rPr>
           <w:rFonts w:ascii="Microsoft YaHei" w:hAnsi="Microsoft YaHei" w:eastAsia="微软雅黑"/>
-          <w:b w:val="0"/>
+          <w:b/>
           <w:color w:val="222222"/>
           <w:sz w:val="21"/>
         </w:rPr>
-        <w:br/>
-        <w:t>SRT 不含分辨率信息，libass 会按默认 288 行画布换算字号，15pt 在 1920 高的画面里会被放大成约 100px 并盖住画面。</w:t>
-        <w:br/>
-        <w:t xml:space="preserve">ASS 文件自带 </w:t>
-      </w:r>
-      <w:r>
-        <w:rPr>
-          <w:rFonts w:ascii="Consolas" w:hAnsi="Consolas" w:eastAsia="微软雅黑"/>
-          <w:b w:val="0"/>
-          <w:color w:val="2D5C4A"/>
-          <w:sz w:val="19"/>
-        </w:rPr>
-        <w:t>PlayResX/Y</w:t>
+        <w:t>⑦ 三镜头。</w:t>
       </w:r>
       <w:r>
         <w:rPr>
@@ -4357,23 +5547,7 @@
           <w:color w:val="222222"/>
           <w:sz w:val="21"/>
         </w:rPr>
-        <w:t>，字号就是像素字号。</w:t>
-        <w:br/>
-      </w:r>
-    </w:p>
-    <w:p>
-      <w:pPr>
-        <w:pStyle w:val="Heading3"/>
-        <w:spacing w:before="200" w:after="60"/>
-      </w:pPr>
-      <w:r>
-        <w:rPr>
-          <w:rFonts w:ascii="Microsoft YaHei" w:hAnsi="Microsoft YaHei" w:eastAsia="微软雅黑"/>
-          <w:b/>
-          <w:color w:val="222222"/>
-          <w:sz w:val="22"/>
-        </w:rPr>
-        <w:t>⑦ 三镜头</w:t>
+        <w:t xml:space="preserve"> 开场卡（标题 + 落款印章）、中段（虚拟主播）、落款卡（品牌 + 语言）， 权重 0.34 / 0.44 / 0.22，之间 0.7 秒交叉淡化。镜头时长按旁白实测时长加权分配， 所以成片长度精确等于音频长度；旁白太短、切不出三个镜头时自动退回单镜头。</w:t>
       </w:r>
     </w:p>
     <w:p>
@@ -4383,32 +5557,38 @@
       <w:r>
         <w:rPr>
           <w:rFonts w:ascii="Microsoft YaHei" w:hAnsi="Microsoft YaHei" w:eastAsia="微软雅黑"/>
+          <w:b/>
+          <w:color w:val="222222"/>
+          <w:sz w:val="21"/>
+        </w:rPr>
+        <w:t>⑧ 虚拟主播。</w:t>
+      </w:r>
+      <w:r>
+        <w:rPr>
+          <w:rFonts w:ascii="Microsoft YaHei" w:hAnsi="Microsoft YaHei" w:eastAsia="微软雅黑"/>
           <w:b w:val="0"/>
           <w:color w:val="222222"/>
           <w:sz w:val="21"/>
         </w:rPr>
-        <w:br/>
-        <w:t>开场卡（标题 + 落款印章）、中段（虚拟主播）、落款卡（品牌 + 语言），权重 0.34 / 0.44 / 0.22，</w:t>
-        <w:br/>
-        <w:t>之间 0.7 秒交叉淡化。镜头时长按旁白实测时长加权分配，所以成片长度精确等于音频长度；</w:t>
-        <w:br/>
-        <w:t>旁白太短、切不出三个镜头时自动退回单镜头。</w:t>
-        <w:br/>
-      </w:r>
-    </w:p>
-    <w:p>
-      <w:pPr>
-        <w:pStyle w:val="Heading3"/>
-        <w:spacing w:before="200" w:after="60"/>
-      </w:pPr>
+        <w:t xml:space="preserve"> 角色用 Pillow 分层绘制（头发、身体、脸、7 档嘴型、睁眼/闭眼）， 每层只在 2 倍分辨率下渲染一次并缓存；之后每帧只贴两张小图。 嘴型档位来自配音的</w:t>
+      </w:r>
       <w:r>
         <w:rPr>
           <w:rFonts w:ascii="Microsoft YaHei" w:hAnsi="Microsoft YaHei" w:eastAsia="微软雅黑"/>
           <w:b/>
           <w:color w:val="222222"/>
-          <w:sz w:val="22"/>
-        </w:rPr>
-        <w:t>⑧ 虚拟主播</w:t>
+          <w:sz w:val="21"/>
+        </w:rPr>
+        <w:t>逐帧响度包络</w:t>
+      </w:r>
+      <w:r>
+        <w:rPr>
+          <w:rFonts w:ascii="Microsoft YaHei" w:hAnsi="Microsoft YaHei" w:eastAsia="微软雅黑"/>
+          <w:b w:val="0"/>
+          <w:color w:val="222222"/>
+          <w:sz w:val="21"/>
+        </w:rPr>
+        <w:t>（8kHz 单声道 PCM 的 RMS，按 95 分位归一化）， 停顿处自动闭嘴；眨眼 3.7 秒一周期，摆动 4.2 秒一周期。 15 秒片子约 15 秒渲完，无 GPU。</w:t>
       </w:r>
     </w:p>
     <w:p>
@@ -4418,38 +5598,12 @@
       <w:r>
         <w:rPr>
           <w:rFonts w:ascii="Microsoft YaHei" w:hAnsi="Microsoft YaHei" w:eastAsia="微软雅黑"/>
-          <w:b w:val="0"/>
+          <w:b/>
           <w:color w:val="222222"/>
           <w:sz w:val="21"/>
         </w:rPr>
-        <w:br/>
-        <w:t>角色用 Pillow 分层绘制（头发、身体、脸、7 档嘴型、睁眼/闭眼），每层只在 2 倍分辨率下渲染一次并缓存；</w:t>
-        <w:br/>
-        <w:t>之后每帧只贴两张小图。嘴型档位来自配音的逐帧响度包络（8kHz 单声道 PCM 的 RMS，按 95 分位归一化），</w:t>
-        <w:br/>
-        <w:t>停顿处自动闭嘴；眨眼 3.7 秒一周期，摆动 4.2 秒一周期。15 秒片子约 15 秒渲完，无 GPU。</w:t>
-        <w:br/>
-      </w:r>
-    </w:p>
-    <w:p>
-      <w:pPr>
-        <w:pStyle w:val="Heading3"/>
-        <w:spacing w:before="200" w:after="60"/>
-      </w:pPr>
-      <w:r>
-        <w:rPr>
-          <w:rFonts w:ascii="Microsoft YaHei" w:hAnsi="Microsoft YaHei" w:eastAsia="微软雅黑"/>
-          <w:b/>
-          <w:color w:val="222222"/>
-          <w:sz w:val="22"/>
-        </w:rPr>
-        <w:t>⑨ 合成</w:t>
-      </w:r>
-    </w:p>
-    <w:p>
-      <w:pPr>
-        <w:spacing w:after="120"/>
-      </w:pPr>
+        <w:t>⑨ 合成。</w:t>
+      </w:r>
       <w:r>
         <w:rPr>
           <w:rFonts w:ascii="Microsoft YaHei" w:hAnsi="Microsoft YaHei" w:eastAsia="微软雅黑"/>
@@ -4457,8 +5611,7 @@
           <w:color w:val="222222"/>
           <w:sz w:val="21"/>
         </w:rPr>
-        <w:br/>
-        <w:t xml:space="preserve">每张静帧先做 1.08 倍缓推（先放大到 1620×2880 再 zoompan，避免软化），再用 </w:t>
+        <w:t xml:space="preserve"> 每张静帧先做 1.08 倍缓推（先放大到 1620×2880 再 zoompan，避免软化）， 再用 </w:t>
       </w:r>
       <w:r>
         <w:rPr>
@@ -4476,10 +5629,7 @@
           <w:color w:val="222222"/>
           <w:sz w:val="21"/>
         </w:rPr>
-        <w:t xml:space="preserve"> 交叉淡化，</w:t>
-        <w:br/>
-        <w:t>最后叠字幕。字幕在最后一环，所以永远不会被缩放模糊。</w:t>
-        <w:br/>
+        <w:t xml:space="preserve"> 交叉淡化，最后叠字幕。字幕在最后一环，所以永远不会被缩放模糊。</w:t>
       </w:r>
     </w:p>
     <w:p>
@@ -4495,6 +5645,20 @@
           <w:sz w:val="24"/>
         </w:rPr>
         <w:t>4.3 内容寻址缓存</w:t>
+      </w:r>
+    </w:p>
+    <w:p>
+      <w:pPr>
+        <w:spacing w:after="120"/>
+      </w:pPr>
+      <w:r>
+        <w:rPr>
+          <w:rFonts w:ascii="Microsoft YaHei" w:hAnsi="Microsoft YaHei" w:eastAsia="微软雅黑"/>
+          <w:b w:val="0"/>
+          <w:color w:val="222222"/>
+          <w:sz w:val="21"/>
+        </w:rPr>
+        <w:t>输出文件名由内容指纹决定：</w:t>
       </w:r>
     </w:p>
     <w:p>
@@ -4527,11 +5691,7 @@
           <w:color w:val="222222"/>
           <w:sz w:val="21"/>
         </w:rPr>
-        <w:br/>
-        <w:t>同一段话术重复请求直接命中已有 MP4；换一张人像、换一段虚拟主播素材、升级渲染器版本，指纹都会变，自动重出。</w:t>
-        <w:br/>
-        <w:t>缓存不引入数据库，天然幂等。</w:t>
-        <w:br/>
+        <w:t>同一段话术重复请求直接命中已有 MP4；换一张人像、换一段虚拟主播素材、升级渲染器版本， 指纹都会变，自动重出。缓存不引入数据库，天然幂等。</w:t>
       </w:r>
     </w:p>
     <w:p>
@@ -4546,7 +5706,16 @@
           <w:color w:val="222222"/>
           <w:sz w:val="24"/>
         </w:rPr>
-        <w:t>4.4 真人形象适配器：阿里云 videoretalk</w:t>
+        <w:t xml:space="preserve">4.4 真人形象适配器：阿里云 </w:t>
+      </w:r>
+      <w:r>
+        <w:rPr>
+          <w:rFonts w:ascii="Consolas" w:hAnsi="Consolas" w:eastAsia="微软雅黑"/>
+          <w:b/>
+          <w:color w:val="2D5C4A"/>
+          <w:sz w:val="22"/>
+        </w:rPr>
+        <w:t>videoretalk</w:t>
       </w:r>
     </w:p>
     <w:p>
@@ -4644,7 +5813,30 @@
           <w:color w:val="222222"/>
           <w:sz w:val="21"/>
         </w:rPr>
-        <w:t xml:space="preserve"> 地址——不需要自建公网服务器；</w:t>
+        <w:t xml:space="preserve"> 地址——</w:t>
+      </w:r>
+    </w:p>
+    <w:p>
+      <w:pPr>
+        <w:spacing w:after="120"/>
+      </w:pPr>
+      <w:r>
+        <w:rPr>
+          <w:rFonts w:ascii="Microsoft YaHei" w:hAnsi="Microsoft YaHei" w:eastAsia="微软雅黑"/>
+          <w:b/>
+          <w:color w:val="222222"/>
+          <w:sz w:val="21"/>
+        </w:rPr>
+        <w:t>不需要自建公网服务器</w:t>
+      </w:r>
+      <w:r>
+        <w:rPr>
+          <w:rFonts w:ascii="Microsoft YaHei" w:hAnsi="Microsoft YaHei" w:eastAsia="微软雅黑"/>
+          <w:b w:val="0"/>
+          <w:color w:val="222222"/>
+          <w:sz w:val="21"/>
+        </w:rPr>
+        <w:t>；</w:t>
       </w:r>
     </w:p>
     <w:p>
@@ -4659,7 +5851,7 @@
           <w:color w:val="222222"/>
           <w:sz w:val="21"/>
         </w:rPr>
-        <w:t xml:space="preserve">3.  </w:t>
+        <w:t xml:space="preserve">1.  </w:t>
       </w:r>
       <w:r>
         <w:rPr>
@@ -4686,7 +5878,30 @@
           <w:color w:val="222222"/>
           <w:sz w:val="21"/>
         </w:rPr>
-        <w:t>）并轮询，状态机 PENDING/RUNNING → SUCCEEDED | FAILED/CANCELED/UNKNOWN；</w:t>
+        <w:t>）并轮询，状态机</w:t>
+      </w:r>
+    </w:p>
+    <w:p>
+      <w:pPr>
+        <w:spacing w:after="120"/>
+      </w:pPr>
+      <w:r>
+        <w:rPr>
+          <w:rFonts w:ascii="Consolas" w:hAnsi="Consolas" w:eastAsia="微软雅黑"/>
+          <w:b w:val="0"/>
+          <w:color w:val="2D5C4A"/>
+          <w:sz w:val="19"/>
+        </w:rPr>
+        <w:t>PENDING/RUNNING → SUCCEEDED | FAILED/CANCELED/UNKNOWN</w:t>
+      </w:r>
+      <w:r>
+        <w:rPr>
+          <w:rFonts w:ascii="Microsoft YaHei" w:hAnsi="Microsoft YaHei" w:eastAsia="微软雅黑"/>
+          <w:b w:val="0"/>
+          <w:color w:val="222222"/>
+          <w:sz w:val="21"/>
+        </w:rPr>
+        <w:t>；</w:t>
       </w:r>
     </w:p>
     <w:p>
@@ -4701,7 +5916,7 @@
           <w:color w:val="222222"/>
           <w:sz w:val="21"/>
         </w:rPr>
-        <w:t xml:space="preserve">4.  </w:t>
+        <w:t xml:space="preserve">1.  </w:t>
       </w:r>
       <w:r>
         <w:rPr>
@@ -4742,11 +5957,25 @@
           <w:color w:val="222222"/>
           <w:sz w:val="21"/>
         </w:rPr>
-        <w:br/>
-        <w:t>选择它的理由：这是唯一一个个人实名、人民币结算、中国大陆直连、无需 GPU 就能开通的真人数字人服务。</w:t>
-        <w:br/>
-        <w:t>代价是必须提供一段本人的正脸视频作为形象资产。</w:t>
-        <w:br/>
+        <w:t>选择它的理由：这是唯一一个</w:t>
+      </w:r>
+      <w:r>
+        <w:rPr>
+          <w:rFonts w:ascii="Microsoft YaHei" w:hAnsi="Microsoft YaHei" w:eastAsia="微软雅黑"/>
+          <w:b/>
+          <w:color w:val="222222"/>
+          <w:sz w:val="21"/>
+        </w:rPr>
+        <w:t>个人实名、人民币结算、中国大陆直连、无需 GPU</w:t>
+      </w:r>
+      <w:r>
+        <w:rPr>
+          <w:rFonts w:ascii="Microsoft YaHei" w:hAnsi="Microsoft YaHei" w:eastAsia="微软雅黑"/>
+          <w:b w:val="0"/>
+          <w:color w:val="222222"/>
+          <w:sz w:val="21"/>
+        </w:rPr>
+        <w:t>就能开通的 真人数字人服务。代价是必须提供一段本人的正脸视频作为形象资产。</w:t>
       </w:r>
     </w:p>
     <w:p>
@@ -5035,6 +6264,20 @@
     </w:p>
     <w:p>
       <w:pPr>
+        <w:spacing w:after="120"/>
+      </w:pPr>
+      <w:r>
+        <w:rPr>
+          <w:rFonts w:ascii="Microsoft YaHei" w:hAnsi="Microsoft YaHei" w:eastAsia="微软雅黑"/>
+          <w:b w:val="0"/>
+          <w:color w:val="222222"/>
+          <w:sz w:val="21"/>
+        </w:rPr>
+        <w:t>---</w:t>
+      </w:r>
+    </w:p>
+    <w:p>
+      <w:pPr>
         <w:pStyle w:val="Heading1"/>
         <w:spacing w:before="360" w:after="120"/>
       </w:pPr>
@@ -5162,7 +6405,6 @@
           <w:color w:val="222222"/>
           <w:sz w:val="21"/>
         </w:rPr>
-        <w:br/>
         <w:t xml:space="preserve">FastAPI 的 OpenAPI 是唯一真源，前端 TypeScript 类型由 </w:t>
       </w:r>
       <w:r>
@@ -5181,10 +6423,25 @@
           <w:color w:val="222222"/>
           <w:sz w:val="21"/>
         </w:rPr>
-        <w:t xml:space="preserve"> 生成，</w:t>
-        <w:br/>
-        <w:t>CI 里有一道 drift 检查：手改生成文件或忘记重新生成，构建直接失败。</w:t>
-        <w:br/>
+        <w:t xml:space="preserve"> 生成， CI 里有一道 </w:t>
+      </w:r>
+      <w:r>
+        <w:rPr>
+          <w:rFonts w:ascii="Microsoft YaHei" w:hAnsi="Microsoft YaHei" w:eastAsia="微软雅黑"/>
+          <w:b/>
+          <w:color w:val="222222"/>
+          <w:sz w:val="21"/>
+        </w:rPr>
+        <w:t>drift 检查</w:t>
+      </w:r>
+      <w:r>
+        <w:rPr>
+          <w:rFonts w:ascii="Microsoft YaHei" w:hAnsi="Microsoft YaHei" w:eastAsia="微软雅黑"/>
+          <w:b w:val="0"/>
+          <w:color w:val="222222"/>
+          <w:sz w:val="21"/>
+        </w:rPr>
+        <w:t>：手改生成文件或忘记重新生成，构建直接失败。</w:t>
       </w:r>
     </w:p>
     <w:p>
@@ -5311,7 +6568,7 @@
                 <w:color w:val="222222"/>
                 <w:sz w:val="19"/>
               </w:rPr>
-              <w:t>589</w:t>
+              <w:t>598</w:t>
             </w:r>
           </w:p>
         </w:tc>
@@ -5429,7 +6686,7 @@
                 <w:color w:val="222222"/>
                 <w:sz w:val="19"/>
               </w:rPr>
-              <w:t>83</w:t>
+              <w:t>91</w:t>
             </w:r>
           </w:p>
         </w:tc>
@@ -5547,7 +6804,7 @@
                 <w:color w:val="222222"/>
                 <w:sz w:val="19"/>
               </w:rPr>
-              <w:t>54</w:t>
+              <w:t>59</w:t>
             </w:r>
           </w:p>
         </w:tc>
@@ -5606,7 +6863,7 @@
                 <w:color w:val="222222"/>
                 <w:sz w:val="19"/>
               </w:rPr>
-              <w:t>776</w:t>
+              <w:t>798</w:t>
             </w:r>
           </w:p>
         </w:tc>
@@ -5647,7 +6904,6 @@
           <w:color w:val="222222"/>
           <w:sz w:val="21"/>
         </w:rPr>
-        <w:br/>
         <w:t xml:space="preserve">外网调用一律用 </w:t>
       </w:r>
       <w:r>
@@ -5666,9 +6922,7 @@
           <w:color w:val="222222"/>
           <w:sz w:val="21"/>
         </w:rPr>
-        <w:t xml:space="preserve"> 拦截；语音合成在测试里用 ffmpeg 生成静音音频替代，</w:t>
-        <w:br/>
-        <w:t xml:space="preserve">所以 </w:t>
+        <w:t xml:space="preserve"> 拦截；语音合成在测试里用 ffmpeg 生成静音音频替代， 所以 </w:t>
       </w:r>
       <w:r>
         <w:rPr>
@@ -5687,7 +6941,6 @@
           <w:sz w:val="21"/>
         </w:rPr>
         <w:t xml:space="preserve"> 断网也能全绿。</w:t>
-        <w:br/>
       </w:r>
     </w:p>
     <w:p>
@@ -5725,10 +6978,21 @@
           <w:color w:val="222222"/>
           <w:sz w:val="21"/>
         </w:rPr>
-        <w:t xml:space="preserve"> 把"domain 不许依赖 framework、application 不许依赖基础设施"写成契约，违反即 CI 失败。</w:t>
-        <w:br/>
-        <w:t>这不是文档里的约定，是构建期强制。</w:t>
-        <w:br/>
+        <w:t xml:space="preserve"> 把"domain 不许依赖 framework、application 不许依赖基础设施"写成契约， 违反即 CI 失败。这不是文档里的约定，是构建期强制。</w:t>
+      </w:r>
+    </w:p>
+    <w:p>
+      <w:pPr>
+        <w:spacing w:after="120"/>
+      </w:pPr>
+      <w:r>
+        <w:rPr>
+          <w:rFonts w:ascii="Microsoft YaHei" w:hAnsi="Microsoft YaHei" w:eastAsia="微软雅黑"/>
+          <w:b w:val="0"/>
+          <w:color w:val="222222"/>
+          <w:sz w:val="21"/>
+        </w:rPr>
+        <w:t>---</w:t>
       </w:r>
     </w:p>
     <w:p>
@@ -5757,22 +7021,30 @@
           <w:color w:val="222222"/>
           <w:sz w:val="21"/>
         </w:rPr>
-        <w:t>需要说清楚这套系统的自主性在哪里、不在哪里。</w:t>
+        <w:t>需要说清楚这套系统的自主性在哪里、不在哪里：</w:t>
       </w:r>
     </w:p>
     <w:p>
       <w:pPr>
-        <w:pStyle w:val="Heading2"/>
-        <w:spacing w:before="240" w:after="80"/>
+        <w:spacing w:after="120"/>
       </w:pPr>
       <w:r>
         <w:rPr>
           <w:rFonts w:ascii="Microsoft YaHei" w:hAnsi="Microsoft YaHei" w:eastAsia="微软雅黑"/>
           <w:b/>
           <w:color w:val="222222"/>
-          <w:sz w:val="24"/>
+          <w:sz w:val="21"/>
         </w:rPr>
         <w:t>有的</w:t>
+      </w:r>
+      <w:r>
+        <w:rPr>
+          <w:rFonts w:ascii="Microsoft YaHei" w:hAnsi="Microsoft YaHei" w:eastAsia="微软雅黑"/>
+          <w:b w:val="0"/>
+          <w:color w:val="222222"/>
+          <w:sz w:val="21"/>
+        </w:rPr>
+        <w:t>：</w:t>
       </w:r>
     </w:p>
     <w:p>
@@ -5825,17 +7097,25 @@
     </w:p>
     <w:p>
       <w:pPr>
-        <w:pStyle w:val="Heading2"/>
-        <w:spacing w:before="240" w:after="80"/>
+        <w:spacing w:after="120"/>
       </w:pPr>
       <w:r>
         <w:rPr>
           <w:rFonts w:ascii="Microsoft YaHei" w:hAnsi="Microsoft YaHei" w:eastAsia="微软雅黑"/>
           <w:b/>
           <w:color w:val="222222"/>
-          <w:sz w:val="24"/>
+          <w:sz w:val="21"/>
         </w:rPr>
         <w:t>没有的</w:t>
+      </w:r>
+      <w:r>
+        <w:rPr>
+          <w:rFonts w:ascii="Microsoft YaHei" w:hAnsi="Microsoft YaHei" w:eastAsia="微软雅黑"/>
+          <w:b w:val="0"/>
+          <w:color w:val="222222"/>
+          <w:sz w:val="21"/>
+        </w:rPr>
+        <w:t>：</w:t>
       </w:r>
     </w:p>
     <w:p>
@@ -5888,21 +7168,48 @@
     </w:p>
     <w:p>
       <w:pPr>
-        <w:spacing w:after="80"/>
-        <w:ind w:left="283"/>
-        <w:shd w:val="clear" w:color="auto" w:fill="FBF6F1"/>
-        <w:pBdr>
-          <w:left w:val="single" w:sz="12" w:space="8" w:color="C46C4A"/>
-        </w:pBdr>
+        <w:spacing w:after="120"/>
       </w:pPr>
       <w:r>
         <w:rPr>
           <w:rFonts w:ascii="Microsoft YaHei" w:hAnsi="Microsoft YaHei" w:eastAsia="微软雅黑"/>
           <w:b w:val="0"/>
-          <w:color w:val="4A3A30"/>
-          <w:sz w:val="20"/>
-        </w:rPr>
-        <w:t>也就是说，这是三条编排严格的单次调用流水线，不是自主智能体。参赛材料里如果被问到"这是不是 agent"，建议按上面这两栏回答——把工程确定性说成自主性，在答辩时是减分项。</w:t>
+          <w:color w:val="222222"/>
+          <w:sz w:val="21"/>
+        </w:rPr>
+        <w:t>也就是说，这是三条</w:t>
+      </w:r>
+      <w:r>
+        <w:rPr>
+          <w:rFonts w:ascii="Microsoft YaHei" w:hAnsi="Microsoft YaHei" w:eastAsia="微软雅黑"/>
+          <w:b/>
+          <w:color w:val="222222"/>
+          <w:sz w:val="21"/>
+        </w:rPr>
+        <w:t>编排严格的单次调用流水线</w:t>
+      </w:r>
+      <w:r>
+        <w:rPr>
+          <w:rFonts w:ascii="Microsoft YaHei" w:hAnsi="Microsoft YaHei" w:eastAsia="微软雅黑"/>
+          <w:b w:val="0"/>
+          <w:color w:val="222222"/>
+          <w:sz w:val="21"/>
+        </w:rPr>
+        <w:t>，不是自主智能体。 参赛材料里如果被问到"这是不是 agent"，建议按上面这两栏回答—— 把工程确定性说成自主性，在答辩时是减分项。</w:t>
+      </w:r>
+    </w:p>
+    <w:p>
+      <w:pPr>
+        <w:spacing w:after="120"/>
+      </w:pPr>
+      <w:r>
+        <w:rPr>
+          <w:rFonts w:ascii="Microsoft YaHei" w:hAnsi="Microsoft YaHei" w:eastAsia="微软雅黑"/>
+          <w:b w:val="0"/>
+          <w:color w:val="222222"/>
+          <w:sz w:val="21"/>
+        </w:rPr>
+        <w:t>---</w:t>
       </w:r>
     </w:p>
     <w:p>
@@ -5932,7 +7239,25 @@
           <w:color w:val="222222"/>
           <w:sz w:val="24"/>
         </w:rPr>
-        <w:t>7.1 关键配置（前缀 LIULIANGCHUHAI_）</w:t>
+        <w:t xml:space="preserve">7.1 关键配置（前缀 </w:t>
+      </w:r>
+      <w:r>
+        <w:rPr>
+          <w:rFonts w:ascii="Consolas" w:hAnsi="Consolas" w:eastAsia="微软雅黑"/>
+          <w:b/>
+          <w:color w:val="2D5C4A"/>
+          <w:sz w:val="22"/>
+        </w:rPr>
+        <w:t>LIULIANGCHUHAI_</w:t>
+      </w:r>
+      <w:r>
+        <w:rPr>
+          <w:rFonts w:ascii="Microsoft YaHei" w:hAnsi="Microsoft YaHei" w:eastAsia="微软雅黑"/>
+          <w:b/>
+          <w:color w:val="222222"/>
+          <w:sz w:val="24"/>
+        </w:rPr>
+        <w:t>）</w:t>
       </w:r>
     </w:p>
     <w:tbl>
@@ -6039,10 +7364,10 @@
             </w:pPr>
             <w:r>
               <w:rPr>
-                <w:rFonts w:ascii="Microsoft YaHei" w:hAnsi="Microsoft YaHei" w:eastAsia="微软雅黑"/>
+                <w:rFonts w:ascii="Consolas" w:hAnsi="Consolas" w:eastAsia="微软雅黑"/>
                 <w:b w:val="0"/>
-                <w:color w:val="222222"/>
-                <w:sz w:val="19"/>
+                <w:color w:val="2D5C4A"/>
+                <w:sz w:val="17"/>
               </w:rPr>
               <w:t>mock</w:t>
             </w:r>
@@ -6058,12 +7383,30 @@
             </w:pPr>
             <w:r>
               <w:rPr>
+                <w:rFonts w:ascii="Consolas" w:hAnsi="Consolas" w:eastAsia="微软雅黑"/>
+                <w:b w:val="0"/>
+                <w:color w:val="2D5C4A"/>
+                <w:sz w:val="17"/>
+              </w:rPr>
+              <w:t>mock</w:t>
+            </w:r>
+            <w:r>
+              <w:rPr>
                 <w:rFonts w:ascii="Microsoft YaHei" w:hAnsi="Microsoft YaHei" w:eastAsia="微软雅黑"/>
                 <w:b w:val="0"/>
                 <w:color w:val="222222"/>
                 <w:sz w:val="19"/>
               </w:rPr>
-              <w:t>mock / deepseek</w:t>
+              <w:t xml:space="preserve"> / </w:t>
+            </w:r>
+            <w:r>
+              <w:rPr>
+                <w:rFonts w:ascii="Consolas" w:hAnsi="Consolas" w:eastAsia="微软雅黑"/>
+                <w:b w:val="0"/>
+                <w:color w:val="2D5C4A"/>
+                <w:sz w:val="17"/>
+              </w:rPr>
+              <w:t>deepseek</w:t>
             </w:r>
           </w:p>
         </w:tc>
@@ -6098,10 +7441,10 @@
             </w:pPr>
             <w:r>
               <w:rPr>
-                <w:rFonts w:ascii="Microsoft YaHei" w:hAnsi="Microsoft YaHei" w:eastAsia="微软雅黑"/>
+                <w:rFonts w:ascii="Consolas" w:hAnsi="Consolas" w:eastAsia="微软雅黑"/>
                 <w:b w:val="0"/>
-                <w:color w:val="222222"/>
-                <w:sz w:val="19"/>
+                <w:color w:val="2D5C4A"/>
+                <w:sz w:val="17"/>
               </w:rPr>
               <w:t>deepseek-v4-flash</w:t>
             </w:r>
@@ -6157,10 +7500,10 @@
             </w:pPr>
             <w:r>
               <w:rPr>
-                <w:rFonts w:ascii="Microsoft YaHei" w:hAnsi="Microsoft YaHei" w:eastAsia="微软雅黑"/>
+                <w:rFonts w:ascii="Consolas" w:hAnsi="Consolas" w:eastAsia="微软雅黑"/>
                 <w:b w:val="0"/>
-                <w:color w:val="222222"/>
-                <w:sz w:val="19"/>
+                <w:color w:val="2D5C4A"/>
+                <w:sz w:val="17"/>
               </w:rPr>
               <w:t>20</w:t>
             </w:r>
@@ -6216,10 +7559,10 @@
             </w:pPr>
             <w:r>
               <w:rPr>
-                <w:rFonts w:ascii="Microsoft YaHei" w:hAnsi="Microsoft YaHei" w:eastAsia="微软雅黑"/>
+                <w:rFonts w:ascii="Consolas" w:hAnsi="Consolas" w:eastAsia="微软雅黑"/>
                 <w:b w:val="0"/>
-                <w:color w:val="222222"/>
-                <w:sz w:val="19"/>
+                <w:color w:val="2D5C4A"/>
+                <w:sz w:val="17"/>
               </w:rPr>
               <w:t>60</w:t>
             </w:r>
@@ -6275,10 +7618,10 @@
             </w:pPr>
             <w:r>
               <w:rPr>
-                <w:rFonts w:ascii="Microsoft YaHei" w:hAnsi="Microsoft YaHei" w:eastAsia="微软雅黑"/>
+                <w:rFonts w:ascii="Consolas" w:hAnsi="Consolas" w:eastAsia="微软雅黑"/>
                 <w:b w:val="0"/>
-                <w:color w:val="222222"/>
-                <w:sz w:val="19"/>
+                <w:color w:val="2D5C4A"/>
+                <w:sz w:val="17"/>
               </w:rPr>
               <w:t>mock</w:t>
             </w:r>
@@ -6334,10 +7677,10 @@
             </w:pPr>
             <w:r>
               <w:rPr>
-                <w:rFonts w:ascii="Microsoft YaHei" w:hAnsi="Microsoft YaHei" w:eastAsia="微软雅黑"/>
+                <w:rFonts w:ascii="Consolas" w:hAnsi="Consolas" w:eastAsia="微软雅黑"/>
                 <w:b w:val="0"/>
-                <w:color w:val="222222"/>
-                <w:sz w:val="19"/>
+                <w:color w:val="2D5C4A"/>
+                <w:sz w:val="17"/>
               </w:rPr>
               <w:t>mock</w:t>
             </w:r>
@@ -6353,12 +7696,66 @@
             </w:pPr>
             <w:r>
               <w:rPr>
+                <w:rFonts w:ascii="Consolas" w:hAnsi="Consolas" w:eastAsia="微软雅黑"/>
+                <w:b w:val="0"/>
+                <w:color w:val="2D5C4A"/>
+                <w:sz w:val="17"/>
+              </w:rPr>
+              <w:t>mock</w:t>
+            </w:r>
+            <w:r>
+              <w:rPr>
                 <w:rFonts w:ascii="Microsoft YaHei" w:hAnsi="Microsoft YaHei" w:eastAsia="微软雅黑"/>
                 <w:b w:val="0"/>
                 <w:color w:val="222222"/>
                 <w:sz w:val="19"/>
               </w:rPr>
-              <w:t>mock / local / dashscope / heygen</w:t>
+              <w:t xml:space="preserve"> / </w:t>
+            </w:r>
+            <w:r>
+              <w:rPr>
+                <w:rFonts w:ascii="Consolas" w:hAnsi="Consolas" w:eastAsia="微软雅黑"/>
+                <w:b w:val="0"/>
+                <w:color w:val="2D5C4A"/>
+                <w:sz w:val="17"/>
+              </w:rPr>
+              <w:t>local</w:t>
+            </w:r>
+            <w:r>
+              <w:rPr>
+                <w:rFonts w:ascii="Microsoft YaHei" w:hAnsi="Microsoft YaHei" w:eastAsia="微软雅黑"/>
+                <w:b w:val="0"/>
+                <w:color w:val="222222"/>
+                <w:sz w:val="19"/>
+              </w:rPr>
+              <w:t xml:space="preserve"> / </w:t>
+            </w:r>
+            <w:r>
+              <w:rPr>
+                <w:rFonts w:ascii="Consolas" w:hAnsi="Consolas" w:eastAsia="微软雅黑"/>
+                <w:b w:val="0"/>
+                <w:color w:val="2D5C4A"/>
+                <w:sz w:val="17"/>
+              </w:rPr>
+              <w:t>dashscope</w:t>
+            </w:r>
+            <w:r>
+              <w:rPr>
+                <w:rFonts w:ascii="Microsoft YaHei" w:hAnsi="Microsoft YaHei" w:eastAsia="微软雅黑"/>
+                <w:b w:val="0"/>
+                <w:color w:val="222222"/>
+                <w:sz w:val="19"/>
+              </w:rPr>
+              <w:t xml:space="preserve"> / </w:t>
+            </w:r>
+            <w:r>
+              <w:rPr>
+                <w:rFonts w:ascii="Consolas" w:hAnsi="Consolas" w:eastAsia="微软雅黑"/>
+                <w:b w:val="0"/>
+                <w:color w:val="2D5C4A"/>
+                <w:sz w:val="17"/>
+              </w:rPr>
+              <w:t>heygen</w:t>
             </w:r>
           </w:p>
         </w:tc>
@@ -6393,10 +7790,10 @@
             </w:pPr>
             <w:r>
               <w:rPr>
-                <w:rFonts w:ascii="Microsoft YaHei" w:hAnsi="Microsoft YaHei" w:eastAsia="微软雅黑"/>
+                <w:rFonts w:ascii="Consolas" w:hAnsi="Consolas" w:eastAsia="微软雅黑"/>
                 <w:b w:val="0"/>
-                <w:color w:val="222222"/>
-                <w:sz w:val="19"/>
+                <w:color w:val="2D5C4A"/>
+                <w:sz w:val="17"/>
               </w:rPr>
               <w:t>300</w:t>
             </w:r>
@@ -6418,6 +7815,337 @@
                 <w:sz w:val="19"/>
               </w:rPr>
               <w:t>渲染截止时间</w:t>
+            </w:r>
+          </w:p>
+        </w:tc>
+      </w:tr>
+      <w:tr>
+        <w:tc>
+          <w:tcPr>
+            <w:tcW w:type="dxa" w:w="3173"/>
+          </w:tcPr>
+          <w:p>
+            <w:pPr>
+              <w:spacing w:after="0"/>
+            </w:pPr>
+            <w:r>
+              <w:rPr>
+                <w:rFonts w:ascii="Consolas" w:hAnsi="Consolas" w:eastAsia="微软雅黑"/>
+                <w:b w:val="0"/>
+                <w:color w:val="2D5C4A"/>
+                <w:sz w:val="17"/>
+              </w:rPr>
+              <w:t>IMAGE_PROVIDER</w:t>
+            </w:r>
+          </w:p>
+        </w:tc>
+        <w:tc>
+          <w:tcPr>
+            <w:tcW w:type="dxa" w:w="3173"/>
+          </w:tcPr>
+          <w:p>
+            <w:pPr>
+              <w:spacing w:after="0"/>
+            </w:pPr>
+            <w:r>
+              <w:rPr>
+                <w:rFonts w:ascii="Consolas" w:hAnsi="Consolas" w:eastAsia="微软雅黑"/>
+                <w:b w:val="0"/>
+                <w:color w:val="2D5C4A"/>
+                <w:sz w:val="17"/>
+              </w:rPr>
+              <w:t>drawn</w:t>
+            </w:r>
+          </w:p>
+        </w:tc>
+        <w:tc>
+          <w:tcPr>
+            <w:tcW w:type="dxa" w:w="3173"/>
+          </w:tcPr>
+          <w:p>
+            <w:pPr>
+              <w:spacing w:after="0"/>
+            </w:pPr>
+            <w:r>
+              <w:rPr>
+                <w:rFonts w:ascii="Consolas" w:hAnsi="Consolas" w:eastAsia="微软雅黑"/>
+                <w:b w:val="0"/>
+                <w:color w:val="2D5C4A"/>
+                <w:sz w:val="17"/>
+              </w:rPr>
+              <w:t>drawn</w:t>
+            </w:r>
+            <w:r>
+              <w:rPr>
+                <w:rFonts w:ascii="Microsoft YaHei" w:hAnsi="Microsoft YaHei" w:eastAsia="微软雅黑"/>
+                <w:b w:val="0"/>
+                <w:color w:val="222222"/>
+                <w:sz w:val="19"/>
+              </w:rPr>
+              <w:t xml:space="preserve"> / </w:t>
+            </w:r>
+            <w:r>
+              <w:rPr>
+                <w:rFonts w:ascii="Consolas" w:hAnsi="Consolas" w:eastAsia="微软雅黑"/>
+                <w:b w:val="0"/>
+                <w:color w:val="2D5C4A"/>
+                <w:sz w:val="17"/>
+              </w:rPr>
+              <w:t>openai</w:t>
+            </w:r>
+            <w:r>
+              <w:rPr>
+                <w:rFonts w:ascii="Microsoft YaHei" w:hAnsi="Microsoft YaHei" w:eastAsia="微软雅黑"/>
+                <w:b w:val="0"/>
+                <w:color w:val="222222"/>
+                <w:sz w:val="19"/>
+              </w:rPr>
+              <w:t xml:space="preserve"> / </w:t>
+            </w:r>
+            <w:r>
+              <w:rPr>
+                <w:rFonts w:ascii="Consolas" w:hAnsi="Consolas" w:eastAsia="微软雅黑"/>
+                <w:b w:val="0"/>
+                <w:color w:val="2D5C4A"/>
+                <w:sz w:val="17"/>
+              </w:rPr>
+              <w:t>mock</w:t>
+            </w:r>
+          </w:p>
+        </w:tc>
+      </w:tr>
+      <w:tr>
+        <w:tc>
+          <w:tcPr>
+            <w:tcW w:type="dxa" w:w="3173"/>
+          </w:tcPr>
+          <w:p>
+            <w:pPr>
+              <w:spacing w:after="0"/>
+            </w:pPr>
+            <w:r>
+              <w:rPr>
+                <w:rFonts w:ascii="Consolas" w:hAnsi="Consolas" w:eastAsia="微软雅黑"/>
+                <w:b w:val="0"/>
+                <w:color w:val="2D5C4A"/>
+                <w:sz w:val="17"/>
+              </w:rPr>
+              <w:t>IMAGE_BASE_URL</w:t>
+            </w:r>
+          </w:p>
+        </w:tc>
+        <w:tc>
+          <w:tcPr>
+            <w:tcW w:type="dxa" w:w="3173"/>
+          </w:tcPr>
+          <w:p>
+            <w:pPr>
+              <w:spacing w:after="0"/>
+            </w:pPr>
+            <w:r>
+              <w:rPr>
+                <w:rFonts w:ascii="Consolas" w:hAnsi="Consolas" w:eastAsia="微软雅黑"/>
+                <w:b w:val="0"/>
+                <w:color w:val="2D5C4A"/>
+                <w:sz w:val="17"/>
+              </w:rPr>
+              <w:t>https://api.openai.com/v1</w:t>
+            </w:r>
+          </w:p>
+        </w:tc>
+        <w:tc>
+          <w:tcPr>
+            <w:tcW w:type="dxa" w:w="3173"/>
+          </w:tcPr>
+          <w:p>
+            <w:pPr>
+              <w:spacing w:after="0"/>
+            </w:pPr>
+            <w:r>
+              <w:rPr>
+                <w:rFonts w:ascii="Microsoft YaHei" w:hAnsi="Microsoft YaHei" w:eastAsia="微软雅黑"/>
+                <w:b w:val="0"/>
+                <w:color w:val="222222"/>
+                <w:sz w:val="19"/>
+              </w:rPr>
+              <w:t>中转站地址</w:t>
+            </w:r>
+          </w:p>
+        </w:tc>
+      </w:tr>
+      <w:tr>
+        <w:tc>
+          <w:tcPr>
+            <w:tcW w:type="dxa" w:w="3173"/>
+          </w:tcPr>
+          <w:p>
+            <w:pPr>
+              <w:spacing w:after="0"/>
+            </w:pPr>
+            <w:r>
+              <w:rPr>
+                <w:rFonts w:ascii="Consolas" w:hAnsi="Consolas" w:eastAsia="微软雅黑"/>
+                <w:b w:val="0"/>
+                <w:color w:val="2D5C4A"/>
+                <w:sz w:val="17"/>
+              </w:rPr>
+              <w:t>IMAGE_API_KEY</w:t>
+            </w:r>
+          </w:p>
+        </w:tc>
+        <w:tc>
+          <w:tcPr>
+            <w:tcW w:type="dxa" w:w="3173"/>
+          </w:tcPr>
+          <w:p>
+            <w:pPr>
+              <w:spacing w:after="0"/>
+            </w:pPr>
+            <w:r>
+              <w:rPr>
+                <w:rFonts w:ascii="Microsoft YaHei" w:hAnsi="Microsoft YaHei" w:eastAsia="微软雅黑"/>
+                <w:b w:val="0"/>
+                <w:color w:val="222222"/>
+                <w:sz w:val="19"/>
+              </w:rPr>
+              <w:t>空</w:t>
+            </w:r>
+          </w:p>
+        </w:tc>
+        <w:tc>
+          <w:tcPr>
+            <w:tcW w:type="dxa" w:w="3173"/>
+          </w:tcPr>
+          <w:p>
+            <w:pPr>
+              <w:spacing w:after="0"/>
+            </w:pPr>
+            <w:r>
+              <w:rPr>
+                <w:rFonts w:ascii="Microsoft YaHei" w:hAnsi="Microsoft YaHei" w:eastAsia="微软雅黑"/>
+                <w:b w:val="0"/>
+                <w:color w:val="222222"/>
+                <w:sz w:val="19"/>
+              </w:rPr>
+              <w:t>配图密钥</w:t>
+            </w:r>
+          </w:p>
+        </w:tc>
+      </w:tr>
+      <w:tr>
+        <w:tc>
+          <w:tcPr>
+            <w:tcW w:type="dxa" w:w="3173"/>
+          </w:tcPr>
+          <w:p>
+            <w:pPr>
+              <w:spacing w:after="0"/>
+            </w:pPr>
+            <w:r>
+              <w:rPr>
+                <w:rFonts w:ascii="Consolas" w:hAnsi="Consolas" w:eastAsia="微软雅黑"/>
+                <w:b w:val="0"/>
+                <w:color w:val="2D5C4A"/>
+                <w:sz w:val="17"/>
+              </w:rPr>
+              <w:t>IMAGE_MODEL</w:t>
+            </w:r>
+          </w:p>
+        </w:tc>
+        <w:tc>
+          <w:tcPr>
+            <w:tcW w:type="dxa" w:w="3173"/>
+          </w:tcPr>
+          <w:p>
+            <w:pPr>
+              <w:spacing w:after="0"/>
+            </w:pPr>
+            <w:r>
+              <w:rPr>
+                <w:rFonts w:ascii="Consolas" w:hAnsi="Consolas" w:eastAsia="微软雅黑"/>
+                <w:b w:val="0"/>
+                <w:color w:val="2D5C4A"/>
+                <w:sz w:val="17"/>
+              </w:rPr>
+              <w:t>gpt-image-1</w:t>
+            </w:r>
+          </w:p>
+        </w:tc>
+        <w:tc>
+          <w:tcPr>
+            <w:tcW w:type="dxa" w:w="3173"/>
+          </w:tcPr>
+          <w:p>
+            <w:pPr>
+              <w:spacing w:after="0"/>
+            </w:pPr>
+            <w:r>
+              <w:rPr>
+                <w:rFonts w:ascii="Microsoft YaHei" w:hAnsi="Microsoft YaHei" w:eastAsia="微软雅黑"/>
+                <w:b w:val="0"/>
+                <w:color w:val="222222"/>
+                <w:sz w:val="19"/>
+              </w:rPr>
+              <w:t>图像模型 id</w:t>
+            </w:r>
+          </w:p>
+        </w:tc>
+      </w:tr>
+      <w:tr>
+        <w:tc>
+          <w:tcPr>
+            <w:tcW w:type="dxa" w:w="3173"/>
+          </w:tcPr>
+          <w:p>
+            <w:pPr>
+              <w:spacing w:after="0"/>
+            </w:pPr>
+            <w:r>
+              <w:rPr>
+                <w:rFonts w:ascii="Consolas" w:hAnsi="Consolas" w:eastAsia="微软雅黑"/>
+                <w:b w:val="0"/>
+                <w:color w:val="2D5C4A"/>
+                <w:sz w:val="17"/>
+              </w:rPr>
+              <w:t>IMAGE_SIZE</w:t>
+            </w:r>
+          </w:p>
+        </w:tc>
+        <w:tc>
+          <w:tcPr>
+            <w:tcW w:type="dxa" w:w="3173"/>
+          </w:tcPr>
+          <w:p>
+            <w:pPr>
+              <w:spacing w:after="0"/>
+            </w:pPr>
+            <w:r>
+              <w:rPr>
+                <w:rFonts w:ascii="Consolas" w:hAnsi="Consolas" w:eastAsia="微软雅黑"/>
+                <w:b w:val="0"/>
+                <w:color w:val="2D5C4A"/>
+                <w:sz w:val="17"/>
+              </w:rPr>
+              <w:t>1024x1536</w:t>
+            </w:r>
+          </w:p>
+        </w:tc>
+        <w:tc>
+          <w:tcPr>
+            <w:tcW w:type="dxa" w:w="3173"/>
+          </w:tcPr>
+          <w:p>
+            <w:pPr>
+              <w:spacing w:after="0"/>
+            </w:pPr>
+            <w:r>
+              <w:rPr>
+                <w:rFonts w:ascii="Microsoft YaHei" w:hAnsi="Microsoft YaHei" w:eastAsia="微软雅黑"/>
+                <w:b w:val="0"/>
+                <w:color w:val="222222"/>
+                <w:sz w:val="19"/>
+              </w:rPr>
+              <w:t>输出尺寸</w:t>
             </w:r>
           </w:p>
         </w:tc>
@@ -6570,10 +8298,10 @@
             </w:pPr>
             <w:r>
               <w:rPr>
-                <w:rFonts w:ascii="Microsoft YaHei" w:hAnsi="Microsoft YaHei" w:eastAsia="微软雅黑"/>
+                <w:rFonts w:ascii="Consolas" w:hAnsi="Consolas" w:eastAsia="微软雅黑"/>
                 <w:b w:val="0"/>
-                <w:color w:val="222222"/>
-                <w:sz w:val="19"/>
+                <w:color w:val="2D5C4A"/>
+                <w:sz w:val="17"/>
               </w:rPr>
               <w:t>media</w:t>
             </w:r>
@@ -7114,11 +8842,20 @@
             <w:r>
               <w:rPr>
                 <w:rFonts w:ascii="Microsoft YaHei" w:hAnsi="Microsoft YaHei" w:eastAsia="微软雅黑"/>
+                <w:b/>
+                <w:color w:val="222222"/>
+                <w:sz w:val="19"/>
+              </w:rPr>
+              <w:t>第一部分</w:t>
+            </w:r>
+            <w:r>
+              <w:rPr>
+                <w:rFonts w:ascii="Microsoft YaHei" w:hAnsi="Microsoft YaHei" w:eastAsia="微软雅黑"/>
                 <w:b w:val="0"/>
                 <w:color w:val="222222"/>
                 <w:sz w:val="19"/>
               </w:rPr>
-              <w:t>第一部分：市场适配分析</w:t>
+              <w:t>：市场适配分析</w:t>
             </w:r>
           </w:p>
         </w:tc>
@@ -7173,11 +8910,88 @@
             <w:r>
               <w:rPr>
                 <w:rFonts w:ascii="Microsoft YaHei" w:hAnsi="Microsoft YaHei" w:eastAsia="微软雅黑"/>
+                <w:b/>
+                <w:color w:val="222222"/>
+                <w:sz w:val="19"/>
+              </w:rPr>
+              <w:t>第二部分</w:t>
+            </w:r>
+            <w:r>
+              <w:rPr>
+                <w:rFonts w:ascii="Microsoft YaHei" w:hAnsi="Microsoft YaHei" w:eastAsia="微软雅黑"/>
                 <w:b w:val="0"/>
                 <w:color w:val="222222"/>
                 <w:sz w:val="19"/>
               </w:rPr>
-              <w:t>第二部分：六件套内容方案</w:t>
+              <w:t>：六件套内容方案</w:t>
+            </w:r>
+          </w:p>
+        </w:tc>
+      </w:tr>
+      <w:tr>
+        <w:tc>
+          <w:tcPr>
+            <w:tcW w:type="dxa" w:w="3173"/>
+          </w:tcPr>
+          <w:p>
+            <w:pPr>
+              <w:spacing w:after="0"/>
+            </w:pPr>
+            <w:r>
+              <w:rPr>
+                <w:rFonts w:ascii="Microsoft YaHei" w:hAnsi="Microsoft YaHei" w:eastAsia="微软雅黑"/>
+                <w:b w:val="0"/>
+                <w:color w:val="222222"/>
+                <w:sz w:val="19"/>
+              </w:rPr>
+              <w:t>POST</w:t>
+            </w:r>
+          </w:p>
+        </w:tc>
+        <w:tc>
+          <w:tcPr>
+            <w:tcW w:type="dxa" w:w="3173"/>
+          </w:tcPr>
+          <w:p>
+            <w:pPr>
+              <w:spacing w:after="0"/>
+            </w:pPr>
+            <w:r>
+              <w:rPr>
+                <w:rFonts w:ascii="Consolas" w:hAnsi="Consolas" w:eastAsia="微软雅黑"/>
+                <w:b w:val="0"/>
+                <w:color w:val="2D5C4A"/>
+                <w:sz w:val="17"/>
+              </w:rPr>
+              <w:t>/image</w:t>
+            </w:r>
+          </w:p>
+        </w:tc>
+        <w:tc>
+          <w:tcPr>
+            <w:tcW w:type="dxa" w:w="3173"/>
+          </w:tcPr>
+          <w:p>
+            <w:pPr>
+              <w:spacing w:after="0"/>
+            </w:pPr>
+            <w:r>
+              <w:rPr>
+                <w:rFonts w:ascii="Microsoft YaHei" w:hAnsi="Microsoft YaHei" w:eastAsia="微软雅黑"/>
+                <w:b/>
+                <w:color w:val="222222"/>
+                <w:sz w:val="19"/>
+              </w:rPr>
+              <w:t>第二部分下游</w:t>
+            </w:r>
+            <w:r>
+              <w:rPr>
+                <w:rFonts w:ascii="Microsoft YaHei" w:hAnsi="Microsoft YaHei" w:eastAsia="微软雅黑"/>
+                <w:b w:val="0"/>
+                <w:color w:val="222222"/>
+                <w:sz w:val="19"/>
+              </w:rPr>
+              <w:t>：把图片提示词变成一张图</w:t>
             </w:r>
           </w:p>
         </w:tc>
@@ -7232,11 +9046,20 @@
             <w:r>
               <w:rPr>
                 <w:rFonts w:ascii="Microsoft YaHei" w:hAnsi="Microsoft YaHei" w:eastAsia="微软雅黑"/>
+                <w:b/>
+                <w:color w:val="222222"/>
+                <w:sz w:val="19"/>
+              </w:rPr>
+              <w:t>第三部分</w:t>
+            </w:r>
+            <w:r>
+              <w:rPr>
+                <w:rFonts w:ascii="Microsoft YaHei" w:hAnsi="Microsoft YaHei" w:eastAsia="微软雅黑"/>
                 <w:b w:val="0"/>
                 <w:color w:val="222222"/>
                 <w:sz w:val="19"/>
               </w:rPr>
-              <w:t>第三部分：口播视频生成</w:t>
+              <w:t>：口播视频生成</w:t>
             </w:r>
           </w:p>
         </w:tc>
@@ -7317,16 +9140,21 @@
           <w:color w:val="222222"/>
           <w:sz w:val="21"/>
         </w:rPr>
-        <w:t>交互式文档：</w:t>
-      </w:r>
-      <w:r>
-        <w:rPr>
-          <w:rFonts w:ascii="Consolas" w:hAnsi="Consolas" w:eastAsia="微软雅黑"/>
+        <w:t>交互式文档：&lt;http://localhost:8000/docs&gt;</w:t>
+      </w:r>
+    </w:p>
+    <w:p>
+      <w:pPr>
+        <w:spacing w:after="120"/>
+      </w:pPr>
+      <w:r>
+        <w:rPr>
+          <w:rFonts w:ascii="Microsoft YaHei" w:hAnsi="Microsoft YaHei" w:eastAsia="微软雅黑"/>
           <w:b w:val="0"/>
-          <w:color w:val="2D5C4A"/>
-          <w:sz w:val="19"/>
-        </w:rPr>
-        <w:t>http://localhost:8000/docs</w:t>
+          <w:color w:val="222222"/>
+          <w:sz w:val="21"/>
+        </w:rPr>
+        <w:t>---</w:t>
       </w:r>
     </w:p>
     <w:p>
@@ -7383,6 +9211,15 @@
       </w:r>
       <w:r>
         <w:rPr>
+          <w:rFonts w:ascii="Microsoft YaHei" w:hAnsi="Microsoft YaHei" w:eastAsia="微软雅黑"/>
+          <w:b w:val="0"/>
+          <w:color w:val="222222"/>
+          <w:sz w:val="21"/>
+        </w:rPr>
+        <w:t xml:space="preserve"> </w:t>
+      </w:r>
+      <w:r>
+        <w:rPr>
           <w:rFonts w:ascii="Consolas" w:hAnsi="Consolas" w:eastAsia="微软雅黑"/>
           <w:b w:val="0"/>
           <w:color w:val="2D5C4A"/>
@@ -7397,7 +9234,21 @@
           <w:color w:val="222222"/>
           <w:sz w:val="21"/>
         </w:rPr>
-        <w:t xml:space="preserve"> 是提示词约束下的启发式排序依据，没有历史数据校准，不能当作销量、转化率或成功概率。</w:t>
+        <w:t xml:space="preserve"> 是提示词约束下的启发式排序依据，没有历史数据校准，</w:t>
+      </w:r>
+    </w:p>
+    <w:p>
+      <w:pPr>
+        <w:spacing w:after="120"/>
+      </w:pPr>
+      <w:r>
+        <w:rPr>
+          <w:rFonts w:ascii="Microsoft YaHei" w:hAnsi="Microsoft YaHei" w:eastAsia="微软雅黑"/>
+          <w:b w:val="0"/>
+          <w:color w:val="222222"/>
+          <w:sz w:val="21"/>
+        </w:rPr>
+        <w:t>不能当作销量、转化率或成功概率。</w:t>
       </w:r>
     </w:p>
     <w:p>
@@ -7412,7 +9263,7 @@
           <w:color w:val="222222"/>
           <w:sz w:val="21"/>
         </w:rPr>
-        <w:t xml:space="preserve">2.  </w:t>
+        <w:t xml:space="preserve">1.  </w:t>
       </w:r>
       <w:r>
         <w:rPr>
@@ -7430,7 +9281,21 @@
           <w:color w:val="222222"/>
           <w:sz w:val="21"/>
         </w:rPr>
-        <w:t>目录是人工整理的小样本，模型被明确禁止补全未知项，因此分析可能显得"保守"——这是设计选择，不是能力缺陷。</w:t>
+        <w:t xml:space="preserve"> 目录是人工整理的小样本，模型被明确禁止补全未知项，</w:t>
+      </w:r>
+    </w:p>
+    <w:p>
+      <w:pPr>
+        <w:spacing w:after="120"/>
+      </w:pPr>
+      <w:r>
+        <w:rPr>
+          <w:rFonts w:ascii="Microsoft YaHei" w:hAnsi="Microsoft YaHei" w:eastAsia="微软雅黑"/>
+          <w:b w:val="0"/>
+          <w:color w:val="222222"/>
+          <w:sz w:val="21"/>
+        </w:rPr>
+        <w:t>因此分析可能显得"保守"——这是设计选择，不是能力缺陷。</w:t>
       </w:r>
     </w:p>
     <w:p>
@@ -7445,7 +9310,7 @@
           <w:color w:val="222222"/>
           <w:sz w:val="21"/>
         </w:rPr>
-        <w:t xml:space="preserve">3.  </w:t>
+        <w:t xml:space="preserve">1.  </w:t>
       </w:r>
       <w:r>
         <w:rPr>
@@ -7463,7 +9328,39 @@
           <w:color w:val="222222"/>
           <w:sz w:val="21"/>
         </w:rPr>
-        <w:t>泰语、越南语的 Edge 声线可用，但唇形模型（videoretalk）语言无关，真正逐音素对齐的多语种唇形需要自采数据微调，本演示没有做。</w:t>
+        <w:t xml:space="preserve"> 泰语、越南语的 Edge 声线可用，</w:t>
+      </w:r>
+    </w:p>
+    <w:p>
+      <w:pPr>
+        <w:spacing w:after="120"/>
+      </w:pPr>
+      <w:r>
+        <w:rPr>
+          <w:rFonts w:ascii="Microsoft YaHei" w:hAnsi="Microsoft YaHei" w:eastAsia="微软雅黑"/>
+          <w:b w:val="0"/>
+          <w:color w:val="222222"/>
+          <w:sz w:val="21"/>
+        </w:rPr>
+        <w:t>但唇形模型（</w:t>
+      </w:r>
+      <w:r>
+        <w:rPr>
+          <w:rFonts w:ascii="Consolas" w:hAnsi="Consolas" w:eastAsia="微软雅黑"/>
+          <w:b w:val="0"/>
+          <w:color w:val="2D5C4A"/>
+          <w:sz w:val="19"/>
+        </w:rPr>
+        <w:t>videoretalk</w:t>
+      </w:r>
+      <w:r>
+        <w:rPr>
+          <w:rFonts w:ascii="Microsoft YaHei" w:hAnsi="Microsoft YaHei" w:eastAsia="微软雅黑"/>
+          <w:b w:val="0"/>
+          <w:color w:val="222222"/>
+          <w:sz w:val="21"/>
+        </w:rPr>
+        <w:t>）语言无关，真正逐音素对齐的多语种唇形需要自采数据微调， 本演示没有做。</w:t>
       </w:r>
     </w:p>
     <w:p>
@@ -7478,7 +9375,7 @@
           <w:color w:val="222222"/>
           <w:sz w:val="21"/>
         </w:rPr>
-        <w:t xml:space="preserve">4.  </w:t>
+        <w:t xml:space="preserve">1.  </w:t>
       </w:r>
       <w:r>
         <w:rPr>
@@ -7496,7 +9393,21 @@
           <w:color w:val="222222"/>
           <w:sz w:val="21"/>
         </w:rPr>
-        <w:t>口型由响度驱动，属于"张嘴/闭嘴"级别，不是音素级对口型。</w:t>
+        <w:t xml:space="preserve"> 口型由响度驱动，属于"张嘴/闭嘴"级别，</w:t>
+      </w:r>
+    </w:p>
+    <w:p>
+      <w:pPr>
+        <w:spacing w:after="120"/>
+      </w:pPr>
+      <w:r>
+        <w:rPr>
+          <w:rFonts w:ascii="Microsoft YaHei" w:hAnsi="Microsoft YaHei" w:eastAsia="微软雅黑"/>
+          <w:b w:val="0"/>
+          <w:color w:val="222222"/>
+          <w:sz w:val="21"/>
+        </w:rPr>
+        <w:t>不是音素级对口型。</w:t>
       </w:r>
     </w:p>
     <w:p>
@@ -7511,7 +9422,7 @@
           <w:color w:val="222222"/>
           <w:sz w:val="21"/>
         </w:rPr>
-        <w:t xml:space="preserve">5.  </w:t>
+        <w:t xml:space="preserve">1.  </w:t>
       </w:r>
       <w:r>
         <w:rPr>
@@ -7520,7 +9431,7 @@
           <w:color w:val="222222"/>
           <w:sz w:val="21"/>
         </w:rPr>
-        <w:t>AI 生成内容标识。</w:t>
+        <w:t>配图的默认实现是版式底图，不是商品照。</w:t>
       </w:r>
       <w:r>
         <w:rPr>
@@ -7529,7 +9440,104 @@
           <w:color w:val="222222"/>
           <w:sz w:val="21"/>
         </w:rPr>
-        <w:t>中国大陆自 2025-09-01 起施行《人工智能生成合成内容标识办法》，对外投放需要显式标识；本演示未在画面内加水印，正式投放前必须补上。</w:t>
+        <w:t xml:space="preserve"> </w:t>
+      </w:r>
+      <w:r>
+        <w:rPr>
+          <w:rFonts w:ascii="Consolas" w:hAnsi="Consolas" w:eastAsia="微软雅黑"/>
+          <w:b w:val="0"/>
+          <w:color w:val="2D5C4A"/>
+          <w:sz w:val="19"/>
+        </w:rPr>
+        <w:t>drawn</w:t>
+      </w:r>
+      <w:r>
+        <w:rPr>
+          <w:rFonts w:ascii="Microsoft YaHei" w:hAnsi="Microsoft YaHei" w:eastAsia="微软雅黑"/>
+          <w:b w:val="0"/>
+          <w:color w:val="222222"/>
+          <w:sz w:val="21"/>
+        </w:rPr>
+        <w:t xml:space="preserve"> 只排一张站内风格的底图；</w:t>
+      </w:r>
+    </w:p>
+    <w:p>
+      <w:pPr>
+        <w:spacing w:after="120"/>
+      </w:pPr>
+      <w:r>
+        <w:rPr>
+          <w:rFonts w:ascii="Microsoft YaHei" w:hAnsi="Microsoft YaHei" w:eastAsia="微软雅黑"/>
+          <w:b w:val="0"/>
+          <w:color w:val="222222"/>
+          <w:sz w:val="21"/>
+        </w:rPr>
+        <w:t xml:space="preserve">真实照片需要 </w:t>
+      </w:r>
+      <w:r>
+        <w:rPr>
+          <w:rFonts w:ascii="Consolas" w:hAnsi="Consolas" w:eastAsia="微软雅黑"/>
+          <w:b w:val="0"/>
+          <w:color w:val="2D5C4A"/>
+          <w:sz w:val="19"/>
+        </w:rPr>
+        <w:t>openai</w:t>
+      </w:r>
+      <w:r>
+        <w:rPr>
+          <w:rFonts w:ascii="Microsoft YaHei" w:hAnsi="Microsoft YaHei" w:eastAsia="微软雅黑"/>
+          <w:b w:val="0"/>
+          <w:color w:val="222222"/>
+          <w:sz w:val="21"/>
+        </w:rPr>
+        <w:t xml:space="preserve"> 供应商。即便如此，图像模型也不知道某款茶的实际包装， 生成的图适合做场景与氛围，不适合当商品主图。</w:t>
+      </w:r>
+    </w:p>
+    <w:p>
+      <w:pPr>
+        <w:spacing w:after="40"/>
+        <w:ind w:hanging="312" w:left="482"/>
+      </w:pPr>
+      <w:r>
+        <w:rPr>
+          <w:rFonts w:ascii="Microsoft YaHei" w:hAnsi="Microsoft YaHei" w:eastAsia="微软雅黑"/>
+          <w:b w:val="0"/>
+          <w:color w:val="222222"/>
+          <w:sz w:val="21"/>
+        </w:rPr>
+        <w:t xml:space="preserve">1.  </w:t>
+      </w:r>
+      <w:r>
+        <w:rPr>
+          <w:rFonts w:ascii="Microsoft YaHei" w:hAnsi="Microsoft YaHei" w:eastAsia="微软雅黑"/>
+          <w:b/>
+          <w:color w:val="222222"/>
+          <w:sz w:val="21"/>
+        </w:rPr>
+        <w:t>AI 生成内容标识。</w:t>
+      </w:r>
+      <w:r>
+        <w:rPr>
+          <w:rFonts w:ascii="Microsoft YaHei" w:hAnsi="Microsoft YaHei" w:eastAsia="微软雅黑"/>
+          <w:b w:val="0"/>
+          <w:color w:val="222222"/>
+          <w:sz w:val="21"/>
+        </w:rPr>
+        <w:t xml:space="preserve"> 中国大陆自 2025-09-01 起施行《人工智能生成合成内容标识办法》，</w:t>
+      </w:r>
+    </w:p>
+    <w:p>
+      <w:pPr>
+        <w:spacing w:after="120"/>
+      </w:pPr>
+      <w:r>
+        <w:rPr>
+          <w:rFonts w:ascii="Microsoft YaHei" w:hAnsi="Microsoft YaHei" w:eastAsia="微软雅黑"/>
+          <w:b w:val="0"/>
+          <w:color w:val="222222"/>
+          <w:sz w:val="21"/>
+        </w:rPr>
+        <w:t>对外投放需要显式标识；本演示未在画面内加水印，正式投放前必须补上。</w:t>
       </w:r>
     </w:p>
     <w:sectPr>

</xml_diff>

<commit_message>
docs: refresh the test counts after the s2v provider
Co-Authored-By: Claude Opus 5 <noreply@anthropic.com>
</commit_message>
<xml_diff>
--- a/docs/AGENT_TECH_SPEC.docx
+++ b/docs/AGENT_TECH_SPEC.docx
@@ -6937,7 +6937,7 @@
                 <w:color w:val="222222"/>
                 <w:sz w:val="19"/>
               </w:rPr>
-              <w:t>598</w:t>
+              <w:t>610</w:t>
             </w:r>
           </w:p>
         </w:tc>
@@ -7232,7 +7232,7 @@
                 <w:color w:val="222222"/>
                 <w:sz w:val="19"/>
               </w:rPr>
-              <w:t>798</w:t>
+              <w:t>810</w:t>
             </w:r>
           </w:p>
         </w:tc>

</xml_diff>

<commit_message>
feat(images): add a Bailian provider so one key covers images and video
The relays a solo developer usually has are LLM-only — six configured ones on
this machine were probed and none served /v1/images/generations. Bailian is the
account the video providers already need, so wanx2.1-t2i-turbo turns that one
key into real photographs too: submit, poll, then copy the signed URL into
local media before it expires.

Co-Authored-By: Claude Opus 5 <noreply@anthropic.com>
</commit_message>
<xml_diff>
--- a/docs/AGENT_TECH_SPEC.docx
+++ b/docs/AGENT_TECH_SPEC.docx
@@ -4568,6 +4568,83 @@
                 <w:sz w:val="19"/>
               </w:rPr>
               <w:t>一个 key</w:t>
+            </w:r>
+          </w:p>
+        </w:tc>
+      </w:tr>
+      <w:tr>
+        <w:tc>
+          <w:tcPr>
+            <w:tcW w:type="dxa" w:w="3173"/>
+          </w:tcPr>
+          <w:p>
+            <w:pPr>
+              <w:spacing w:after="0"/>
+            </w:pPr>
+            <w:r>
+              <w:rPr>
+                <w:rFonts w:ascii="Consolas" w:hAnsi="Consolas" w:eastAsia="微软雅黑"/>
+                <w:b w:val="0"/>
+                <w:color w:val="2D5C4A"/>
+                <w:sz w:val="17"/>
+              </w:rPr>
+              <w:t>dashscope</w:t>
+            </w:r>
+          </w:p>
+        </w:tc>
+        <w:tc>
+          <w:tcPr>
+            <w:tcW w:type="dxa" w:w="3173"/>
+          </w:tcPr>
+          <w:p>
+            <w:pPr>
+              <w:spacing w:after="0"/>
+            </w:pPr>
+            <w:r>
+              <w:rPr>
+                <w:rFonts w:ascii="Microsoft YaHei" w:hAnsi="Microsoft YaHei" w:eastAsia="微软雅黑"/>
+                <w:b w:val="0"/>
+                <w:color w:val="222222"/>
+                <w:sz w:val="19"/>
+              </w:rPr>
+              <w:t xml:space="preserve">走阿里云百炼 </w:t>
+            </w:r>
+            <w:r>
+              <w:rPr>
+                <w:rFonts w:ascii="Consolas" w:hAnsi="Consolas" w:eastAsia="微软雅黑"/>
+                <w:b w:val="0"/>
+                <w:color w:val="2D5C4A"/>
+                <w:sz w:val="17"/>
+              </w:rPr>
+              <w:t>wanx2.1-t2i-turbo</w:t>
+            </w:r>
+            <w:r>
+              <w:rPr>
+                <w:rFonts w:ascii="Microsoft YaHei" w:hAnsi="Microsoft YaHei" w:eastAsia="微软雅黑"/>
+                <w:b w:val="0"/>
+                <w:color w:val="222222"/>
+                <w:sz w:val="19"/>
+              </w:rPr>
+              <w:t xml:space="preserve"> 的真实配图</w:t>
+            </w:r>
+          </w:p>
+        </w:tc>
+        <w:tc>
+          <w:tcPr>
+            <w:tcW w:type="dxa" w:w="3173"/>
+          </w:tcPr>
+          <w:p>
+            <w:pPr>
+              <w:spacing w:after="0"/>
+            </w:pPr>
+            <w:r>
+              <w:rPr>
+                <w:rFonts w:ascii="Microsoft YaHei" w:hAnsi="Microsoft YaHei" w:eastAsia="微软雅黑"/>
+                <w:b w:val="0"/>
+                <w:color w:val="222222"/>
+                <w:sz w:val="19"/>
+              </w:rPr>
+              <w:t>百炼 key（与视频供应商同一个）</w:t>
             </w:r>
           </w:p>
         </w:tc>
@@ -8660,6 +8737,124 @@
                 <w:sz w:val="19"/>
               </w:rPr>
               <w:t>输出尺寸</w:t>
+            </w:r>
+          </w:p>
+        </w:tc>
+      </w:tr>
+      <w:tr>
+        <w:tc>
+          <w:tcPr>
+            <w:tcW w:type="dxa" w:w="3173"/>
+          </w:tcPr>
+          <w:p>
+            <w:pPr>
+              <w:spacing w:after="0"/>
+            </w:pPr>
+            <w:r>
+              <w:rPr>
+                <w:rFonts w:ascii="Consolas" w:hAnsi="Consolas" w:eastAsia="微软雅黑"/>
+                <w:b w:val="0"/>
+                <w:color w:val="2D5C4A"/>
+                <w:sz w:val="17"/>
+              </w:rPr>
+              <w:t>DASHSCOPE_IMAGE_MODEL</w:t>
+            </w:r>
+          </w:p>
+        </w:tc>
+        <w:tc>
+          <w:tcPr>
+            <w:tcW w:type="dxa" w:w="3173"/>
+          </w:tcPr>
+          <w:p>
+            <w:pPr>
+              <w:spacing w:after="0"/>
+            </w:pPr>
+            <w:r>
+              <w:rPr>
+                <w:rFonts w:ascii="Consolas" w:hAnsi="Consolas" w:eastAsia="微软雅黑"/>
+                <w:b w:val="0"/>
+                <w:color w:val="2D5C4A"/>
+                <w:sz w:val="17"/>
+              </w:rPr>
+              <w:t>wanx2.1-t2i-turbo</w:t>
+            </w:r>
+          </w:p>
+        </w:tc>
+        <w:tc>
+          <w:tcPr>
+            <w:tcW w:type="dxa" w:w="3173"/>
+          </w:tcPr>
+          <w:p>
+            <w:pPr>
+              <w:spacing w:after="0"/>
+            </w:pPr>
+            <w:r>
+              <w:rPr>
+                <w:rFonts w:ascii="Microsoft YaHei" w:hAnsi="Microsoft YaHei" w:eastAsia="微软雅黑"/>
+                <w:b w:val="0"/>
+                <w:color w:val="222222"/>
+                <w:sz w:val="19"/>
+              </w:rPr>
+              <w:t>百炼图像模型</w:t>
+            </w:r>
+          </w:p>
+        </w:tc>
+      </w:tr>
+      <w:tr>
+        <w:tc>
+          <w:tcPr>
+            <w:tcW w:type="dxa" w:w="3173"/>
+          </w:tcPr>
+          <w:p>
+            <w:pPr>
+              <w:spacing w:after="0"/>
+            </w:pPr>
+            <w:r>
+              <w:rPr>
+                <w:rFonts w:ascii="Consolas" w:hAnsi="Consolas" w:eastAsia="微软雅黑"/>
+                <w:b w:val="0"/>
+                <w:color w:val="2D5C4A"/>
+                <w:sz w:val="17"/>
+              </w:rPr>
+              <w:t>DASHSCOPE_IMAGE_SIZE</w:t>
+            </w:r>
+          </w:p>
+        </w:tc>
+        <w:tc>
+          <w:tcPr>
+            <w:tcW w:type="dxa" w:w="3173"/>
+          </w:tcPr>
+          <w:p>
+            <w:pPr>
+              <w:spacing w:after="0"/>
+            </w:pPr>
+            <w:r>
+              <w:rPr>
+                <w:rFonts w:ascii="Consolas" w:hAnsi="Consolas" w:eastAsia="微软雅黑"/>
+                <w:b w:val="0"/>
+                <w:color w:val="2D5C4A"/>
+                <w:sz w:val="17"/>
+              </w:rPr>
+              <w:t>720*1280</w:t>
+            </w:r>
+          </w:p>
+        </w:tc>
+        <w:tc>
+          <w:tcPr>
+            <w:tcW w:type="dxa" w:w="3173"/>
+          </w:tcPr>
+          <w:p>
+            <w:pPr>
+              <w:spacing w:after="0"/>
+            </w:pPr>
+            <w:r>
+              <w:rPr>
+                <w:rFonts w:ascii="Microsoft YaHei" w:hAnsi="Microsoft YaHei" w:eastAsia="微软雅黑"/>
+                <w:b w:val="0"/>
+                <w:color w:val="222222"/>
+                <w:sz w:val="19"/>
+              </w:rPr>
+              <w:t>百炼输出尺寸</w:t>
             </w:r>
           </w:p>
         </w:tc>

</xml_diff>

<commit_message>
feat(video): turn a still into a short clip with wan2.2-i2v
One more capability behind the same port-and-adapter shape: POST /video takes a
prompt (or a public image_url) and renders a few seconds of motion.

The model fetches its input by URL, and a local file cannot be used — DashScope's
upload endpoint issues private objects the video service is not authorised to
read, which the probe confirmed with an explicit 403. So when only a prompt is
given the adapter draws the still first through Bailian's image endpoint, which
returns a signed URL, and feeds that into the render. Prompt to picture to clip,
all inside one account.

Co-Authored-By: Claude Opus 5 <noreply@anthropic.com>
</commit_message>
<xml_diff>
--- a/docs/AGENT_TECH_SPEC.docx
+++ b/docs/AGENT_TECH_SPEC.docx
@@ -6436,7 +6436,95 @@
           <w:color w:val="222222"/>
           <w:sz w:val="24"/>
         </w:rPr>
-        <w:t>4.6 失败语义</w:t>
+        <w:t>4.6 图生视频：一张图变成几秒动态</w:t>
+      </w:r>
+    </w:p>
+    <w:p>
+      <w:pPr>
+        <w:spacing w:after="120"/>
+      </w:pPr>
+      <w:r>
+        <w:rPr>
+          <w:rFonts w:ascii="Consolas" w:hAnsi="Consolas" w:eastAsia="微软雅黑"/>
+          <w:b w:val="0"/>
+          <w:color w:val="2D5C4A"/>
+          <w:sz w:val="19"/>
+        </w:rPr>
+        <w:t>wan2.2-i2v-flash</w:t>
+      </w:r>
+      <w:r>
+        <w:rPr>
+          <w:rFonts w:ascii="Microsoft YaHei" w:hAnsi="Microsoft YaHei" w:eastAsia="微软雅黑"/>
+          <w:b w:val="0"/>
+          <w:color w:val="222222"/>
+          <w:sz w:val="21"/>
+        </w:rPr>
+        <w:t xml:space="preserve"> 吃「图片 URL + 提示词」，出 5 秒左右的短片，480P / 720P 可选。</w:t>
+      </w:r>
+    </w:p>
+    <w:p>
+      <w:pPr>
+        <w:spacing w:after="120"/>
+      </w:pPr>
+      <w:r>
+        <w:rPr>
+          <w:rFonts w:ascii="Microsoft YaHei" w:hAnsi="Microsoft YaHei" w:eastAsia="微软雅黑"/>
+          <w:b w:val="0"/>
+          <w:color w:val="222222"/>
+          <w:sz w:val="21"/>
+        </w:rPr>
+        <w:t>一个绕不开的约束：</w:t>
+      </w:r>
+      <w:r>
+        <w:rPr>
+          <w:rFonts w:ascii="Microsoft YaHei" w:hAnsi="Microsoft YaHei" w:eastAsia="微软雅黑"/>
+          <w:b/>
+          <w:color w:val="222222"/>
+          <w:sz w:val="21"/>
+        </w:rPr>
+        <w:t>模型是按 URL 去取图的</w:t>
+      </w:r>
+      <w:r>
+        <w:rPr>
+          <w:rFonts w:ascii="Microsoft YaHei" w:hAnsi="Microsoft YaHei" w:eastAsia="微软雅黑"/>
+          <w:b w:val="0"/>
+          <w:color w:val="222222"/>
+          <w:sz w:val="21"/>
+        </w:rPr>
+        <w:t xml:space="preserve">。本机文件不行——DashScope 的上传接口 签发的是私有对象，视频服务没有读取权限（实测直链返回 </w:t>
+      </w:r>
+      <w:r>
+        <w:rPr>
+          <w:rFonts w:ascii="Consolas" w:hAnsi="Consolas" w:eastAsia="微软雅黑"/>
+          <w:b w:val="0"/>
+          <w:color w:val="2D5C4A"/>
+          <w:sz w:val="19"/>
+        </w:rPr>
+        <w:t>Don't have authorization to access the media</w:t>
+      </w:r>
+      <w:r>
+        <w:rPr>
+          <w:rFonts w:ascii="Microsoft YaHei" w:hAnsi="Microsoft YaHei" w:eastAsia="微软雅黑"/>
+          <w:b w:val="0"/>
+          <w:color w:val="222222"/>
+          <w:sz w:val="21"/>
+        </w:rPr>
+        <w:t>）。所以只给了提示词时， 适配器会先用百炼的图像接口画一张（它返回的是签名 URL，不是字节），再拿这个 URL 去渲染。 这条链路是自洽的：提示词 → 图 → 视频，全部在同一个账号内完成。</w:t>
+      </w:r>
+    </w:p>
+    <w:p>
+      <w:pPr>
+        <w:pStyle w:val="Heading2"/>
+        <w:spacing w:before="240" w:after="80"/>
+      </w:pPr>
+      <w:r>
+        <w:rPr>
+          <w:rFonts w:ascii="Microsoft YaHei" w:hAnsi="Microsoft YaHei" w:eastAsia="微软雅黑"/>
+          <w:b/>
+          <w:color w:val="222222"/>
+          <w:sz w:val="24"/>
+        </w:rPr>
+        <w:t>4.7 失败语义</w:t>
       </w:r>
     </w:p>
     <w:tbl>

</xml_diff>

<commit_message>
feat(video): animate a local picture without publishing it
The video model takes images by URL, and DashScope's own upload endpoint is a
dead end here: it pins the object ACL to private by policy, so the render
service cannot read what it just accepted. Probing that path produced a 403 on
the signed URL and `DataInspection` on submit.

A base64 data URI clears it. `image_path` now reads a picture from the media
directory, inlines it, and submits that — the file never leaves the machine and
never gets a public link. Paths are resolved against the media root and refused
if they escape it.

Also drops the system proxy for DashScope clients: a local Clash-style proxy
made the submit fail with a connect error while the same call succeeded with
`trust_env=False`.

The key visual a visitor just generated is handed to the clip section, so the
clip animates that still instead of drawing a second one.

Co-Authored-By: Claude Opus 5 <noreply@anthropic.com>
</commit_message>
<xml_diff>
--- a/docs/AGENT_TECH_SPEC.docx
+++ b/docs/AGENT_TECH_SPEC.docx
@@ -6473,8 +6473,233 @@
           <w:color w:val="222222"/>
           <w:sz w:val="21"/>
         </w:rPr>
-        <w:t>一个绕不开的约束：</w:t>
-      </w:r>
+        <w:t>模型按 URL 取图，所以输入有三种形态，适配器统一处理：</w:t>
+      </w:r>
+    </w:p>
+    <w:tbl>
+      <w:tblPr>
+        <w:tblStyle w:val="TableGrid"/>
+        <w:tblW w:type="auto" w:w="0"/>
+        <w:jc w:val="center"/>
+        <w:tblLook w:firstColumn="1" w:firstRow="1" w:lastColumn="0" w:lastRow="0" w:noHBand="0" w:noVBand="1" w:val="04A0"/>
+      </w:tblPr>
+      <w:tblGrid>
+        <w:gridCol w:w="4759"/>
+        <w:gridCol w:w="4759"/>
+      </w:tblGrid>
+      <w:tr>
+        <w:tc>
+          <w:tcPr>
+            <w:tcW w:type="dxa" w:w="4759"/>
+            <w:shd w:val="clear" w:color="auto" w:fill="EEF2EA"/>
+          </w:tcPr>
+          <w:p>
+            <w:pPr>
+              <w:spacing w:after="0"/>
+            </w:pPr>
+            <w:r>
+              <w:rPr>
+                <w:rFonts w:ascii="Microsoft YaHei" w:hAnsi="Microsoft YaHei" w:eastAsia="微软雅黑"/>
+                <w:b/>
+                <w:color w:val="1C3A30"/>
+                <w:sz w:val="19"/>
+              </w:rPr>
+              <w:t>输入</w:t>
+            </w:r>
+          </w:p>
+        </w:tc>
+        <w:tc>
+          <w:tcPr>
+            <w:tcW w:type="dxa" w:w="4759"/>
+            <w:shd w:val="clear" w:color="auto" w:fill="EEF2EA"/>
+          </w:tcPr>
+          <w:p>
+            <w:pPr>
+              <w:spacing w:after="0"/>
+            </w:pPr>
+            <w:r>
+              <w:rPr>
+                <w:rFonts w:ascii="Microsoft YaHei" w:hAnsi="Microsoft YaHei" w:eastAsia="微软雅黑"/>
+                <w:b/>
+                <w:color w:val="1C3A30"/>
+                <w:sz w:val="19"/>
+              </w:rPr>
+              <w:t>处理方式</w:t>
+            </w:r>
+          </w:p>
+        </w:tc>
+      </w:tr>
+      <w:tr>
+        <w:tc>
+          <w:tcPr>
+            <w:tcW w:type="dxa" w:w="4759"/>
+          </w:tcPr>
+          <w:p>
+            <w:pPr>
+              <w:spacing w:after="0"/>
+            </w:pPr>
+            <w:r>
+              <w:rPr>
+                <w:rFonts w:ascii="Consolas" w:hAnsi="Consolas" w:eastAsia="微软雅黑"/>
+                <w:b w:val="0"/>
+                <w:color w:val="2D5C4A"/>
+                <w:sz w:val="17"/>
+              </w:rPr>
+              <w:t>image_url</w:t>
+            </w:r>
+            <w:r>
+              <w:rPr>
+                <w:rFonts w:ascii="Microsoft YaHei" w:hAnsi="Microsoft YaHei" w:eastAsia="微软雅黑"/>
+                <w:b w:val="0"/>
+                <w:color w:val="222222"/>
+                <w:sz w:val="19"/>
+              </w:rPr>
+              <w:t>（公网链接）</w:t>
+            </w:r>
+          </w:p>
+        </w:tc>
+        <w:tc>
+          <w:tcPr>
+            <w:tcW w:type="dxa" w:w="4759"/>
+          </w:tcPr>
+          <w:p>
+            <w:pPr>
+              <w:spacing w:after="0"/>
+            </w:pPr>
+            <w:r>
+              <w:rPr>
+                <w:rFonts w:ascii="Microsoft YaHei" w:hAnsi="Microsoft YaHei" w:eastAsia="微软雅黑"/>
+                <w:b w:val="0"/>
+                <w:color w:val="222222"/>
+                <w:sz w:val="19"/>
+              </w:rPr>
+              <w:t>原样提交</w:t>
+            </w:r>
+          </w:p>
+        </w:tc>
+      </w:tr>
+      <w:tr>
+        <w:tc>
+          <w:tcPr>
+            <w:tcW w:type="dxa" w:w="4759"/>
+          </w:tcPr>
+          <w:p>
+            <w:pPr>
+              <w:spacing w:after="0"/>
+            </w:pPr>
+            <w:r>
+              <w:rPr>
+                <w:rFonts w:ascii="Consolas" w:hAnsi="Consolas" w:eastAsia="微软雅黑"/>
+                <w:b w:val="0"/>
+                <w:color w:val="2D5C4A"/>
+                <w:sz w:val="17"/>
+              </w:rPr>
+              <w:t>image_path</w:t>
+            </w:r>
+            <w:r>
+              <w:rPr>
+                <w:rFonts w:ascii="Microsoft YaHei" w:hAnsi="Microsoft YaHei" w:eastAsia="微软雅黑"/>
+                <w:b w:val="0"/>
+                <w:color w:val="222222"/>
+                <w:sz w:val="19"/>
+              </w:rPr>
+              <w:t>（媒体目录内的文件）</w:t>
+            </w:r>
+          </w:p>
+        </w:tc>
+        <w:tc>
+          <w:tcPr>
+            <w:tcW w:type="dxa" w:w="4759"/>
+          </w:tcPr>
+          <w:p>
+            <w:pPr>
+              <w:spacing w:after="0"/>
+            </w:pPr>
+            <w:r>
+              <w:rPr>
+                <w:rFonts w:ascii="Microsoft YaHei" w:hAnsi="Microsoft YaHei" w:eastAsia="微软雅黑"/>
+                <w:b w:val="0"/>
+                <w:color w:val="222222"/>
+                <w:sz w:val="19"/>
+              </w:rPr>
+              <w:t>读出来转成 base64 data URI 内联提交</w:t>
+            </w:r>
+          </w:p>
+        </w:tc>
+      </w:tr>
+      <w:tr>
+        <w:tc>
+          <w:tcPr>
+            <w:tcW w:type="dxa" w:w="4759"/>
+          </w:tcPr>
+          <w:p>
+            <w:pPr>
+              <w:spacing w:after="0"/>
+            </w:pPr>
+            <w:r>
+              <w:rPr>
+                <w:rFonts w:ascii="Microsoft YaHei" w:hAnsi="Microsoft YaHei" w:eastAsia="微软雅黑"/>
+                <w:b w:val="0"/>
+                <w:color w:val="222222"/>
+                <w:sz w:val="19"/>
+              </w:rPr>
+              <w:t xml:space="preserve">只给 </w:t>
+            </w:r>
+            <w:r>
+              <w:rPr>
+                <w:rFonts w:ascii="Consolas" w:hAnsi="Consolas" w:eastAsia="微软雅黑"/>
+                <w:b w:val="0"/>
+                <w:color w:val="2D5C4A"/>
+                <w:sz w:val="17"/>
+              </w:rPr>
+              <w:t>prompt</w:t>
+            </w:r>
+          </w:p>
+        </w:tc>
+        <w:tc>
+          <w:tcPr>
+            <w:tcW w:type="dxa" w:w="4759"/>
+          </w:tcPr>
+          <w:p>
+            <w:pPr>
+              <w:spacing w:after="0"/>
+            </w:pPr>
+            <w:r>
+              <w:rPr>
+                <w:rFonts w:ascii="Microsoft YaHei" w:hAnsi="Microsoft YaHei" w:eastAsia="微软雅黑"/>
+                <w:b w:val="0"/>
+                <w:color w:val="222222"/>
+                <w:sz w:val="19"/>
+              </w:rPr>
+              <w:t>先用百炼图像接口画一张，拿签名 URL 去渲染</w:t>
+            </w:r>
+          </w:p>
+        </w:tc>
+      </w:tr>
+    </w:tbl>
+    <w:p>
+      <w:pPr>
+        <w:spacing w:after="40"/>
+      </w:pPr>
+    </w:p>
+    <w:p>
+      <w:pPr>
+        <w:spacing w:after="120"/>
+      </w:pPr>
+      <w:r>
+        <w:rPr>
+          <w:rFonts w:ascii="Microsoft YaHei" w:hAnsi="Microsoft YaHei" w:eastAsia="微软雅黑"/>
+          <w:b w:val="0"/>
+          <w:color w:val="222222"/>
+          <w:sz w:val="21"/>
+        </w:rPr>
+        <w:t>第三条是 demo 的默认路径：提示词 → 图 → 视频，全在同一账号内完成。</w:t>
+      </w:r>
+    </w:p>
+    <w:p>
+      <w:pPr>
+        <w:spacing w:after="120"/>
+      </w:pPr>
       <w:r>
         <w:rPr>
           <w:rFonts w:ascii="Microsoft YaHei" w:hAnsi="Microsoft YaHei" w:eastAsia="微软雅黑"/>
@@ -6482,7 +6707,7 @@
           <w:color w:val="222222"/>
           <w:sz w:val="21"/>
         </w:rPr>
-        <w:t>模型是按 URL 去取图的</w:t>
+        <w:t>为什么不用 DashScope 的上传接口。</w:t>
       </w:r>
       <w:r>
         <w:rPr>
@@ -6491,7 +6716,7 @@
           <w:color w:val="222222"/>
           <w:sz w:val="21"/>
         </w:rPr>
-        <w:t xml:space="preserve">。本机文件不行——DashScope 的上传接口 签发的是私有对象，视频服务没有读取权限（实测直链返回 </w:t>
+        <w:t xml:space="preserve"> 它签发的对象 ACL 固定为 </w:t>
       </w:r>
       <w:r>
         <w:rPr>
@@ -6500,7 +6725,7 @@
           <w:color w:val="2D5C4A"/>
           <w:sz w:val="19"/>
         </w:rPr>
-        <w:t>Don't have authorization to access the media</w:t>
+        <w:t>private</w:t>
       </w:r>
       <w:r>
         <w:rPr>
@@ -6509,7 +6734,93 @@
           <w:color w:val="222222"/>
           <w:sz w:val="21"/>
         </w:rPr>
-        <w:t>）。所以只给了提示词时， 适配器会先用百炼的图像接口画一张（它返回的是签名 URL，不是字节），再拿这个 URL 去渲染。 这条链路是自洽的：提示词 → 图 → 视频，全部在同一个账号内完成。</w:t>
+        <w:t xml:space="preserve">， 策略文档里写死了这条条件，改不了；视频服务随后读不到，直链返回 </w:t>
+      </w:r>
+      <w:r>
+        <w:rPr>
+          <w:rFonts w:ascii="Consolas" w:hAnsi="Consolas" w:eastAsia="微软雅黑"/>
+          <w:b w:val="0"/>
+          <w:color w:val="2D5C4A"/>
+          <w:sz w:val="19"/>
+        </w:rPr>
+        <w:t>Don't have authorization to access the media</w:t>
+      </w:r>
+      <w:r>
+        <w:rPr>
+          <w:rFonts w:ascii="Microsoft YaHei" w:hAnsi="Microsoft YaHei" w:eastAsia="微软雅黑"/>
+          <w:b w:val="0"/>
+          <w:color w:val="222222"/>
+          <w:sz w:val="21"/>
+        </w:rPr>
+        <w:t xml:space="preserve">，提交时报 </w:t>
+      </w:r>
+      <w:r>
+        <w:rPr>
+          <w:rFonts w:ascii="Consolas" w:hAnsi="Consolas" w:eastAsia="微软雅黑"/>
+          <w:b w:val="0"/>
+          <w:color w:val="2D5C4A"/>
+          <w:sz w:val="19"/>
+        </w:rPr>
+        <w:t>DataInspection</w:t>
+      </w:r>
+      <w:r>
+        <w:rPr>
+          <w:rFonts w:ascii="Microsoft YaHei" w:hAnsi="Microsoft YaHei" w:eastAsia="微软雅黑"/>
+          <w:b w:val="0"/>
+          <w:color w:val="222222"/>
+          <w:sz w:val="21"/>
+        </w:rPr>
+        <w:t>。 data URI 绕开了整件事——图片不落到任何第三方，也不产生公开链接。</w:t>
+      </w:r>
+    </w:p>
+    <w:p>
+      <w:pPr>
+        <w:spacing w:after="120"/>
+      </w:pPr>
+      <w:r>
+        <w:rPr>
+          <w:rFonts w:ascii="Microsoft YaHei" w:hAnsi="Microsoft YaHei" w:eastAsia="微软雅黑"/>
+          <w:b w:val="0"/>
+          <w:color w:val="222222"/>
+          <w:sz w:val="21"/>
+        </w:rPr>
+        <w:t xml:space="preserve">另外，所有 DashScope 客户端都设为 </w:t>
+      </w:r>
+      <w:r>
+        <w:rPr>
+          <w:rFonts w:ascii="Consolas" w:hAnsi="Consolas" w:eastAsia="微软雅黑"/>
+          <w:b w:val="0"/>
+          <w:color w:val="2D5C4A"/>
+          <w:sz w:val="19"/>
+        </w:rPr>
+        <w:t>trust_env=False</w:t>
+      </w:r>
+      <w:r>
+        <w:rPr>
+          <w:rFonts w:ascii="Microsoft YaHei" w:hAnsi="Microsoft YaHei" w:eastAsia="微软雅黑"/>
+          <w:b w:val="0"/>
+          <w:color w:val="222222"/>
+          <w:sz w:val="21"/>
+        </w:rPr>
+        <w:t xml:space="preserve">：国内端点走系统代理 （Clash 之类）经常直接失败，实测过一次 </w:t>
+      </w:r>
+      <w:r>
+        <w:rPr>
+          <w:rFonts w:ascii="Consolas" w:hAnsi="Consolas" w:eastAsia="微软雅黑"/>
+          <w:b w:val="0"/>
+          <w:color w:val="2D5C4A"/>
+          <w:sz w:val="19"/>
+        </w:rPr>
+        <w:t>ConnectError</w:t>
+      </w:r>
+      <w:r>
+        <w:rPr>
+          <w:rFonts w:ascii="Microsoft YaHei" w:hAnsi="Microsoft YaHei" w:eastAsia="微软雅黑"/>
+          <w:b w:val="0"/>
+          <w:color w:val="222222"/>
+          <w:sz w:val="21"/>
+        </w:rPr>
+        <w:t>。</w:t>
       </w:r>
     </w:p>
     <w:p>

</xml_diff>

<commit_message>
feat(digital-human): a real talking head from one photo
wan2.2-s2v now runs end to end with a local picture and no hosting. Two inputs,
two delivery routes, both discovered by probing:

The portrait is inlined as a base64 data URI — DashScope's upload endpoint pins
the object ACL to private, so the render service cannot read what it accepted.

The narration cannot be inlined: the model validates the file type from the URL
and rejects a data URI with "Allowed types are: .wav, .mp3". Qwen TTS writes the
audio to a signed URL, which is exactly the shape required, and sounds better
than the key-free voice on the way.

DashScope clients also stop honouring the system proxy — a local Clash-style
proxy made both status and submit fail while the same calls succeeded direct.

Co-Authored-By: Claude Opus 5 <noreply@anthropic.com>
</commit_message>
<xml_diff>
--- a/docs/AGENT_TECH_SPEC.docx
+++ b/docs/AGENT_TECH_SPEC.docx
@@ -6367,7 +6367,46 @@
           <w:color w:val="222222"/>
           <w:sz w:val="21"/>
         </w:rPr>
-        <w:t xml:space="preserve">两个输入都必须是阿里侧可访问的地址，所以配音和本地图片都先走 DashScope 自己的上传接口， 和 </w:t>
+        <w:t>两个输入的送达方式不一样，这是实测逼出来的：</w:t>
+      </w:r>
+    </w:p>
+    <w:p>
+      <w:pPr>
+        <w:pStyle w:val="ListBullet"/>
+        <w:spacing w:after="40"/>
+        <w:ind w:left="482"/>
+      </w:pPr>
+      <w:r>
+        <w:rPr>
+          <w:rFonts w:ascii="Microsoft YaHei" w:hAnsi="Microsoft YaHei" w:eastAsia="微软雅黑"/>
+          <w:b/>
+          <w:color w:val="222222"/>
+          <w:sz w:val="21"/>
+        </w:rPr>
+        <w:t>图片</w:t>
+      </w:r>
+      <w:r>
+        <w:rPr>
+          <w:rFonts w:ascii="Microsoft YaHei" w:hAnsi="Microsoft YaHei" w:eastAsia="微软雅黑"/>
+          <w:b w:val="0"/>
+          <w:color w:val="222222"/>
+          <w:sz w:val="21"/>
+        </w:rPr>
+        <w:t>：转成 base64 data URI 内联。DashScope 的上传接口签发私有对象，渲染服务读不到</w:t>
+      </w:r>
+    </w:p>
+    <w:p>
+      <w:pPr>
+        <w:spacing w:after="120"/>
+      </w:pPr>
+      <w:r>
+        <w:rPr>
+          <w:rFonts w:ascii="Microsoft YaHei" w:hAnsi="Microsoft YaHei" w:eastAsia="微软雅黑"/>
+          <w:b w:val="0"/>
+          <w:color w:val="222222"/>
+          <w:sz w:val="21"/>
+        </w:rPr>
+        <w:t xml:space="preserve">（直链 403、提交报 </w:t>
       </w:r>
       <w:r>
         <w:rPr>
@@ -6376,7 +6415,7 @@
           <w:color w:val="2D5C4A"/>
           <w:sz w:val="19"/>
         </w:rPr>
-        <w:t>videoretalk</w:t>
+        <w:t>DataInspection</w:t>
       </w:r>
       <w:r>
         <w:rPr>
@@ -6385,8 +6424,56 @@
           <w:color w:val="222222"/>
           <w:sz w:val="21"/>
         </w:rPr>
-        <w:t xml:space="preserve"> 复用同一个 </w:t>
-      </w:r>
+        <w:t>），data URI 绕开了整件事，图片也不落到任何第三方。</w:t>
+      </w:r>
+    </w:p>
+    <w:p>
+      <w:pPr>
+        <w:pStyle w:val="ListBullet"/>
+        <w:spacing w:after="40"/>
+        <w:ind w:left="482"/>
+      </w:pPr>
+      <w:r>
+        <w:rPr>
+          <w:rFonts w:ascii="Microsoft YaHei" w:hAnsi="Microsoft YaHei" w:eastAsia="微软雅黑"/>
+          <w:b/>
+          <w:color w:val="222222"/>
+          <w:sz w:val="21"/>
+        </w:rPr>
+        <w:t>音频</w:t>
+      </w:r>
+      <w:r>
+        <w:rPr>
+          <w:rFonts w:ascii="Microsoft YaHei" w:hAnsi="Microsoft YaHei" w:eastAsia="微软雅黑"/>
+          <w:b w:val="0"/>
+          <w:color w:val="222222"/>
+          <w:sz w:val="21"/>
+        </w:rPr>
+        <w:t xml:space="preserve">：data URI </w:t>
+      </w:r>
+      <w:r>
+        <w:rPr>
+          <w:rFonts w:ascii="Microsoft YaHei" w:hAnsi="Microsoft YaHei" w:eastAsia="微软雅黑"/>
+          <w:b/>
+          <w:color w:val="222222"/>
+          <w:sz w:val="21"/>
+        </w:rPr>
+        <w:t>不行</w:t>
+      </w:r>
+      <w:r>
+        <w:rPr>
+          <w:rFonts w:ascii="Microsoft YaHei" w:hAnsi="Microsoft YaHei" w:eastAsia="微软雅黑"/>
+          <w:b w:val="0"/>
+          <w:color w:val="222222"/>
+          <w:sz w:val="21"/>
+        </w:rPr>
+        <w:t>——模型按文件类型校验，报</w:t>
+      </w:r>
+    </w:p>
+    <w:p>
+      <w:pPr>
+        <w:spacing w:after="120"/>
+      </w:pPr>
       <w:r>
         <w:rPr>
           <w:rFonts w:ascii="Consolas" w:hAnsi="Consolas" w:eastAsia="微软雅黑"/>
@@ -6394,7 +6481,7 @@
           <w:color w:val="2D5C4A"/>
           <w:sz w:val="19"/>
         </w:rPr>
-        <w:t>uploads.py</w:t>
+        <w:t>File type is not supported. Allowed types are: .wav, .mp3</w:t>
       </w:r>
       <w:r>
         <w:rPr>
@@ -6403,7 +6490,39 @@
           <w:color w:val="222222"/>
           <w:sz w:val="21"/>
         </w:rPr>
-        <w:t>。音频超过 20 秒时</w:t>
+        <w:t xml:space="preserve">，因为它要靠 URL 后缀判断格式。 改由 </w:t>
+      </w:r>
+      <w:r>
+        <w:rPr>
+          <w:rFonts w:ascii="Microsoft YaHei" w:hAnsi="Microsoft YaHei" w:eastAsia="微软雅黑"/>
+          <w:b/>
+          <w:color w:val="222222"/>
+          <w:sz w:val="21"/>
+        </w:rPr>
+        <w:t>Qwen TTS</w:t>
+      </w:r>
+      <w:r>
+        <w:rPr>
+          <w:rFonts w:ascii="Microsoft YaHei" w:hAnsi="Microsoft YaHei" w:eastAsia="微软雅黑"/>
+          <w:b w:val="0"/>
+          <w:color w:val="222222"/>
+          <w:sz w:val="21"/>
+        </w:rPr>
+        <w:t xml:space="preserve"> 合成，它直接把音频写到签名 URL 上，正好是模型要的形状。</w:t>
+      </w:r>
+    </w:p>
+    <w:p>
+      <w:pPr>
+        <w:spacing w:after="120"/>
+      </w:pPr>
+      <w:r>
+        <w:rPr>
+          <w:rFonts w:ascii="Microsoft YaHei" w:hAnsi="Microsoft YaHei" w:eastAsia="微软雅黑"/>
+          <w:b w:val="0"/>
+          <w:color w:val="222222"/>
+          <w:sz w:val="21"/>
+        </w:rPr>
+        <w:t>音频超过 20 秒时</w:t>
       </w:r>
       <w:r>
         <w:rPr>

</xml_diff>